<commit_message>
Add section B API Endpoint Plan
</commit_message>
<xml_diff>
--- a/POE part 1 ST10568899 sesi mongatane.docx
+++ b/POE part 1 ST10568899 sesi mongatane.docx
@@ -77,7 +77,7 @@
         <mc:AlternateContent>
           <mc:Choice Requires="wps">
             <w:drawing>
-              <wp:anchor distT="0" distB="0" distL="114300" distR="114300" simplePos="0" relativeHeight="251659264" behindDoc="0" locked="0" layoutInCell="1" allowOverlap="1" wp14:anchorId="0E332C9C" wp14:editId="2111845D">
+              <wp:anchor distT="0" distB="0" distL="114300" distR="114300" simplePos="0" relativeHeight="251658240" behindDoc="0" locked="0" layoutInCell="1" allowOverlap="1" wp14:anchorId="0E332C9C" wp14:editId="2111845D">
                 <wp:simplePos x="0" y="0"/>
                 <wp:positionH relativeFrom="column">
                   <wp:posOffset>1270000</wp:posOffset>
@@ -137,7 +137,7 @@
           </mc:Choice>
           <mc:Fallback>
             <w:pict>
-              <v:rect w14:anchorId="527C9FEC" id="Rectangle 1" o:spid="_x0000_s1026" style="position:absolute;margin-left:100pt;margin-top:.6pt;width:159.5pt;height:151pt;z-index:251659264;visibility:visible;mso-wrap-style:square;mso-height-percent:0;mso-wrap-distance-left:9pt;mso-wrap-distance-top:0;mso-wrap-distance-right:9pt;mso-wrap-distance-bottom:0;mso-position-horizontal:absolute;mso-position-horizontal-relative:text;mso-position-vertical:absolute;mso-position-vertical-relative:text;mso-height-percent:0;mso-height-relative:margin;v-text-anchor:middle" o:gfxdata="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" filled="f" strokecolor="#030e13 [484]" strokeweight="1.5pt"/>
+              <v:rect w14:anchorId="4604877E" id="Rectangle 1" o:spid="_x0000_s1026" style="position:absolute;margin-left:100pt;margin-top:.6pt;width:159.5pt;height:151pt;z-index:251659264;visibility:visible;mso-wrap-style:square;mso-height-percent:0;mso-wrap-distance-left:9pt;mso-wrap-distance-top:0;mso-wrap-distance-right:9pt;mso-wrap-distance-bottom:0;mso-position-horizontal:absolute;mso-position-horizontal-relative:text;mso-position-vertical:absolute;mso-position-vertical-relative:text;mso-height-percent:0;mso-height-relative:margin;v-text-anchor:middle" o:gfxdata="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" filled="f" strokecolor="#030e13 [484]" strokeweight="1.5pt"/>
             </w:pict>
           </mc:Fallback>
         </mc:AlternateContent>
@@ -149,7 +149,7 @@
         <mc:AlternateContent>
           <mc:Choice Requires="wps">
             <w:drawing>
-              <wp:anchor distT="0" distB="0" distL="114300" distR="114300" simplePos="0" relativeHeight="251660288" behindDoc="0" locked="0" layoutInCell="1" allowOverlap="1" wp14:anchorId="63A31F9D" wp14:editId="3DBD3251">
+              <wp:anchor distT="0" distB="0" distL="114300" distR="114300" simplePos="0" relativeHeight="251658241" behindDoc="0" locked="0" layoutInCell="1" allowOverlap="1" wp14:anchorId="63A31F9D" wp14:editId="3DBD3251">
                 <wp:simplePos x="0" y="0"/>
                 <wp:positionH relativeFrom="column">
                   <wp:posOffset>1282700</wp:posOffset>
@@ -203,7 +203,7 @@
           </mc:Choice>
           <mc:Fallback>
             <w:pict>
-              <v:line w14:anchorId="6F0FA649" id="Straight Connector 3" o:spid="_x0000_s1026" style="position:absolute;z-index:251660288;visibility:visible;mso-wrap-style:square;mso-wrap-distance-left:9pt;mso-wrap-distance-top:0;mso-wrap-distance-right:9pt;mso-wrap-distance-bottom:0;mso-position-horizontal:absolute;mso-position-horizontal-relative:text;mso-position-vertical:absolute;mso-position-vertical-relative:text" from="101pt,14.6pt" to="259pt,15.6pt" o:gfxdata="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" strokecolor="black [3213]" strokeweight="1.5pt">
+              <v:line w14:anchorId="6CCF4FFF" id="Straight Connector 3" o:spid="_x0000_s1026" style="position:absolute;z-index:251660288;visibility:visible;mso-wrap-style:square;mso-wrap-distance-left:9pt;mso-wrap-distance-top:0;mso-wrap-distance-right:9pt;mso-wrap-distance-bottom:0;mso-position-horizontal:absolute;mso-position-horizontal-relative:text;mso-position-vertical:absolute;mso-position-vertical-relative:text" from="101pt,14.6pt" to="259pt,15.6pt" o:gfxdata="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" strokecolor="black [3213]" strokeweight="1.5pt">
                 <v:stroke joinstyle="miter"/>
               </v:line>
             </w:pict>
@@ -292,7 +292,7 @@
         <mc:AlternateContent>
           <mc:Choice Requires="wps">
             <w:drawing>
-              <wp:anchor distT="0" distB="0" distL="114300" distR="114300" simplePos="0" relativeHeight="251661312" behindDoc="0" locked="0" layoutInCell="1" allowOverlap="1" wp14:anchorId="481EB1B7" wp14:editId="740608D9">
+              <wp:anchor distT="0" distB="0" distL="114300" distR="114300" simplePos="0" relativeHeight="251658242" behindDoc="0" locked="0" layoutInCell="1" allowOverlap="1" wp14:anchorId="481EB1B7" wp14:editId="740608D9">
                 <wp:simplePos x="0" y="0"/>
                 <wp:positionH relativeFrom="column">
                   <wp:posOffset>2197100</wp:posOffset>
@@ -347,7 +347,7 @@
           </mc:Choice>
           <mc:Fallback>
             <w:pict>
-              <v:shapetype w14:anchorId="771C9B38" id="_x0000_t32" coordsize="21600,21600" o:spt="32" o:oned="t" path="m,l21600,21600e" filled="f">
+              <v:shapetype w14:anchorId="165C6277" id="_x0000_t32" coordsize="21600,21600" o:spt="32" o:oned="t" path="m,l21600,21600e" filled="f">
                 <v:path arrowok="t" fillok="f" o:connecttype="none"/>
                 <o:lock v:ext="edit" shapetype="t"/>
               </v:shapetype>
@@ -390,7 +390,7 @@
         <mc:AlternateContent>
           <mc:Choice Requires="wps">
             <w:drawing>
-              <wp:anchor distT="0" distB="0" distL="114300" distR="114300" simplePos="0" relativeHeight="251662336" behindDoc="0" locked="0" layoutInCell="1" allowOverlap="1" wp14:anchorId="2A0CE284" wp14:editId="1B305DBE">
+              <wp:anchor distT="0" distB="0" distL="114300" distR="114300" simplePos="0" relativeHeight="251658243" behindDoc="0" locked="0" layoutInCell="1" allowOverlap="1" wp14:anchorId="2A0CE284" wp14:editId="1B305DBE">
                 <wp:simplePos x="0" y="0"/>
                 <wp:positionH relativeFrom="column">
                   <wp:posOffset>1308100</wp:posOffset>
@@ -450,7 +450,7 @@
           </mc:Choice>
           <mc:Fallback>
             <w:pict>
-              <v:rect w14:anchorId="3567D015" id="Rectangle 6" o:spid="_x0000_s1026" style="position:absolute;margin-left:103pt;margin-top:.4pt;width:147.5pt;height:234.5pt;z-index:251662336;visibility:visible;mso-wrap-style:square;mso-height-percent:0;mso-wrap-distance-left:9pt;mso-wrap-distance-top:0;mso-wrap-distance-right:9pt;mso-wrap-distance-bottom:0;mso-position-horizontal:absolute;mso-position-horizontal-relative:text;mso-position-vertical:absolute;mso-position-vertical-relative:text;mso-height-percent:0;mso-height-relative:margin;v-text-anchor:middle" o:gfxdata="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" filled="f" strokecolor="#030e13 [484]" strokeweight="1.5pt"/>
+              <v:rect w14:anchorId="292A34A0" id="Rectangle 6" o:spid="_x0000_s1026" style="position:absolute;margin-left:103pt;margin-top:.4pt;width:147.5pt;height:234.5pt;z-index:251662336;visibility:visible;mso-wrap-style:square;mso-height-percent:0;mso-wrap-distance-left:9pt;mso-wrap-distance-top:0;mso-wrap-distance-right:9pt;mso-wrap-distance-bottom:0;mso-position-horizontal:absolute;mso-position-horizontal-relative:text;mso-position-vertical:absolute;mso-position-vertical-relative:text;mso-height-percent:0;mso-height-relative:margin;v-text-anchor:middle" o:gfxdata="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" filled="f" strokecolor="#030e13 [484]" strokeweight="1.5pt"/>
             </w:pict>
           </mc:Fallback>
         </mc:AlternateContent>
@@ -462,7 +462,7 @@
         <mc:AlternateContent>
           <mc:Choice Requires="wps">
             <w:drawing>
-              <wp:anchor distT="0" distB="0" distL="114300" distR="114300" simplePos="0" relativeHeight="251663360" behindDoc="0" locked="0" layoutInCell="1" allowOverlap="1" wp14:anchorId="20CAC657" wp14:editId="76FA41DD">
+              <wp:anchor distT="0" distB="0" distL="114300" distR="114300" simplePos="0" relativeHeight="251658244" behindDoc="0" locked="0" layoutInCell="1" allowOverlap="1" wp14:anchorId="20CAC657" wp14:editId="76FA41DD">
                 <wp:simplePos x="0" y="0"/>
                 <wp:positionH relativeFrom="column">
                   <wp:posOffset>1320800</wp:posOffset>
@@ -516,7 +516,7 @@
           </mc:Choice>
           <mc:Fallback>
             <w:pict>
-              <v:line w14:anchorId="0A02C98A" id="Straight Connector 7" o:spid="_x0000_s1026" style="position:absolute;z-index:251663360;visibility:visible;mso-wrap-style:square;mso-wrap-distance-left:9pt;mso-wrap-distance-top:0;mso-wrap-distance-right:9pt;mso-wrap-distance-bottom:0;mso-position-horizontal:absolute;mso-position-horizontal-relative:text;mso-position-vertical:absolute;mso-position-vertical-relative:text" from="104pt,13.4pt" to="249pt,14.4pt" o:gfxdata="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" strokecolor="black [3213]" strokeweight="1.5pt">
+              <v:line w14:anchorId="35618623" id="Straight Connector 7" o:spid="_x0000_s1026" style="position:absolute;z-index:251663360;visibility:visible;mso-wrap-style:square;mso-wrap-distance-left:9pt;mso-wrap-distance-top:0;mso-wrap-distance-right:9pt;mso-wrap-distance-bottom:0;mso-position-horizontal:absolute;mso-position-horizontal-relative:text;mso-position-vertical:absolute;mso-position-vertical-relative:text" from="104pt,13.4pt" to="249pt,14.4pt" o:gfxdata="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" strokecolor="black [3213]" strokeweight="1.5pt">
                 <v:stroke joinstyle="miter"/>
               </v:line>
             </w:pict>
@@ -650,7 +650,7 @@
         <mc:AlternateContent>
           <mc:Choice Requires="wps">
             <w:drawing>
-              <wp:anchor distT="0" distB="0" distL="114300" distR="114300" simplePos="0" relativeHeight="251671552" behindDoc="0" locked="0" layoutInCell="1" allowOverlap="1" wp14:anchorId="25F2BD4D" wp14:editId="620BE410">
+              <wp:anchor distT="0" distB="0" distL="114300" distR="114300" simplePos="0" relativeHeight="251658250" behindDoc="0" locked="0" layoutInCell="1" allowOverlap="1" wp14:anchorId="25F2BD4D" wp14:editId="620BE410">
                 <wp:simplePos x="0" y="0"/>
                 <wp:positionH relativeFrom="column">
                   <wp:posOffset>2768600</wp:posOffset>
@@ -705,7 +705,7 @@
           </mc:Choice>
           <mc:Fallback>
             <w:pict>
-              <v:shape w14:anchorId="7742C798" id="Straight Arrow Connector 19" o:spid="_x0000_s1026" type="#_x0000_t32" style="position:absolute;margin-left:218pt;margin-top:11.2pt;width:1.5pt;height:172.5pt;z-index:251671552;visibility:visible;mso-wrap-style:square;mso-wrap-distance-left:9pt;mso-wrap-distance-top:0;mso-wrap-distance-right:9pt;mso-wrap-distance-bottom:0;mso-position-horizontal:absolute;mso-position-horizontal-relative:text;mso-position-vertical:absolute;mso-position-vertical-relative:text" o:gfxdata="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" strokecolor="black [3213]" strokeweight="1.5pt">
+              <v:shape w14:anchorId="49151E0B" id="Straight Arrow Connector 19" o:spid="_x0000_s1026" type="#_x0000_t32" style="position:absolute;margin-left:218pt;margin-top:11.2pt;width:1.5pt;height:172.5pt;z-index:251671552;visibility:visible;mso-wrap-style:square;mso-wrap-distance-left:9pt;mso-wrap-distance-top:0;mso-wrap-distance-right:9pt;mso-wrap-distance-bottom:0;mso-position-horizontal:absolute;mso-position-horizontal-relative:text;mso-position-vertical:absolute;mso-position-vertical-relative:text" o:gfxdata="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" strokecolor="black [3213]" strokeweight="1.5pt">
                 <v:stroke endarrow="block" joinstyle="miter"/>
               </v:shape>
             </w:pict>
@@ -719,7 +719,7 @@
         <mc:AlternateContent>
           <mc:Choice Requires="wps">
             <w:drawing>
-              <wp:anchor distT="0" distB="0" distL="114300" distR="114300" simplePos="0" relativeHeight="251670528" behindDoc="0" locked="0" layoutInCell="1" allowOverlap="1" wp14:anchorId="340FAF3C" wp14:editId="5AEDC6AE">
+              <wp:anchor distT="0" distB="0" distL="114300" distR="114300" simplePos="0" relativeHeight="251658249" behindDoc="0" locked="0" layoutInCell="1" allowOverlap="1" wp14:anchorId="340FAF3C" wp14:editId="5AEDC6AE">
                 <wp:simplePos x="0" y="0"/>
                 <wp:positionH relativeFrom="column">
                   <wp:posOffset>1416050</wp:posOffset>
@@ -774,7 +774,7 @@
           </mc:Choice>
           <mc:Fallback>
             <w:pict>
-              <v:shape w14:anchorId="1FA784B3" id="Straight Arrow Connector 18" o:spid="_x0000_s1026" type="#_x0000_t32" style="position:absolute;margin-left:111.5pt;margin-top:8.7pt;width:1.5pt;height:180.5pt;z-index:251670528;visibility:visible;mso-wrap-style:square;mso-wrap-distance-left:9pt;mso-wrap-distance-top:0;mso-wrap-distance-right:9pt;mso-wrap-distance-bottom:0;mso-position-horizontal:absolute;mso-position-horizontal-relative:text;mso-position-vertical:absolute;mso-position-vertical-relative:text" o:gfxdata="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" strokecolor="black [3213]" strokeweight="1.5pt">
+              <v:shape w14:anchorId="4E2869A4" id="Straight Arrow Connector 18" o:spid="_x0000_s1026" type="#_x0000_t32" style="position:absolute;margin-left:111.5pt;margin-top:8.7pt;width:1.5pt;height:180.5pt;z-index:251670528;visibility:visible;mso-wrap-style:square;mso-wrap-distance-left:9pt;mso-wrap-distance-top:0;mso-wrap-distance-right:9pt;mso-wrap-distance-bottom:0;mso-position-horizontal:absolute;mso-position-horizontal-relative:text;mso-position-vertical:absolute;mso-position-vertical-relative:text" o:gfxdata="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" strokecolor="black [3213]" strokeweight="1.5pt">
                 <v:stroke endarrow="block" joinstyle="miter"/>
               </v:shape>
             </w:pict>
@@ -833,7 +833,7 @@
         <mc:AlternateContent>
           <mc:Choice Requires="wps">
             <w:drawing>
-              <wp:anchor distT="0" distB="0" distL="114300" distR="114300" simplePos="0" relativeHeight="251669504" behindDoc="0" locked="0" layoutInCell="1" allowOverlap="1" wp14:anchorId="78B728FB" wp14:editId="03A59623">
+              <wp:anchor distT="0" distB="0" distL="114300" distR="114300" simplePos="0" relativeHeight="251658248" behindDoc="0" locked="0" layoutInCell="1" allowOverlap="1" wp14:anchorId="78B728FB" wp14:editId="03A59623">
                 <wp:simplePos x="0" y="0"/>
                 <wp:positionH relativeFrom="column">
                   <wp:posOffset>2362200</wp:posOffset>
@@ -887,7 +887,7 @@
           </mc:Choice>
           <mc:Fallback>
             <w:pict>
-              <v:line w14:anchorId="373F437B" id="Straight Connector 17" o:spid="_x0000_s1026" style="position:absolute;z-index:251669504;visibility:visible;mso-wrap-style:square;mso-wrap-distance-left:9pt;mso-wrap-distance-top:0;mso-wrap-distance-right:9pt;mso-wrap-distance-bottom:0;mso-position-horizontal:absolute;mso-position-horizontal-relative:text;mso-position-vertical:absolute;mso-position-vertical-relative:text" from="186pt,13.5pt" to="348.5pt,14pt" o:gfxdata="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" strokecolor="black [3213]" strokeweight="1.5pt">
+              <v:line w14:anchorId="03A73329" id="Straight Connector 17" o:spid="_x0000_s1026" style="position:absolute;z-index:251669504;visibility:visible;mso-wrap-style:square;mso-wrap-distance-left:9pt;mso-wrap-distance-top:0;mso-wrap-distance-right:9pt;mso-wrap-distance-bottom:0;mso-position-horizontal:absolute;mso-position-horizontal-relative:text;mso-position-vertical:absolute;mso-position-vertical-relative:text" from="186pt,13.5pt" to="348.5pt,14pt" o:gfxdata="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" strokecolor="black [3213]" strokeweight="1.5pt">
                 <v:stroke joinstyle="miter"/>
               </v:line>
             </w:pict>
@@ -901,7 +901,7 @@
         <mc:AlternateContent>
           <mc:Choice Requires="wps">
             <w:drawing>
-              <wp:anchor distT="0" distB="0" distL="114300" distR="114300" simplePos="0" relativeHeight="251668480" behindDoc="0" locked="0" layoutInCell="1" allowOverlap="1" wp14:anchorId="3D6F158D" wp14:editId="55E8BBB7">
+              <wp:anchor distT="0" distB="0" distL="114300" distR="114300" simplePos="0" relativeHeight="251658247" behindDoc="0" locked="0" layoutInCell="1" allowOverlap="1" wp14:anchorId="3D6F158D" wp14:editId="55E8BBB7">
                 <wp:simplePos x="0" y="0"/>
                 <wp:positionH relativeFrom="column">
                   <wp:posOffset>2368550</wp:posOffset>
@@ -958,7 +958,7 @@
           </mc:Choice>
           <mc:Fallback>
             <w:pict>
-              <v:rect w14:anchorId="6BE0B59B" id="Rectangle 16" o:spid="_x0000_s1026" style="position:absolute;margin-left:186.5pt;margin-top:-12.5pt;width:161.5pt;height:192pt;z-index:251668480;visibility:visible;mso-wrap-style:square;mso-wrap-distance-left:9pt;mso-wrap-distance-top:0;mso-wrap-distance-right:9pt;mso-wrap-distance-bottom:0;mso-position-horizontal:absolute;mso-position-horizontal-relative:text;mso-position-vertical:absolute;mso-position-vertical-relative:text;v-text-anchor:middle" o:gfxdata="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" filled="f" strokecolor="#030e13 [484]" strokeweight="1.5pt"/>
+              <v:rect w14:anchorId="1D82CE18" id="Rectangle 16" o:spid="_x0000_s1026" style="position:absolute;margin-left:186.5pt;margin-top:-12.5pt;width:161.5pt;height:192pt;z-index:251668480;visibility:visible;mso-wrap-style:square;mso-wrap-distance-left:9pt;mso-wrap-distance-top:0;mso-wrap-distance-right:9pt;mso-wrap-distance-bottom:0;mso-position-horizontal:absolute;mso-position-horizontal-relative:text;mso-position-vertical:absolute;mso-position-vertical-relative:text;v-text-anchor:middle" o:gfxdata="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" filled="f" strokecolor="#030e13 [484]" strokeweight="1.5pt"/>
             </w:pict>
           </mc:Fallback>
         </mc:AlternateContent>
@@ -970,7 +970,7 @@
         <mc:AlternateContent>
           <mc:Choice Requires="wps">
             <w:drawing>
-              <wp:anchor distT="0" distB="0" distL="114300" distR="114300" simplePos="0" relativeHeight="251667456" behindDoc="0" locked="0" layoutInCell="1" allowOverlap="1" wp14:anchorId="02C282F3" wp14:editId="4FDE0082">
+              <wp:anchor distT="0" distB="0" distL="114300" distR="114300" simplePos="0" relativeHeight="251658246" behindDoc="0" locked="0" layoutInCell="1" allowOverlap="1" wp14:anchorId="02C282F3" wp14:editId="4FDE0082">
                 <wp:simplePos x="0" y="0"/>
                 <wp:positionH relativeFrom="column">
                   <wp:posOffset>-387350</wp:posOffset>
@@ -1030,7 +1030,7 @@
           </mc:Choice>
           <mc:Fallback>
             <w:pict>
-              <v:line w14:anchorId="2F780B7B" id="Straight Connector 13" o:spid="_x0000_s1026" style="position:absolute;z-index:251667456;visibility:visible;mso-wrap-style:square;mso-width-percent:0;mso-height-percent:0;mso-wrap-distance-left:9pt;mso-wrap-distance-top:0;mso-wrap-distance-right:9pt;mso-wrap-distance-bottom:0;mso-position-horizontal:absolute;mso-position-horizontal-relative:text;mso-position-vertical:absolute;mso-position-vertical-relative:text;mso-width-percent:0;mso-height-percent:0;mso-width-relative:margin;mso-height-relative:margin" from="-30.5pt,13pt" to="106pt,13pt" o:gfxdata="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" strokecolor="black [3213]" strokeweight="1.5pt">
+              <v:line w14:anchorId="6254D1E0" id="Straight Connector 13" o:spid="_x0000_s1026" style="position:absolute;z-index:251667456;visibility:visible;mso-wrap-style:square;mso-width-percent:0;mso-height-percent:0;mso-wrap-distance-left:9pt;mso-wrap-distance-top:0;mso-wrap-distance-right:9pt;mso-wrap-distance-bottom:0;mso-position-horizontal:absolute;mso-position-horizontal-relative:text;mso-position-vertical:absolute;mso-position-vertical-relative:text;mso-width-percent:0;mso-height-percent:0;mso-width-relative:margin;mso-height-relative:margin" from="-30.5pt,13pt" to="106pt,13pt" o:gfxdata="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" strokecolor="black [3213]" strokeweight="1.5pt">
                 <v:stroke joinstyle="miter"/>
               </v:line>
             </w:pict>
@@ -1044,7 +1044,7 @@
         <mc:AlternateContent>
           <mc:Choice Requires="wps">
             <w:drawing>
-              <wp:anchor distT="0" distB="0" distL="114300" distR="114300" simplePos="0" relativeHeight="251665408" behindDoc="0" locked="0" layoutInCell="1" allowOverlap="1" wp14:anchorId="09CAEE90" wp14:editId="73DF53D0">
+              <wp:anchor distT="0" distB="0" distL="114300" distR="114300" simplePos="0" relativeHeight="251658245" behindDoc="0" locked="0" layoutInCell="1" allowOverlap="1" wp14:anchorId="09CAEE90" wp14:editId="73DF53D0">
                 <wp:simplePos x="0" y="0"/>
                 <wp:positionH relativeFrom="column">
                   <wp:posOffset>-393700</wp:posOffset>
@@ -1101,7 +1101,7 @@
           </mc:Choice>
           <mc:Fallback>
             <w:pict>
-              <v:rect w14:anchorId="2BA88816" id="Rectangle 9" o:spid="_x0000_s1026" style="position:absolute;margin-left:-31pt;margin-top:-6pt;width:135.5pt;height:157pt;z-index:251665408;visibility:visible;mso-wrap-style:square;mso-wrap-distance-left:9pt;mso-wrap-distance-top:0;mso-wrap-distance-right:9pt;mso-wrap-distance-bottom:0;mso-position-horizontal:absolute;mso-position-horizontal-relative:text;mso-position-vertical:absolute;mso-position-vertical-relative:text;v-text-anchor:middle" o:gfxdata="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" filled="f" strokecolor="#030e13 [484]" strokeweight="1.5pt"/>
+              <v:rect w14:anchorId="4A70BBC6" id="Rectangle 9" o:spid="_x0000_s1026" style="position:absolute;margin-left:-31pt;margin-top:-6pt;width:135.5pt;height:157pt;z-index:251665408;visibility:visible;mso-wrap-style:square;mso-wrap-distance-left:9pt;mso-wrap-distance-top:0;mso-wrap-distance-right:9pt;mso-wrap-distance-bottom:0;mso-position-horizontal:absolute;mso-position-horizontal-relative:text;mso-position-vertical:absolute;mso-position-vertical-relative:text;v-text-anchor:middle" o:gfxdata="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" filled="f" strokecolor="#030e13 [484]" strokeweight="1.5pt"/>
             </w:pict>
           </mc:Fallback>
         </mc:AlternateContent>
@@ -1221,7 +1221,7 @@
         <mc:AlternateContent>
           <mc:Choice Requires="wps">
             <w:drawing>
-              <wp:anchor distT="0" distB="0" distL="114300" distR="114300" simplePos="0" relativeHeight="251674624" behindDoc="0" locked="0" layoutInCell="1" allowOverlap="1" wp14:anchorId="26FBAC23" wp14:editId="318927E9">
+              <wp:anchor distT="0" distB="0" distL="114300" distR="114300" simplePos="0" relativeHeight="251658253" behindDoc="0" locked="0" layoutInCell="1" allowOverlap="1" wp14:anchorId="26FBAC23" wp14:editId="318927E9">
                 <wp:simplePos x="0" y="0"/>
                 <wp:positionH relativeFrom="column">
                   <wp:posOffset>1225550</wp:posOffset>
@@ -1276,7 +1276,7 @@
           </mc:Choice>
           <mc:Fallback>
             <w:pict>
-              <v:shape w14:anchorId="55F65286" id="Straight Arrow Connector 26" o:spid="_x0000_s1026" type="#_x0000_t32" style="position:absolute;margin-left:96.5pt;margin-top:5.2pt;width:1.5pt;height:109pt;z-index:251674624;visibility:visible;mso-wrap-style:square;mso-wrap-distance-left:9pt;mso-wrap-distance-top:0;mso-wrap-distance-right:9pt;mso-wrap-distance-bottom:0;mso-position-horizontal:absolute;mso-position-horizontal-relative:text;mso-position-vertical:absolute;mso-position-vertical-relative:text" o:gfxdata="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" strokecolor="black [3213]" strokeweight="1.5pt">
+              <v:shape w14:anchorId="1C0CF4D2" id="Straight Arrow Connector 26" o:spid="_x0000_s1026" type="#_x0000_t32" style="position:absolute;margin-left:96.5pt;margin-top:5.2pt;width:1.5pt;height:109pt;z-index:251674624;visibility:visible;mso-wrap-style:square;mso-wrap-distance-left:9pt;mso-wrap-distance-top:0;mso-wrap-distance-right:9pt;mso-wrap-distance-bottom:0;mso-position-horizontal:absolute;mso-position-horizontal-relative:text;mso-position-vertical:absolute;mso-position-vertical-relative:text" o:gfxdata="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" strokecolor="black [3213]" strokeweight="1.5pt">
                 <v:stroke endarrow="block" joinstyle="miter"/>
               </v:shape>
             </w:pict>
@@ -1324,7 +1324,7 @@
         <mc:AlternateContent>
           <mc:Choice Requires="wps">
             <w:drawing>
-              <wp:anchor distT="0" distB="0" distL="114300" distR="114300" simplePos="0" relativeHeight="251676672" behindDoc="0" locked="0" layoutInCell="1" allowOverlap="1" wp14:anchorId="16BF90D9" wp14:editId="74B37D38">
+              <wp:anchor distT="0" distB="0" distL="114300" distR="114300" simplePos="0" relativeHeight="251658255" behindDoc="0" locked="0" layoutInCell="1" allowOverlap="1" wp14:anchorId="16BF90D9" wp14:editId="74B37D38">
                 <wp:simplePos x="0" y="0"/>
                 <wp:positionH relativeFrom="column">
                   <wp:posOffset>368300</wp:posOffset>
@@ -1378,7 +1378,7 @@
           </mc:Choice>
           <mc:Fallback>
             <w:pict>
-              <v:line w14:anchorId="1A5189FA" id="Straight Connector 28" o:spid="_x0000_s1026" style="position:absolute;z-index:251676672;visibility:visible;mso-wrap-style:square;mso-wrap-distance-left:9pt;mso-wrap-distance-top:0;mso-wrap-distance-right:9pt;mso-wrap-distance-bottom:0;mso-position-horizontal:absolute;mso-position-horizontal-relative:text;mso-position-vertical:absolute;mso-position-vertical-relative:text" from="29pt,15.35pt" to="206pt,16.85pt" o:gfxdata="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" strokecolor="black [3213]" strokeweight="1.5pt">
+              <v:line w14:anchorId="7402AB05" id="Straight Connector 28" o:spid="_x0000_s1026" style="position:absolute;z-index:251676672;visibility:visible;mso-wrap-style:square;mso-wrap-distance-left:9pt;mso-wrap-distance-top:0;mso-wrap-distance-right:9pt;mso-wrap-distance-bottom:0;mso-position-horizontal:absolute;mso-position-horizontal-relative:text;mso-position-vertical:absolute;mso-position-vertical-relative:text" from="29pt,15.35pt" to="206pt,16.85pt" o:gfxdata="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" strokecolor="black [3213]" strokeweight="1.5pt">
                 <v:stroke joinstyle="miter"/>
               </v:line>
             </w:pict>
@@ -1399,7 +1399,7 @@
         <mc:AlternateContent>
           <mc:Choice Requires="wps">
             <w:drawing>
-              <wp:anchor distT="0" distB="0" distL="114300" distR="114300" simplePos="0" relativeHeight="251675648" behindDoc="0" locked="0" layoutInCell="1" allowOverlap="1" wp14:anchorId="27A3870E" wp14:editId="0D26D9BE">
+              <wp:anchor distT="0" distB="0" distL="114300" distR="114300" simplePos="0" relativeHeight="251658254" behindDoc="0" locked="0" layoutInCell="1" allowOverlap="1" wp14:anchorId="27A3870E" wp14:editId="0D26D9BE">
                 <wp:simplePos x="0" y="0"/>
                 <wp:positionH relativeFrom="column">
                   <wp:posOffset>368300</wp:posOffset>
@@ -1456,7 +1456,7 @@
           </mc:Choice>
           <mc:Fallback>
             <w:pict>
-              <v:rect w14:anchorId="418EA9DA" id="Rectangle 27" o:spid="_x0000_s1026" style="position:absolute;margin-left:29pt;margin-top:.35pt;width:176.5pt;height:174pt;z-index:251675648;visibility:visible;mso-wrap-style:square;mso-wrap-distance-left:9pt;mso-wrap-distance-top:0;mso-wrap-distance-right:9pt;mso-wrap-distance-bottom:0;mso-position-horizontal:absolute;mso-position-horizontal-relative:text;mso-position-vertical:absolute;mso-position-vertical-relative:text;v-text-anchor:middle" o:gfxdata="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" filled="f" strokecolor="#030e13 [484]" strokeweight="1.5pt"/>
+              <v:rect w14:anchorId="41E8D9EA" id="Rectangle 27" o:spid="_x0000_s1026" style="position:absolute;margin-left:29pt;margin-top:.35pt;width:176.5pt;height:174pt;z-index:251675648;visibility:visible;mso-wrap-style:square;mso-wrap-distance-left:9pt;mso-wrap-distance-top:0;mso-wrap-distance-right:9pt;mso-wrap-distance-bottom:0;mso-position-horizontal:absolute;mso-position-horizontal-relative:text;mso-position-vertical:absolute;mso-position-vertical-relative:text;v-text-anchor:middle" o:gfxdata="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" filled="f" strokecolor="#030e13 [484]" strokeweight="1.5pt"/>
             </w:pict>
           </mc:Fallback>
         </mc:AlternateContent>
@@ -1560,7 +1560,7 @@
         <mc:AlternateContent>
           <mc:Choice Requires="wps">
             <w:drawing>
-              <wp:anchor distT="0" distB="0" distL="114300" distR="114300" simplePos="0" relativeHeight="251677696" behindDoc="0" locked="0" layoutInCell="1" allowOverlap="1" wp14:anchorId="7AC2CA82" wp14:editId="7D1DDBA0">
+              <wp:anchor distT="0" distB="0" distL="114300" distR="114300" simplePos="0" relativeHeight="251658256" behindDoc="0" locked="0" layoutInCell="1" allowOverlap="1" wp14:anchorId="7AC2CA82" wp14:editId="7D1DDBA0">
                 <wp:simplePos x="0" y="0"/>
                 <wp:positionH relativeFrom="column">
                   <wp:posOffset>1873250</wp:posOffset>
@@ -1615,7 +1615,7 @@
           </mc:Choice>
           <mc:Fallback>
             <w:pict>
-              <v:shape w14:anchorId="466BF980" id="Straight Arrow Connector 29" o:spid="_x0000_s1026" type="#_x0000_t32" style="position:absolute;margin-left:147.5pt;margin-top:22.55pt;width:1pt;height:78.5pt;z-index:251677696;visibility:visible;mso-wrap-style:square;mso-wrap-distance-left:9pt;mso-wrap-distance-top:0;mso-wrap-distance-right:9pt;mso-wrap-distance-bottom:0;mso-position-horizontal:absolute;mso-position-horizontal-relative:text;mso-position-vertical:absolute;mso-position-vertical-relative:text" o:gfxdata="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" strokecolor="black [3213]" strokeweight="1.5pt">
+              <v:shape w14:anchorId="089BDAF6" id="Straight Arrow Connector 29" o:spid="_x0000_s1026" type="#_x0000_t32" style="position:absolute;margin-left:147.5pt;margin-top:22.55pt;width:1pt;height:78.5pt;z-index:251677696;visibility:visible;mso-wrap-style:square;mso-wrap-distance-left:9pt;mso-wrap-distance-top:0;mso-wrap-distance-right:9pt;mso-wrap-distance-bottom:0;mso-position-horizontal:absolute;mso-position-horizontal-relative:text;mso-position-vertical:absolute;mso-position-vertical-relative:text" o:gfxdata="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" strokecolor="black [3213]" strokeweight="1.5pt">
                 <v:stroke endarrow="block" joinstyle="miter"/>
               </v:shape>
             </w:pict>
@@ -1652,7 +1652,7 @@
         <mc:AlternateContent>
           <mc:Choice Requires="wps">
             <w:drawing>
-              <wp:anchor distT="0" distB="0" distL="114300" distR="114300" simplePos="0" relativeHeight="251672576" behindDoc="0" locked="0" layoutInCell="1" allowOverlap="1" wp14:anchorId="7B4E189D" wp14:editId="595BB997">
+              <wp:anchor distT="0" distB="0" distL="114300" distR="114300" simplePos="0" relativeHeight="251658251" behindDoc="0" locked="0" layoutInCell="1" allowOverlap="1" wp14:anchorId="7B4E189D" wp14:editId="595BB997">
                 <wp:simplePos x="0" y="0"/>
                 <wp:positionH relativeFrom="column">
                   <wp:posOffset>1670050</wp:posOffset>
@@ -1714,7 +1714,7 @@
           </mc:Choice>
           <mc:Fallback>
             <w:pict>
-              <v:rect w14:anchorId="0604A07B" id="Rectangle 24" o:spid="_x0000_s1026" style="position:absolute;margin-left:131.5pt;margin-top:4.7pt;width:146.5pt;height:188pt;z-index:251672576;visibility:visible;mso-wrap-style:square;mso-wrap-distance-left:9pt;mso-wrap-distance-top:0;mso-wrap-distance-right:9pt;mso-wrap-distance-bottom:0;mso-position-horizontal:absolute;mso-position-horizontal-relative:text;mso-position-vertical:absolute;mso-position-vertical-relative:text;v-text-anchor:middle" o:gfxdata="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" filled="f" strokecolor="black [3213]" strokeweight="1.5pt"/>
+              <v:rect w14:anchorId="2F0EC2DA" id="Rectangle 24" o:spid="_x0000_s1026" style="position:absolute;margin-left:131.5pt;margin-top:4.7pt;width:146.5pt;height:188pt;z-index:251672576;visibility:visible;mso-wrap-style:square;mso-wrap-distance-left:9pt;mso-wrap-distance-top:0;mso-wrap-distance-right:9pt;mso-wrap-distance-bottom:0;mso-position-horizontal:absolute;mso-position-horizontal-relative:text;mso-position-vertical:absolute;mso-position-vertical-relative:text;v-text-anchor:middle" o:gfxdata="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" filled="f" strokecolor="black [3213]" strokeweight="1.5pt"/>
             </w:pict>
           </mc:Fallback>
         </mc:AlternateContent>
@@ -1733,7 +1733,7 @@
         <mc:AlternateContent>
           <mc:Choice Requires="wps">
             <w:drawing>
-              <wp:anchor distT="0" distB="0" distL="114300" distR="114300" simplePos="0" relativeHeight="251673600" behindDoc="0" locked="0" layoutInCell="1" allowOverlap="1" wp14:anchorId="78F440EC" wp14:editId="62FAFF37">
+              <wp:anchor distT="0" distB="0" distL="114300" distR="114300" simplePos="0" relativeHeight="251658252" behindDoc="0" locked="0" layoutInCell="1" allowOverlap="1" wp14:anchorId="78F440EC" wp14:editId="62FAFF37">
                 <wp:simplePos x="0" y="0"/>
                 <wp:positionH relativeFrom="column">
                   <wp:posOffset>1657350</wp:posOffset>
@@ -1787,7 +1787,7 @@
           </mc:Choice>
           <mc:Fallback>
             <w:pict>
-              <v:line w14:anchorId="0F74E1FF" id="Straight Connector 25" o:spid="_x0000_s1026" style="position:absolute;z-index:251673600;visibility:visible;mso-wrap-style:square;mso-wrap-distance-left:9pt;mso-wrap-distance-top:0;mso-wrap-distance-right:9pt;mso-wrap-distance-bottom:0;mso-position-horizontal:absolute;mso-position-horizontal-relative:text;mso-position-vertical:absolute;mso-position-vertical-relative:text" from="130.5pt,12.2pt" to="278pt,12.2pt" o:gfxdata="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" strokecolor="black [3213]" strokeweight="1.5pt">
+              <v:line w14:anchorId="23645077" id="Straight Connector 25" o:spid="_x0000_s1026" style="position:absolute;z-index:251673600;visibility:visible;mso-wrap-style:square;mso-wrap-distance-left:9pt;mso-wrap-distance-top:0;mso-wrap-distance-right:9pt;mso-wrap-distance-bottom:0;mso-position-horizontal:absolute;mso-position-horizontal-relative:text;mso-position-vertical:absolute;mso-position-vertical-relative:text" from="130.5pt,12.2pt" to="278pt,12.2pt" o:gfxdata="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" strokecolor="black [3213]" strokeweight="1.5pt">
                 <v:stroke joinstyle="miter"/>
               </v:line>
             </w:pict>
@@ -1880,6 +1880,2350 @@
         <w:lastRenderedPageBreak/>
         <w:t xml:space="preserve">SECTION B </w:t>
       </w:r>
+    </w:p>
+    <w:p>
+      <w:pPr>
+        <w:tabs>
+          <w:tab w:val="left" w:pos="3160"/>
+        </w:tabs>
+        <w:rPr>
+          <w:b/>
+          <w:bCs/>
+        </w:rPr>
+      </w:pPr>
+    </w:p>
+    <w:p>
+      <w:pPr>
+        <w:tabs>
+          <w:tab w:val="left" w:pos="3160"/>
+        </w:tabs>
+        <w:rPr>
+          <w:b/>
+          <w:bCs/>
+        </w:rPr>
+      </w:pPr>
+    </w:p>
+    <w:p>
+      <w:pPr>
+        <w:tabs>
+          <w:tab w:val="left" w:pos="3160"/>
+        </w:tabs>
+      </w:pPr>
+      <w:r>
+        <w:t xml:space="preserve">The </w:t>
+      </w:r>
+      <w:proofErr w:type="spellStart"/>
+      <w:r>
+        <w:t>RaceDay</w:t>
+      </w:r>
+      <w:proofErr w:type="spellEnd"/>
+      <w:r>
+        <w:t xml:space="preserve"> API endpoint plan defines the HTTP methods, routes, access roles, request information and expected responses required to support the functional requirements of the system. The endpoints provide functionality for authentication, user profiles, event management, category management, event enrolments and participant results. Role-based access is used to ensure that Organisers and Participants can only perform actions appropriate to their roles.</w:t>
+      </w:r>
+    </w:p>
+    <w:p>
+      <w:pPr>
+        <w:tabs>
+          <w:tab w:val="left" w:pos="3160"/>
+        </w:tabs>
+      </w:pPr>
+    </w:p>
+    <w:p>
+      <w:pPr>
+        <w:tabs>
+          <w:tab w:val="left" w:pos="3160"/>
+        </w:tabs>
+      </w:pPr>
+      <w:r>
+        <w:t>Authentication</w:t>
+      </w:r>
+    </w:p>
+    <w:p>
+      <w:pPr>
+        <w:tabs>
+          <w:tab w:val="left" w:pos="3160"/>
+        </w:tabs>
+      </w:pPr>
+    </w:p>
+    <w:tbl>
+      <w:tblPr>
+        <w:tblStyle w:val="TableGrid"/>
+        <w:tblW w:w="0" w:type="auto"/>
+        <w:tblLook w:val="04A0" w:firstRow="1" w:lastRow="0" w:firstColumn="1" w:lastColumn="0" w:noHBand="0" w:noVBand="1"/>
+      </w:tblPr>
+      <w:tblGrid>
+        <w:gridCol w:w="1141"/>
+        <w:gridCol w:w="1992"/>
+        <w:gridCol w:w="1663"/>
+        <w:gridCol w:w="1186"/>
+        <w:gridCol w:w="1337"/>
+        <w:gridCol w:w="1697"/>
+      </w:tblGrid>
+      <w:tr>
+        <w:tc>
+          <w:tcPr>
+            <w:tcW w:w="1305" w:type="dxa"/>
+          </w:tcPr>
+          <w:p>
+            <w:pPr>
+              <w:tabs>
+                <w:tab w:val="left" w:pos="3160"/>
+              </w:tabs>
+            </w:pPr>
+            <w:r>
+              <w:t>HTTP method</w:t>
+            </w:r>
+          </w:p>
+        </w:tc>
+        <w:tc>
+          <w:tcPr>
+            <w:tcW w:w="1992" w:type="dxa"/>
+          </w:tcPr>
+          <w:p>
+            <w:pPr>
+              <w:tabs>
+                <w:tab w:val="left" w:pos="3160"/>
+              </w:tabs>
+            </w:pPr>
+            <w:r>
+              <w:t xml:space="preserve">Route </w:t>
+            </w:r>
+          </w:p>
+        </w:tc>
+        <w:tc>
+          <w:tcPr>
+            <w:tcW w:w="1468" w:type="dxa"/>
+          </w:tcPr>
+          <w:p>
+            <w:pPr>
+              <w:tabs>
+                <w:tab w:val="left" w:pos="3160"/>
+              </w:tabs>
+            </w:pPr>
+            <w:r>
+              <w:t xml:space="preserve">Description </w:t>
+            </w:r>
+          </w:p>
+        </w:tc>
+        <w:tc>
+          <w:tcPr>
+            <w:tcW w:w="1330" w:type="dxa"/>
+          </w:tcPr>
+          <w:p>
+            <w:pPr>
+              <w:tabs>
+                <w:tab w:val="left" w:pos="3160"/>
+              </w:tabs>
+            </w:pPr>
+            <w:r>
+              <w:t>Role required</w:t>
+            </w:r>
+          </w:p>
+        </w:tc>
+        <w:tc>
+          <w:tcPr>
+            <w:tcW w:w="1412" w:type="dxa"/>
+          </w:tcPr>
+          <w:p>
+            <w:pPr>
+              <w:tabs>
+                <w:tab w:val="left" w:pos="3160"/>
+              </w:tabs>
+            </w:pPr>
+            <w:r>
+              <w:t>Request body</w:t>
+            </w:r>
+          </w:p>
+        </w:tc>
+        <w:tc>
+          <w:tcPr>
+            <w:tcW w:w="1509" w:type="dxa"/>
+          </w:tcPr>
+          <w:p>
+            <w:pPr>
+              <w:tabs>
+                <w:tab w:val="left" w:pos="3160"/>
+              </w:tabs>
+            </w:pPr>
+            <w:r>
+              <w:t xml:space="preserve">Expected </w:t>
+            </w:r>
+          </w:p>
+          <w:p>
+            <w:pPr>
+              <w:tabs>
+                <w:tab w:val="left" w:pos="3160"/>
+              </w:tabs>
+            </w:pPr>
+            <w:r>
+              <w:t xml:space="preserve">Response </w:t>
+            </w:r>
+          </w:p>
+        </w:tc>
+      </w:tr>
+      <w:tr>
+        <w:tc>
+          <w:tcPr>
+            <w:tcW w:w="1305" w:type="dxa"/>
+          </w:tcPr>
+          <w:p>
+            <w:pPr>
+              <w:tabs>
+                <w:tab w:val="left" w:pos="3160"/>
+              </w:tabs>
+            </w:pPr>
+            <w:r>
+              <w:t>POST</w:t>
+            </w:r>
+          </w:p>
+        </w:tc>
+        <w:tc>
+          <w:tcPr>
+            <w:tcW w:w="1992" w:type="dxa"/>
+          </w:tcPr>
+          <w:p>
+            <w:pPr>
+              <w:tabs>
+                <w:tab w:val="left" w:pos="3160"/>
+              </w:tabs>
+            </w:pPr>
+            <w:r>
+              <w:t>/</w:t>
+            </w:r>
+            <w:proofErr w:type="spellStart"/>
+            <w:r>
+              <w:t>api</w:t>
+            </w:r>
+            <w:proofErr w:type="spellEnd"/>
+            <w:r>
+              <w:t>/auth/register</w:t>
+            </w:r>
+          </w:p>
+        </w:tc>
+        <w:tc>
+          <w:tcPr>
+            <w:tcW w:w="1468" w:type="dxa"/>
+          </w:tcPr>
+          <w:p>
+            <w:pPr>
+              <w:tabs>
+                <w:tab w:val="left" w:pos="3160"/>
+              </w:tabs>
+            </w:pPr>
+            <w:r>
+              <w:t xml:space="preserve">Registers a new </w:t>
+            </w:r>
+            <w:proofErr w:type="spellStart"/>
+            <w:r>
+              <w:t>RaceDay</w:t>
+            </w:r>
+            <w:proofErr w:type="spellEnd"/>
+            <w:r>
+              <w:t xml:space="preserve"> user as a Participant or Organiser.</w:t>
+            </w:r>
+          </w:p>
+        </w:tc>
+        <w:tc>
+          <w:tcPr>
+            <w:tcW w:w="1330" w:type="dxa"/>
+          </w:tcPr>
+          <w:p>
+            <w:pPr>
+              <w:tabs>
+                <w:tab w:val="left" w:pos="3160"/>
+              </w:tabs>
+            </w:pPr>
+            <w:r>
+              <w:t>None</w:t>
+            </w:r>
+          </w:p>
+        </w:tc>
+        <w:tc>
+          <w:tcPr>
+            <w:tcW w:w="1412" w:type="dxa"/>
+          </w:tcPr>
+          <w:p>
+            <w:pPr>
+              <w:tabs>
+                <w:tab w:val="left" w:pos="3160"/>
+              </w:tabs>
+            </w:pPr>
+            <w:r>
+              <w:t>Name, Email, Password, Role</w:t>
+            </w:r>
+          </w:p>
+        </w:tc>
+        <w:tc>
+          <w:tcPr>
+            <w:tcW w:w="1509" w:type="dxa"/>
+          </w:tcPr>
+          <w:p>
+            <w:pPr>
+              <w:tabs>
+                <w:tab w:val="left" w:pos="3160"/>
+              </w:tabs>
+            </w:pPr>
+            <w:r>
+              <w:t xml:space="preserve">User created successfully </w:t>
+            </w:r>
+          </w:p>
+        </w:tc>
+      </w:tr>
+      <w:tr>
+        <w:tc>
+          <w:tcPr>
+            <w:tcW w:w="1305" w:type="dxa"/>
+          </w:tcPr>
+          <w:p>
+            <w:pPr>
+              <w:tabs>
+                <w:tab w:val="left" w:pos="3160"/>
+              </w:tabs>
+            </w:pPr>
+            <w:r>
+              <w:t>POST</w:t>
+            </w:r>
+          </w:p>
+        </w:tc>
+        <w:tc>
+          <w:tcPr>
+            <w:tcW w:w="1992" w:type="dxa"/>
+          </w:tcPr>
+          <w:p>
+            <w:pPr>
+              <w:tabs>
+                <w:tab w:val="left" w:pos="3160"/>
+              </w:tabs>
+            </w:pPr>
+            <w:r>
+              <w:t>/</w:t>
+            </w:r>
+            <w:proofErr w:type="spellStart"/>
+            <w:r>
+              <w:t>api</w:t>
+            </w:r>
+            <w:proofErr w:type="spellEnd"/>
+            <w:r>
+              <w:t>/auth/login</w:t>
+            </w:r>
+          </w:p>
+        </w:tc>
+        <w:tc>
+          <w:tcPr>
+            <w:tcW w:w="1468" w:type="dxa"/>
+          </w:tcPr>
+          <w:p>
+            <w:pPr>
+              <w:tabs>
+                <w:tab w:val="left" w:pos="3160"/>
+              </w:tabs>
+            </w:pPr>
+            <w:r>
+              <w:t>Authenticates a user and provides access according to their role.</w:t>
+            </w:r>
+          </w:p>
+        </w:tc>
+        <w:tc>
+          <w:tcPr>
+            <w:tcW w:w="1330" w:type="dxa"/>
+          </w:tcPr>
+          <w:p>
+            <w:pPr>
+              <w:tabs>
+                <w:tab w:val="left" w:pos="3160"/>
+              </w:tabs>
+            </w:pPr>
+            <w:r>
+              <w:t>None</w:t>
+            </w:r>
+          </w:p>
+        </w:tc>
+        <w:tc>
+          <w:tcPr>
+            <w:tcW w:w="1412" w:type="dxa"/>
+          </w:tcPr>
+          <w:p>
+            <w:pPr>
+              <w:tabs>
+                <w:tab w:val="left" w:pos="3160"/>
+              </w:tabs>
+            </w:pPr>
+            <w:r>
+              <w:t>Email, password</w:t>
+            </w:r>
+          </w:p>
+        </w:tc>
+        <w:tc>
+          <w:tcPr>
+            <w:tcW w:w="1509" w:type="dxa"/>
+          </w:tcPr>
+          <w:p>
+            <w:pPr>
+              <w:tabs>
+                <w:tab w:val="left" w:pos="3160"/>
+              </w:tabs>
+            </w:pPr>
+            <w:r>
+              <w:t xml:space="preserve">Login successful </w:t>
+            </w:r>
+          </w:p>
+          <w:p>
+            <w:pPr>
+              <w:tabs>
+                <w:tab w:val="left" w:pos="3160"/>
+              </w:tabs>
+            </w:pPr>
+          </w:p>
+          <w:p>
+            <w:pPr>
+              <w:tabs>
+                <w:tab w:val="left" w:pos="3160"/>
+              </w:tabs>
+            </w:pPr>
+            <w:r>
+              <w:t>Unauthorized-</w:t>
+            </w:r>
+          </w:p>
+          <w:p>
+            <w:pPr>
+              <w:tabs>
+                <w:tab w:val="left" w:pos="3160"/>
+              </w:tabs>
+            </w:pPr>
+            <w:r>
+              <w:t>Invalid credential</w:t>
+            </w:r>
+            <w:r>
+              <w:t>s</w:t>
+            </w:r>
+          </w:p>
+        </w:tc>
+      </w:tr>
+    </w:tbl>
+    <w:p>
+      <w:pPr>
+        <w:tabs>
+          <w:tab w:val="left" w:pos="3160"/>
+        </w:tabs>
+      </w:pPr>
+    </w:p>
+    <w:p>
+      <w:pPr>
+        <w:tabs>
+          <w:tab w:val="left" w:pos="3160"/>
+        </w:tabs>
+      </w:pPr>
+    </w:p>
+    <w:p>
+      <w:pPr>
+        <w:tabs>
+          <w:tab w:val="left" w:pos="3160"/>
+        </w:tabs>
+      </w:pPr>
+    </w:p>
+    <w:p>
+      <w:pPr>
+        <w:tabs>
+          <w:tab w:val="left" w:pos="3160"/>
+        </w:tabs>
+      </w:pPr>
+      <w:r>
+        <w:t>User Profile</w:t>
+      </w:r>
+    </w:p>
+    <w:tbl>
+      <w:tblPr>
+        <w:tblStyle w:val="TableGrid"/>
+        <w:tblW w:w="0" w:type="auto"/>
+        <w:tblLook w:val="04A0" w:firstRow="1" w:lastRow="0" w:firstColumn="1" w:lastColumn="0" w:noHBand="0" w:noVBand="1"/>
+      </w:tblPr>
+      <w:tblGrid>
+        <w:gridCol w:w="1300"/>
+        <w:gridCol w:w="1985"/>
+        <w:gridCol w:w="1467"/>
+        <w:gridCol w:w="1435"/>
+        <w:gridCol w:w="1320"/>
+        <w:gridCol w:w="1509"/>
+      </w:tblGrid>
+      <w:tr>
+        <w:tc>
+          <w:tcPr>
+            <w:tcW w:w="1346" w:type="dxa"/>
+          </w:tcPr>
+          <w:p>
+            <w:pPr>
+              <w:tabs>
+                <w:tab w:val="left" w:pos="3160"/>
+              </w:tabs>
+            </w:pPr>
+            <w:r>
+              <w:t xml:space="preserve">HTTP method </w:t>
+            </w:r>
+          </w:p>
+        </w:tc>
+        <w:tc>
+          <w:tcPr>
+            <w:tcW w:w="1985" w:type="dxa"/>
+          </w:tcPr>
+          <w:p>
+            <w:pPr>
+              <w:tabs>
+                <w:tab w:val="left" w:pos="3160"/>
+              </w:tabs>
+            </w:pPr>
+            <w:r>
+              <w:t>Route</w:t>
+            </w:r>
+          </w:p>
+        </w:tc>
+        <w:tc>
+          <w:tcPr>
+            <w:tcW w:w="1475" w:type="dxa"/>
+          </w:tcPr>
+          <w:p>
+            <w:pPr>
+              <w:tabs>
+                <w:tab w:val="left" w:pos="3160"/>
+              </w:tabs>
+            </w:pPr>
+            <w:r>
+              <w:t xml:space="preserve">Description </w:t>
+            </w:r>
+          </w:p>
+        </w:tc>
+        <w:tc>
+          <w:tcPr>
+            <w:tcW w:w="1451" w:type="dxa"/>
+          </w:tcPr>
+          <w:p>
+            <w:pPr>
+              <w:tabs>
+                <w:tab w:val="left" w:pos="3160"/>
+              </w:tabs>
+            </w:pPr>
+            <w:r>
+              <w:t xml:space="preserve">Role required </w:t>
+            </w:r>
+          </w:p>
+        </w:tc>
+        <w:tc>
+          <w:tcPr>
+            <w:tcW w:w="1362" w:type="dxa"/>
+          </w:tcPr>
+          <w:p>
+            <w:pPr>
+              <w:tabs>
+                <w:tab w:val="left" w:pos="3160"/>
+              </w:tabs>
+            </w:pPr>
+            <w:r>
+              <w:t>Request body</w:t>
+            </w:r>
+          </w:p>
+        </w:tc>
+        <w:tc>
+          <w:tcPr>
+            <w:tcW w:w="1397" w:type="dxa"/>
+          </w:tcPr>
+          <w:p>
+            <w:pPr>
+              <w:tabs>
+                <w:tab w:val="left" w:pos="3160"/>
+              </w:tabs>
+            </w:pPr>
+            <w:r>
+              <w:t xml:space="preserve">Expected response </w:t>
+            </w:r>
+          </w:p>
+        </w:tc>
+      </w:tr>
+      <w:tr>
+        <w:tc>
+          <w:tcPr>
+            <w:tcW w:w="1346" w:type="dxa"/>
+          </w:tcPr>
+          <w:p>
+            <w:pPr>
+              <w:tabs>
+                <w:tab w:val="left" w:pos="3160"/>
+              </w:tabs>
+            </w:pPr>
+            <w:r>
+              <w:t>GET</w:t>
+            </w:r>
+          </w:p>
+        </w:tc>
+        <w:tc>
+          <w:tcPr>
+            <w:tcW w:w="1985" w:type="dxa"/>
+          </w:tcPr>
+          <w:p>
+            <w:pPr>
+              <w:tabs>
+                <w:tab w:val="left" w:pos="3160"/>
+              </w:tabs>
+            </w:pPr>
+            <w:r>
+              <w:t>/</w:t>
+            </w:r>
+            <w:proofErr w:type="spellStart"/>
+            <w:r>
+              <w:t>api</w:t>
+            </w:r>
+            <w:proofErr w:type="spellEnd"/>
+            <w:r>
+              <w:t>/users/profile</w:t>
+            </w:r>
+          </w:p>
+        </w:tc>
+        <w:tc>
+          <w:tcPr>
+            <w:tcW w:w="1475" w:type="dxa"/>
+          </w:tcPr>
+          <w:p>
+            <w:pPr>
+              <w:tabs>
+                <w:tab w:val="left" w:pos="3160"/>
+              </w:tabs>
+            </w:pPr>
+            <w:r>
+              <w:t>Allows a logged-in user to view their own profile.</w:t>
+            </w:r>
+          </w:p>
+        </w:tc>
+        <w:tc>
+          <w:tcPr>
+            <w:tcW w:w="1451" w:type="dxa"/>
+          </w:tcPr>
+          <w:p>
+            <w:pPr>
+              <w:tabs>
+                <w:tab w:val="left" w:pos="3160"/>
+              </w:tabs>
+            </w:pPr>
+            <w:r>
+              <w:t>Participant / Organiser</w:t>
+            </w:r>
+          </w:p>
+        </w:tc>
+        <w:tc>
+          <w:tcPr>
+            <w:tcW w:w="1362" w:type="dxa"/>
+          </w:tcPr>
+          <w:p>
+            <w:pPr>
+              <w:tabs>
+                <w:tab w:val="left" w:pos="3160"/>
+              </w:tabs>
+            </w:pPr>
+            <w:r>
+              <w:t>None</w:t>
+            </w:r>
+          </w:p>
+        </w:tc>
+        <w:tc>
+          <w:tcPr>
+            <w:tcW w:w="1397" w:type="dxa"/>
+          </w:tcPr>
+          <w:p>
+            <w:pPr>
+              <w:tabs>
+                <w:tab w:val="left" w:pos="3160"/>
+              </w:tabs>
+            </w:pPr>
+            <w:r>
+              <w:t xml:space="preserve">Profile details returned </w:t>
+            </w:r>
+          </w:p>
+        </w:tc>
+      </w:tr>
+      <w:tr>
+        <w:tc>
+          <w:tcPr>
+            <w:tcW w:w="1346" w:type="dxa"/>
+          </w:tcPr>
+          <w:p>
+            <w:pPr>
+              <w:tabs>
+                <w:tab w:val="left" w:pos="3160"/>
+              </w:tabs>
+            </w:pPr>
+            <w:r>
+              <w:lastRenderedPageBreak/>
+              <w:t>POST</w:t>
+            </w:r>
+          </w:p>
+        </w:tc>
+        <w:tc>
+          <w:tcPr>
+            <w:tcW w:w="1985" w:type="dxa"/>
+          </w:tcPr>
+          <w:p>
+            <w:pPr>
+              <w:tabs>
+                <w:tab w:val="left" w:pos="3160"/>
+              </w:tabs>
+            </w:pPr>
+            <w:r>
+              <w:t>/</w:t>
+            </w:r>
+            <w:proofErr w:type="spellStart"/>
+            <w:r>
+              <w:t>api</w:t>
+            </w:r>
+            <w:proofErr w:type="spellEnd"/>
+            <w:r>
+              <w:t>/users/profile</w:t>
+            </w:r>
+          </w:p>
+        </w:tc>
+        <w:tc>
+          <w:tcPr>
+            <w:tcW w:w="1475" w:type="dxa"/>
+          </w:tcPr>
+          <w:p>
+            <w:pPr>
+              <w:tabs>
+                <w:tab w:val="left" w:pos="3160"/>
+              </w:tabs>
+            </w:pPr>
+            <w:r>
+              <w:t>Allows a logged-in user to update their own profile.</w:t>
+            </w:r>
+          </w:p>
+        </w:tc>
+        <w:tc>
+          <w:tcPr>
+            <w:tcW w:w="1451" w:type="dxa"/>
+          </w:tcPr>
+          <w:p>
+            <w:pPr>
+              <w:tabs>
+                <w:tab w:val="left" w:pos="3160"/>
+              </w:tabs>
+            </w:pPr>
+            <w:r>
+              <w:t>Participant / Organiser</w:t>
+            </w:r>
+          </w:p>
+        </w:tc>
+        <w:tc>
+          <w:tcPr>
+            <w:tcW w:w="1362" w:type="dxa"/>
+          </w:tcPr>
+          <w:p>
+            <w:pPr>
+              <w:tabs>
+                <w:tab w:val="left" w:pos="3160"/>
+              </w:tabs>
+            </w:pPr>
+            <w:r>
+              <w:t>Name, Email</w:t>
+            </w:r>
+          </w:p>
+        </w:tc>
+        <w:tc>
+          <w:tcPr>
+            <w:tcW w:w="1397" w:type="dxa"/>
+          </w:tcPr>
+          <w:p>
+            <w:pPr>
+              <w:tabs>
+                <w:tab w:val="left" w:pos="3160"/>
+              </w:tabs>
+            </w:pPr>
+            <w:r>
+              <w:t xml:space="preserve">Profile updated successfully </w:t>
+            </w:r>
+          </w:p>
+        </w:tc>
+      </w:tr>
+    </w:tbl>
+    <w:p>
+      <w:pPr>
+        <w:tabs>
+          <w:tab w:val="left" w:pos="3160"/>
+        </w:tabs>
+      </w:pPr>
+    </w:p>
+    <w:p>
+      <w:pPr>
+        <w:tabs>
+          <w:tab w:val="left" w:pos="3160"/>
+        </w:tabs>
+      </w:pPr>
+    </w:p>
+    <w:p>
+      <w:pPr>
+        <w:tabs>
+          <w:tab w:val="left" w:pos="3160"/>
+        </w:tabs>
+      </w:pPr>
+      <w:r>
+        <w:t xml:space="preserve">EVENTS </w:t>
+      </w:r>
+    </w:p>
+    <w:tbl>
+      <w:tblPr>
+        <w:tblStyle w:val="TableGrid"/>
+        <w:tblW w:w="0" w:type="auto"/>
+        <w:tblLook w:val="04A0" w:firstRow="1" w:lastRow="0" w:firstColumn="1" w:lastColumn="0" w:noHBand="0" w:noVBand="1"/>
+      </w:tblPr>
+      <w:tblGrid>
+        <w:gridCol w:w="969"/>
+        <w:gridCol w:w="1662"/>
+        <w:gridCol w:w="1337"/>
+        <w:gridCol w:w="2226"/>
+        <w:gridCol w:w="1401"/>
+        <w:gridCol w:w="1421"/>
+      </w:tblGrid>
+      <w:tr>
+        <w:tc>
+          <w:tcPr>
+            <w:tcW w:w="969" w:type="dxa"/>
+          </w:tcPr>
+          <w:p>
+            <w:pPr>
+              <w:tabs>
+                <w:tab w:val="left" w:pos="3160"/>
+              </w:tabs>
+            </w:pPr>
+            <w:r>
+              <w:t xml:space="preserve">HTTP method </w:t>
+            </w:r>
+          </w:p>
+        </w:tc>
+        <w:tc>
+          <w:tcPr>
+            <w:tcW w:w="1662" w:type="dxa"/>
+          </w:tcPr>
+          <w:p>
+            <w:pPr>
+              <w:tabs>
+                <w:tab w:val="left" w:pos="3160"/>
+              </w:tabs>
+            </w:pPr>
+            <w:r>
+              <w:t xml:space="preserve">Route </w:t>
+            </w:r>
+          </w:p>
+        </w:tc>
+        <w:tc>
+          <w:tcPr>
+            <w:tcW w:w="1337" w:type="dxa"/>
+          </w:tcPr>
+          <w:p>
+            <w:pPr>
+              <w:tabs>
+                <w:tab w:val="left" w:pos="3160"/>
+              </w:tabs>
+            </w:pPr>
+            <w:r>
+              <w:t xml:space="preserve">Description </w:t>
+            </w:r>
+          </w:p>
+        </w:tc>
+        <w:tc>
+          <w:tcPr>
+            <w:tcW w:w="2226" w:type="dxa"/>
+          </w:tcPr>
+          <w:p>
+            <w:pPr>
+              <w:tabs>
+                <w:tab w:val="left" w:pos="3160"/>
+              </w:tabs>
+            </w:pPr>
+            <w:r>
+              <w:t>Role required</w:t>
+            </w:r>
+          </w:p>
+        </w:tc>
+        <w:tc>
+          <w:tcPr>
+            <w:tcW w:w="1401" w:type="dxa"/>
+          </w:tcPr>
+          <w:p>
+            <w:pPr>
+              <w:tabs>
+                <w:tab w:val="left" w:pos="3160"/>
+              </w:tabs>
+            </w:pPr>
+            <w:r>
+              <w:t>Request body</w:t>
+            </w:r>
+          </w:p>
+        </w:tc>
+        <w:tc>
+          <w:tcPr>
+            <w:tcW w:w="1421" w:type="dxa"/>
+          </w:tcPr>
+          <w:p>
+            <w:pPr>
+              <w:tabs>
+                <w:tab w:val="left" w:pos="3160"/>
+              </w:tabs>
+            </w:pPr>
+            <w:r>
+              <w:t>Expected response</w:t>
+            </w:r>
+          </w:p>
+        </w:tc>
+      </w:tr>
+      <w:tr>
+        <w:tc>
+          <w:tcPr>
+            <w:tcW w:w="969" w:type="dxa"/>
+          </w:tcPr>
+          <w:p>
+            <w:pPr>
+              <w:tabs>
+                <w:tab w:val="left" w:pos="3160"/>
+              </w:tabs>
+            </w:pPr>
+            <w:r>
+              <w:t>GET</w:t>
+            </w:r>
+          </w:p>
+        </w:tc>
+        <w:tc>
+          <w:tcPr>
+            <w:tcW w:w="1662" w:type="dxa"/>
+          </w:tcPr>
+          <w:p>
+            <w:pPr>
+              <w:tabs>
+                <w:tab w:val="left" w:pos="3160"/>
+              </w:tabs>
+            </w:pPr>
+            <w:r>
+              <w:t>/</w:t>
+            </w:r>
+            <w:proofErr w:type="spellStart"/>
+            <w:r>
+              <w:t>api</w:t>
+            </w:r>
+            <w:proofErr w:type="spellEnd"/>
+            <w:r>
+              <w:t>/events</w:t>
+            </w:r>
+          </w:p>
+        </w:tc>
+        <w:tc>
+          <w:tcPr>
+            <w:tcW w:w="1337" w:type="dxa"/>
+          </w:tcPr>
+          <w:p>
+            <w:pPr>
+              <w:tabs>
+                <w:tab w:val="left" w:pos="3160"/>
+              </w:tabs>
+            </w:pPr>
+            <w:r>
+              <w:t xml:space="preserve">Retrieves a list of upcoming events </w:t>
+            </w:r>
+          </w:p>
+        </w:tc>
+        <w:tc>
+          <w:tcPr>
+            <w:tcW w:w="2226" w:type="dxa"/>
+          </w:tcPr>
+          <w:p>
+            <w:pPr>
+              <w:tabs>
+                <w:tab w:val="left" w:pos="3160"/>
+              </w:tabs>
+            </w:pPr>
+            <w:r>
+              <w:t xml:space="preserve">Participant /organiser </w:t>
+            </w:r>
+          </w:p>
+        </w:tc>
+        <w:tc>
+          <w:tcPr>
+            <w:tcW w:w="1401" w:type="dxa"/>
+          </w:tcPr>
+          <w:p>
+            <w:pPr>
+              <w:tabs>
+                <w:tab w:val="left" w:pos="3160"/>
+              </w:tabs>
+            </w:pPr>
+            <w:r>
+              <w:t xml:space="preserve">None </w:t>
+            </w:r>
+          </w:p>
+        </w:tc>
+        <w:tc>
+          <w:tcPr>
+            <w:tcW w:w="1421" w:type="dxa"/>
+          </w:tcPr>
+          <w:p>
+            <w:pPr>
+              <w:tabs>
+                <w:tab w:val="left" w:pos="3160"/>
+              </w:tabs>
+            </w:pPr>
+            <w:r>
+              <w:t xml:space="preserve">List of events returned </w:t>
+            </w:r>
+          </w:p>
+        </w:tc>
+      </w:tr>
+      <w:tr>
+        <w:tc>
+          <w:tcPr>
+            <w:tcW w:w="969" w:type="dxa"/>
+          </w:tcPr>
+          <w:p>
+            <w:pPr>
+              <w:tabs>
+                <w:tab w:val="left" w:pos="3160"/>
+              </w:tabs>
+            </w:pPr>
+            <w:r>
+              <w:t>GET</w:t>
+            </w:r>
+          </w:p>
+        </w:tc>
+        <w:tc>
+          <w:tcPr>
+            <w:tcW w:w="1662" w:type="dxa"/>
+          </w:tcPr>
+          <w:p>
+            <w:pPr>
+              <w:tabs>
+                <w:tab w:val="left" w:pos="3160"/>
+              </w:tabs>
+            </w:pPr>
+            <w:r>
+              <w:t>/</w:t>
+            </w:r>
+            <w:proofErr w:type="spellStart"/>
+            <w:proofErr w:type="gramStart"/>
+            <w:r>
+              <w:t>api</w:t>
+            </w:r>
+            <w:proofErr w:type="spellEnd"/>
+            <w:proofErr w:type="gramEnd"/>
+            <w:r>
+              <w:t>/events/{id}</w:t>
+            </w:r>
+          </w:p>
+        </w:tc>
+        <w:tc>
+          <w:tcPr>
+            <w:tcW w:w="1337" w:type="dxa"/>
+          </w:tcPr>
+          <w:p>
+            <w:pPr>
+              <w:tabs>
+                <w:tab w:val="left" w:pos="3160"/>
+              </w:tabs>
+            </w:pPr>
+            <w:r>
+              <w:t xml:space="preserve">Retrieves details of a specific event </w:t>
+            </w:r>
+          </w:p>
+        </w:tc>
+        <w:tc>
+          <w:tcPr>
+            <w:tcW w:w="2226" w:type="dxa"/>
+          </w:tcPr>
+          <w:p>
+            <w:pPr>
+              <w:tabs>
+                <w:tab w:val="left" w:pos="3160"/>
+              </w:tabs>
+            </w:pPr>
+            <w:r>
+              <w:t>Participant/organiser</w:t>
+            </w:r>
+          </w:p>
+        </w:tc>
+        <w:tc>
+          <w:tcPr>
+            <w:tcW w:w="1401" w:type="dxa"/>
+          </w:tcPr>
+          <w:p>
+            <w:pPr>
+              <w:tabs>
+                <w:tab w:val="left" w:pos="3160"/>
+              </w:tabs>
+            </w:pPr>
+            <w:r>
+              <w:t>none</w:t>
+            </w:r>
+          </w:p>
+        </w:tc>
+        <w:tc>
+          <w:tcPr>
+            <w:tcW w:w="1421" w:type="dxa"/>
+          </w:tcPr>
+          <w:p>
+            <w:pPr>
+              <w:tabs>
+                <w:tab w:val="left" w:pos="3160"/>
+              </w:tabs>
+            </w:pPr>
+            <w:r>
+              <w:t xml:space="preserve">Event details returned </w:t>
+            </w:r>
+          </w:p>
+        </w:tc>
+      </w:tr>
+      <w:tr>
+        <w:tc>
+          <w:tcPr>
+            <w:tcW w:w="969" w:type="dxa"/>
+          </w:tcPr>
+          <w:p>
+            <w:pPr>
+              <w:tabs>
+                <w:tab w:val="left" w:pos="3160"/>
+              </w:tabs>
+            </w:pPr>
+            <w:r>
+              <w:t>POST</w:t>
+            </w:r>
+          </w:p>
+        </w:tc>
+        <w:tc>
+          <w:tcPr>
+            <w:tcW w:w="1662" w:type="dxa"/>
+          </w:tcPr>
+          <w:p>
+            <w:pPr>
+              <w:tabs>
+                <w:tab w:val="left" w:pos="3160"/>
+              </w:tabs>
+            </w:pPr>
+            <w:r>
+              <w:t>/</w:t>
+            </w:r>
+            <w:proofErr w:type="spellStart"/>
+            <w:r>
+              <w:t>api</w:t>
+            </w:r>
+            <w:proofErr w:type="spellEnd"/>
+            <w:r>
+              <w:t>/events</w:t>
+            </w:r>
+          </w:p>
+        </w:tc>
+        <w:tc>
+          <w:tcPr>
+            <w:tcW w:w="1337" w:type="dxa"/>
+          </w:tcPr>
+          <w:p>
+            <w:pPr>
+              <w:tabs>
+                <w:tab w:val="left" w:pos="3160"/>
+              </w:tabs>
+            </w:pPr>
+            <w:r>
+              <w:t xml:space="preserve">Creates a new event </w:t>
+            </w:r>
+          </w:p>
+        </w:tc>
+        <w:tc>
+          <w:tcPr>
+            <w:tcW w:w="2226" w:type="dxa"/>
+          </w:tcPr>
+          <w:p>
+            <w:pPr>
+              <w:tabs>
+                <w:tab w:val="left" w:pos="3160"/>
+              </w:tabs>
+            </w:pPr>
+            <w:r>
+              <w:t>organiser</w:t>
+            </w:r>
+          </w:p>
+        </w:tc>
+        <w:tc>
+          <w:tcPr>
+            <w:tcW w:w="1401" w:type="dxa"/>
+          </w:tcPr>
+          <w:p>
+            <w:pPr>
+              <w:tabs>
+                <w:tab w:val="left" w:pos="3160"/>
+              </w:tabs>
+            </w:pPr>
+            <w:r>
+              <w:t xml:space="preserve">Name, Description, Date, Location, Distance, </w:t>
+            </w:r>
+            <w:proofErr w:type="spellStart"/>
+            <w:r>
+              <w:t>EventType</w:t>
+            </w:r>
+            <w:proofErr w:type="spellEnd"/>
+          </w:p>
+        </w:tc>
+        <w:tc>
+          <w:tcPr>
+            <w:tcW w:w="1421" w:type="dxa"/>
+          </w:tcPr>
+          <w:p>
+            <w:pPr>
+              <w:tabs>
+                <w:tab w:val="left" w:pos="3160"/>
+              </w:tabs>
+            </w:pPr>
+            <w:r>
+              <w:t xml:space="preserve">Event created successfully </w:t>
+            </w:r>
+          </w:p>
+        </w:tc>
+      </w:tr>
+      <w:tr>
+        <w:tc>
+          <w:tcPr>
+            <w:tcW w:w="969" w:type="dxa"/>
+          </w:tcPr>
+          <w:p>
+            <w:pPr>
+              <w:tabs>
+                <w:tab w:val="left" w:pos="3160"/>
+              </w:tabs>
+            </w:pPr>
+            <w:r>
+              <w:t>PUT</w:t>
+            </w:r>
+          </w:p>
+        </w:tc>
+        <w:tc>
+          <w:tcPr>
+            <w:tcW w:w="1662" w:type="dxa"/>
+          </w:tcPr>
+          <w:p>
+            <w:pPr>
+              <w:tabs>
+                <w:tab w:val="left" w:pos="3160"/>
+              </w:tabs>
+            </w:pPr>
+            <w:r>
+              <w:t>/</w:t>
+            </w:r>
+            <w:proofErr w:type="spellStart"/>
+            <w:proofErr w:type="gramStart"/>
+            <w:r>
+              <w:t>api</w:t>
+            </w:r>
+            <w:proofErr w:type="spellEnd"/>
+            <w:proofErr w:type="gramEnd"/>
+            <w:r>
+              <w:t>/events/{id}</w:t>
+            </w:r>
+          </w:p>
+        </w:tc>
+        <w:tc>
+          <w:tcPr>
+            <w:tcW w:w="1337" w:type="dxa"/>
+          </w:tcPr>
+          <w:p>
+            <w:pPr>
+              <w:tabs>
+                <w:tab w:val="left" w:pos="3160"/>
+              </w:tabs>
+            </w:pPr>
+            <w:r>
+              <w:t xml:space="preserve">Updates an existing event </w:t>
+            </w:r>
+          </w:p>
+        </w:tc>
+        <w:tc>
+          <w:tcPr>
+            <w:tcW w:w="2226" w:type="dxa"/>
+          </w:tcPr>
+          <w:p>
+            <w:pPr>
+              <w:tabs>
+                <w:tab w:val="left" w:pos="3160"/>
+              </w:tabs>
+            </w:pPr>
+            <w:r>
+              <w:t>organiser</w:t>
+            </w:r>
+          </w:p>
+        </w:tc>
+        <w:tc>
+          <w:tcPr>
+            <w:tcW w:w="1401" w:type="dxa"/>
+          </w:tcPr>
+          <w:p>
+            <w:pPr>
+              <w:tabs>
+                <w:tab w:val="left" w:pos="3160"/>
+              </w:tabs>
+            </w:pPr>
+            <w:r>
+              <w:t xml:space="preserve">Name, Description, Date, Location, Distance, </w:t>
+            </w:r>
+            <w:proofErr w:type="spellStart"/>
+            <w:r>
+              <w:t>EventType</w:t>
+            </w:r>
+            <w:proofErr w:type="spellEnd"/>
+          </w:p>
+        </w:tc>
+        <w:tc>
+          <w:tcPr>
+            <w:tcW w:w="1421" w:type="dxa"/>
+          </w:tcPr>
+          <w:p>
+            <w:pPr>
+              <w:tabs>
+                <w:tab w:val="left" w:pos="3160"/>
+              </w:tabs>
+            </w:pPr>
+            <w:r>
+              <w:t xml:space="preserve">Event updated successfully </w:t>
+            </w:r>
+          </w:p>
+        </w:tc>
+      </w:tr>
+      <w:tr>
+        <w:tc>
+          <w:tcPr>
+            <w:tcW w:w="969" w:type="dxa"/>
+          </w:tcPr>
+          <w:p>
+            <w:pPr>
+              <w:tabs>
+                <w:tab w:val="left" w:pos="3160"/>
+              </w:tabs>
+            </w:pPr>
+            <w:r>
+              <w:t>DELETE</w:t>
+            </w:r>
+          </w:p>
+        </w:tc>
+        <w:tc>
+          <w:tcPr>
+            <w:tcW w:w="1662" w:type="dxa"/>
+          </w:tcPr>
+          <w:p>
+            <w:pPr>
+              <w:tabs>
+                <w:tab w:val="left" w:pos="3160"/>
+              </w:tabs>
+            </w:pPr>
+            <w:r>
+              <w:t>/</w:t>
+            </w:r>
+            <w:proofErr w:type="spellStart"/>
+            <w:proofErr w:type="gramStart"/>
+            <w:r>
+              <w:t>api</w:t>
+            </w:r>
+            <w:proofErr w:type="spellEnd"/>
+            <w:proofErr w:type="gramEnd"/>
+            <w:r>
+              <w:t>/events/{id}</w:t>
+            </w:r>
+          </w:p>
+        </w:tc>
+        <w:tc>
+          <w:tcPr>
+            <w:tcW w:w="1337" w:type="dxa"/>
+          </w:tcPr>
+          <w:p>
+            <w:pPr>
+              <w:tabs>
+                <w:tab w:val="left" w:pos="3160"/>
+              </w:tabs>
+            </w:pPr>
+            <w:r>
+              <w:t xml:space="preserve">Deletes an existing event </w:t>
+            </w:r>
+          </w:p>
+        </w:tc>
+        <w:tc>
+          <w:tcPr>
+            <w:tcW w:w="2226" w:type="dxa"/>
+          </w:tcPr>
+          <w:p>
+            <w:pPr>
+              <w:tabs>
+                <w:tab w:val="left" w:pos="3160"/>
+              </w:tabs>
+            </w:pPr>
+            <w:r>
+              <w:t>organiser</w:t>
+            </w:r>
+          </w:p>
+        </w:tc>
+        <w:tc>
+          <w:tcPr>
+            <w:tcW w:w="1401" w:type="dxa"/>
+          </w:tcPr>
+          <w:p>
+            <w:pPr>
+              <w:tabs>
+                <w:tab w:val="left" w:pos="3160"/>
+              </w:tabs>
+            </w:pPr>
+            <w:r>
+              <w:t>None</w:t>
+            </w:r>
+          </w:p>
+        </w:tc>
+        <w:tc>
+          <w:tcPr>
+            <w:tcW w:w="1421" w:type="dxa"/>
+          </w:tcPr>
+          <w:p>
+            <w:pPr>
+              <w:tabs>
+                <w:tab w:val="left" w:pos="3160"/>
+              </w:tabs>
+            </w:pPr>
+            <w:r>
+              <w:t xml:space="preserve">Event deleted successfully </w:t>
+            </w:r>
+          </w:p>
+        </w:tc>
+      </w:tr>
+    </w:tbl>
+    <w:p>
+      <w:pPr>
+        <w:tabs>
+          <w:tab w:val="left" w:pos="3160"/>
+        </w:tabs>
+      </w:pPr>
+    </w:p>
+    <w:p>
+      <w:pPr>
+        <w:tabs>
+          <w:tab w:val="left" w:pos="3160"/>
+        </w:tabs>
+      </w:pPr>
+    </w:p>
+    <w:p>
+      <w:pPr>
+        <w:tabs>
+          <w:tab w:val="left" w:pos="3160"/>
+        </w:tabs>
+      </w:pPr>
+      <w:r>
+        <w:t xml:space="preserve">EVENT ENROLMENTS </w:t>
+      </w:r>
+    </w:p>
+    <w:tbl>
+      <w:tblPr>
+        <w:tblStyle w:val="TableGrid"/>
+        <w:tblW w:w="0" w:type="auto"/>
+        <w:tblLook w:val="04A0" w:firstRow="1" w:lastRow="0" w:firstColumn="1" w:lastColumn="0" w:noHBand="0" w:noVBand="1"/>
+      </w:tblPr>
+      <w:tblGrid>
+        <w:gridCol w:w="929"/>
+        <w:gridCol w:w="3198"/>
+        <w:gridCol w:w="1315"/>
+        <w:gridCol w:w="1214"/>
+        <w:gridCol w:w="1003"/>
+        <w:gridCol w:w="1357"/>
+      </w:tblGrid>
+      <w:tr>
+        <w:tc>
+          <w:tcPr>
+            <w:tcW w:w="930" w:type="dxa"/>
+          </w:tcPr>
+          <w:p>
+            <w:pPr>
+              <w:tabs>
+                <w:tab w:val="left" w:pos="3160"/>
+              </w:tabs>
+            </w:pPr>
+            <w:r>
+              <w:t>HTTP method</w:t>
+            </w:r>
+          </w:p>
+        </w:tc>
+        <w:tc>
+          <w:tcPr>
+            <w:tcW w:w="3199" w:type="dxa"/>
+          </w:tcPr>
+          <w:p>
+            <w:pPr>
+              <w:tabs>
+                <w:tab w:val="left" w:pos="3160"/>
+              </w:tabs>
+            </w:pPr>
+            <w:r>
+              <w:t>Route</w:t>
+            </w:r>
+          </w:p>
+        </w:tc>
+        <w:tc>
+          <w:tcPr>
+            <w:tcW w:w="1316" w:type="dxa"/>
+          </w:tcPr>
+          <w:p>
+            <w:pPr>
+              <w:tabs>
+                <w:tab w:val="left" w:pos="3160"/>
+              </w:tabs>
+            </w:pPr>
+            <w:r>
+              <w:t>description</w:t>
+            </w:r>
+          </w:p>
+        </w:tc>
+        <w:tc>
+          <w:tcPr>
+            <w:tcW w:w="1211" w:type="dxa"/>
+          </w:tcPr>
+          <w:p>
+            <w:pPr>
+              <w:tabs>
+                <w:tab w:val="left" w:pos="3160"/>
+              </w:tabs>
+            </w:pPr>
+            <w:r>
+              <w:t xml:space="preserve">Role required </w:t>
+            </w:r>
+          </w:p>
+        </w:tc>
+        <w:tc>
+          <w:tcPr>
+            <w:tcW w:w="1003" w:type="dxa"/>
+          </w:tcPr>
+          <w:p>
+            <w:pPr>
+              <w:tabs>
+                <w:tab w:val="left" w:pos="3160"/>
+              </w:tabs>
+            </w:pPr>
+            <w:r>
+              <w:t>Request body</w:t>
+            </w:r>
+          </w:p>
+        </w:tc>
+        <w:tc>
+          <w:tcPr>
+            <w:tcW w:w="1357" w:type="dxa"/>
+          </w:tcPr>
+          <w:p>
+            <w:pPr>
+              <w:tabs>
+                <w:tab w:val="left" w:pos="3160"/>
+              </w:tabs>
+            </w:pPr>
+            <w:r>
+              <w:t xml:space="preserve">Expected response </w:t>
+            </w:r>
+          </w:p>
+        </w:tc>
+      </w:tr>
+      <w:tr>
+        <w:tc>
+          <w:tcPr>
+            <w:tcW w:w="930" w:type="dxa"/>
+          </w:tcPr>
+          <w:p>
+            <w:pPr>
+              <w:tabs>
+                <w:tab w:val="left" w:pos="3160"/>
+              </w:tabs>
+            </w:pPr>
+            <w:r>
+              <w:lastRenderedPageBreak/>
+              <w:t>POST</w:t>
+            </w:r>
+          </w:p>
+        </w:tc>
+        <w:tc>
+          <w:tcPr>
+            <w:tcW w:w="3199" w:type="dxa"/>
+          </w:tcPr>
+          <w:p>
+            <w:pPr>
+              <w:tabs>
+                <w:tab w:val="left" w:pos="3160"/>
+              </w:tabs>
+            </w:pPr>
+            <w:r>
+              <w:t>/</w:t>
+            </w:r>
+            <w:proofErr w:type="spellStart"/>
+            <w:proofErr w:type="gramStart"/>
+            <w:r>
+              <w:t>api</w:t>
+            </w:r>
+            <w:proofErr w:type="spellEnd"/>
+            <w:proofErr w:type="gramEnd"/>
+            <w:r>
+              <w:t>/events/{</w:t>
+            </w:r>
+            <w:proofErr w:type="spellStart"/>
+            <w:r>
+              <w:t>eventId</w:t>
+            </w:r>
+            <w:proofErr w:type="spellEnd"/>
+            <w:r>
+              <w:t>}/enrolments</w:t>
+            </w:r>
+          </w:p>
+        </w:tc>
+        <w:tc>
+          <w:tcPr>
+            <w:tcW w:w="1316" w:type="dxa"/>
+          </w:tcPr>
+          <w:p>
+            <w:pPr>
+              <w:tabs>
+                <w:tab w:val="left" w:pos="3160"/>
+              </w:tabs>
+            </w:pPr>
+            <w:r>
+              <w:t>Allows a participant to enter an event and select a category</w:t>
+            </w:r>
+          </w:p>
+        </w:tc>
+        <w:tc>
+          <w:tcPr>
+            <w:tcW w:w="1211" w:type="dxa"/>
+          </w:tcPr>
+          <w:p>
+            <w:pPr>
+              <w:tabs>
+                <w:tab w:val="left" w:pos="3160"/>
+              </w:tabs>
+            </w:pPr>
+            <w:r>
+              <w:t>Participant</w:t>
+            </w:r>
+          </w:p>
+        </w:tc>
+        <w:tc>
+          <w:tcPr>
+            <w:tcW w:w="1003" w:type="dxa"/>
+          </w:tcPr>
+          <w:p>
+            <w:pPr>
+              <w:tabs>
+                <w:tab w:val="left" w:pos="3160"/>
+              </w:tabs>
+            </w:pPr>
+            <w:r>
+              <w:t>category</w:t>
+            </w:r>
+          </w:p>
+        </w:tc>
+        <w:tc>
+          <w:tcPr>
+            <w:tcW w:w="1357" w:type="dxa"/>
+          </w:tcPr>
+          <w:p>
+            <w:pPr>
+              <w:tabs>
+                <w:tab w:val="left" w:pos="3160"/>
+              </w:tabs>
+            </w:pPr>
+            <w:r>
+              <w:t xml:space="preserve">Enrolment created successfully </w:t>
+            </w:r>
+          </w:p>
+        </w:tc>
+      </w:tr>
+      <w:tr>
+        <w:tc>
+          <w:tcPr>
+            <w:tcW w:w="930" w:type="dxa"/>
+          </w:tcPr>
+          <w:p>
+            <w:pPr>
+              <w:tabs>
+                <w:tab w:val="left" w:pos="3160"/>
+              </w:tabs>
+            </w:pPr>
+            <w:r>
+              <w:t>GET</w:t>
+            </w:r>
+          </w:p>
+        </w:tc>
+        <w:tc>
+          <w:tcPr>
+            <w:tcW w:w="3199" w:type="dxa"/>
+          </w:tcPr>
+          <w:p>
+            <w:pPr>
+              <w:tabs>
+                <w:tab w:val="left" w:pos="3160"/>
+              </w:tabs>
+            </w:pPr>
+            <w:r>
+              <w:t>/</w:t>
+            </w:r>
+            <w:proofErr w:type="spellStart"/>
+            <w:proofErr w:type="gramStart"/>
+            <w:r>
+              <w:t>api</w:t>
+            </w:r>
+            <w:proofErr w:type="spellEnd"/>
+            <w:proofErr w:type="gramEnd"/>
+            <w:r>
+              <w:t>/events/{</w:t>
+            </w:r>
+            <w:proofErr w:type="spellStart"/>
+            <w:r>
+              <w:t>eventId</w:t>
+            </w:r>
+            <w:proofErr w:type="spellEnd"/>
+            <w:r>
+              <w:t>}/enrolments</w:t>
+            </w:r>
+          </w:p>
+        </w:tc>
+        <w:tc>
+          <w:tcPr>
+            <w:tcW w:w="1316" w:type="dxa"/>
+          </w:tcPr>
+          <w:p>
+            <w:pPr>
+              <w:tabs>
+                <w:tab w:val="left" w:pos="3160"/>
+              </w:tabs>
+            </w:pPr>
+            <w:r>
+              <w:t xml:space="preserve">Allows an organiser to view participants </w:t>
+            </w:r>
+            <w:r>
+              <w:t>enrolled in their event</w:t>
+            </w:r>
+          </w:p>
+        </w:tc>
+        <w:tc>
+          <w:tcPr>
+            <w:tcW w:w="1211" w:type="dxa"/>
+          </w:tcPr>
+          <w:p>
+            <w:pPr>
+              <w:tabs>
+                <w:tab w:val="left" w:pos="3160"/>
+              </w:tabs>
+            </w:pPr>
+            <w:r>
+              <w:t>organiser</w:t>
+            </w:r>
+          </w:p>
+        </w:tc>
+        <w:tc>
+          <w:tcPr>
+            <w:tcW w:w="1003" w:type="dxa"/>
+          </w:tcPr>
+          <w:p>
+            <w:pPr>
+              <w:tabs>
+                <w:tab w:val="left" w:pos="3160"/>
+              </w:tabs>
+            </w:pPr>
+            <w:r>
+              <w:t>None</w:t>
+            </w:r>
+          </w:p>
+        </w:tc>
+        <w:tc>
+          <w:tcPr>
+            <w:tcW w:w="1357" w:type="dxa"/>
+          </w:tcPr>
+          <w:p>
+            <w:pPr>
+              <w:tabs>
+                <w:tab w:val="left" w:pos="3160"/>
+              </w:tabs>
+            </w:pPr>
+            <w:r>
+              <w:t xml:space="preserve">List of enrolments returned </w:t>
+            </w:r>
+          </w:p>
+        </w:tc>
+      </w:tr>
+      <w:tr>
+        <w:tc>
+          <w:tcPr>
+            <w:tcW w:w="930" w:type="dxa"/>
+          </w:tcPr>
+          <w:p>
+            <w:pPr>
+              <w:tabs>
+                <w:tab w:val="left" w:pos="3160"/>
+              </w:tabs>
+            </w:pPr>
+            <w:r>
+              <w:t>GET</w:t>
+            </w:r>
+          </w:p>
+        </w:tc>
+        <w:tc>
+          <w:tcPr>
+            <w:tcW w:w="3199" w:type="dxa"/>
+          </w:tcPr>
+          <w:p>
+            <w:pPr>
+              <w:tabs>
+                <w:tab w:val="left" w:pos="3160"/>
+              </w:tabs>
+            </w:pPr>
+            <w:r>
+              <w:t>/</w:t>
+            </w:r>
+            <w:proofErr w:type="spellStart"/>
+            <w:r>
+              <w:t>api</w:t>
+            </w:r>
+            <w:proofErr w:type="spellEnd"/>
+            <w:r>
+              <w:t>/users/profile/enrolments</w:t>
+            </w:r>
+          </w:p>
+        </w:tc>
+        <w:tc>
+          <w:tcPr>
+            <w:tcW w:w="1316" w:type="dxa"/>
+          </w:tcPr>
+          <w:p>
+            <w:pPr>
+              <w:tabs>
+                <w:tab w:val="left" w:pos="3160"/>
+              </w:tabs>
+            </w:pPr>
+            <w:r>
+              <w:t xml:space="preserve">Allows a participant to view their own </w:t>
+            </w:r>
+            <w:r>
+              <w:t>event enrolments</w:t>
+            </w:r>
+          </w:p>
+        </w:tc>
+        <w:tc>
+          <w:tcPr>
+            <w:tcW w:w="1211" w:type="dxa"/>
+          </w:tcPr>
+          <w:p>
+            <w:pPr>
+              <w:tabs>
+                <w:tab w:val="left" w:pos="3160"/>
+              </w:tabs>
+            </w:pPr>
+            <w:r>
+              <w:t>participant</w:t>
+            </w:r>
+          </w:p>
+        </w:tc>
+        <w:tc>
+          <w:tcPr>
+            <w:tcW w:w="1003" w:type="dxa"/>
+          </w:tcPr>
+          <w:p>
+            <w:pPr>
+              <w:tabs>
+                <w:tab w:val="left" w:pos="3160"/>
+              </w:tabs>
+            </w:pPr>
+            <w:r>
+              <w:t xml:space="preserve">None </w:t>
+            </w:r>
+          </w:p>
+        </w:tc>
+        <w:tc>
+          <w:tcPr>
+            <w:tcW w:w="1357" w:type="dxa"/>
+          </w:tcPr>
+          <w:p>
+            <w:pPr>
+              <w:tabs>
+                <w:tab w:val="left" w:pos="3160"/>
+              </w:tabs>
+            </w:pPr>
+            <w:r>
+              <w:t xml:space="preserve">Participant’s enrolments returned </w:t>
+            </w:r>
+          </w:p>
+        </w:tc>
+      </w:tr>
+    </w:tbl>
+    <w:p>
+      <w:pPr>
+        <w:tabs>
+          <w:tab w:val="left" w:pos="3160"/>
+        </w:tabs>
+      </w:pPr>
+    </w:p>
+    <w:p>
+      <w:pPr>
+        <w:tabs>
+          <w:tab w:val="left" w:pos="3160"/>
+        </w:tabs>
+      </w:pPr>
+    </w:p>
+    <w:p>
+      <w:pPr>
+        <w:tabs>
+          <w:tab w:val="left" w:pos="3160"/>
+        </w:tabs>
+      </w:pPr>
+      <w:r>
+        <w:t xml:space="preserve">RESULTS </w:t>
+      </w:r>
+    </w:p>
+    <w:tbl>
+      <w:tblPr>
+        <w:tblStyle w:val="TableGrid"/>
+        <w:tblW w:w="0" w:type="auto"/>
+        <w:tblLook w:val="04A0" w:firstRow="1" w:lastRow="0" w:firstColumn="1" w:lastColumn="0" w:noHBand="0" w:noVBand="1"/>
+      </w:tblPr>
+      <w:tblGrid>
+        <w:gridCol w:w="893"/>
+        <w:gridCol w:w="2648"/>
+        <w:gridCol w:w="1336"/>
+        <w:gridCol w:w="1158"/>
+        <w:gridCol w:w="1685"/>
+        <w:gridCol w:w="1296"/>
+      </w:tblGrid>
+      <w:tr>
+        <w:tc>
+          <w:tcPr>
+            <w:tcW w:w="907" w:type="dxa"/>
+          </w:tcPr>
+          <w:p>
+            <w:pPr>
+              <w:tabs>
+                <w:tab w:val="left" w:pos="3160"/>
+              </w:tabs>
+            </w:pPr>
+            <w:r>
+              <w:t>HTTP method</w:t>
+            </w:r>
+          </w:p>
+        </w:tc>
+        <w:tc>
+          <w:tcPr>
+            <w:tcW w:w="2705" w:type="dxa"/>
+          </w:tcPr>
+          <w:p>
+            <w:pPr>
+              <w:tabs>
+                <w:tab w:val="left" w:pos="3160"/>
+              </w:tabs>
+            </w:pPr>
+            <w:r>
+              <w:t xml:space="preserve">Route </w:t>
+            </w:r>
+          </w:p>
+        </w:tc>
+        <w:tc>
+          <w:tcPr>
+            <w:tcW w:w="1324" w:type="dxa"/>
+          </w:tcPr>
+          <w:p>
+            <w:pPr>
+              <w:tabs>
+                <w:tab w:val="left" w:pos="3160"/>
+              </w:tabs>
+            </w:pPr>
+            <w:r>
+              <w:t>Description</w:t>
+            </w:r>
+          </w:p>
+        </w:tc>
+        <w:tc>
+          <w:tcPr>
+            <w:tcW w:w="1039" w:type="dxa"/>
+          </w:tcPr>
+          <w:p>
+            <w:pPr>
+              <w:tabs>
+                <w:tab w:val="left" w:pos="3160"/>
+              </w:tabs>
+            </w:pPr>
+            <w:r>
+              <w:t xml:space="preserve">Role required </w:t>
+            </w:r>
+          </w:p>
+        </w:tc>
+        <w:tc>
+          <w:tcPr>
+            <w:tcW w:w="1719" w:type="dxa"/>
+          </w:tcPr>
+          <w:p>
+            <w:pPr>
+              <w:tabs>
+                <w:tab w:val="left" w:pos="3160"/>
+              </w:tabs>
+            </w:pPr>
+            <w:r>
+              <w:t>Request body</w:t>
+            </w:r>
+          </w:p>
+        </w:tc>
+        <w:tc>
+          <w:tcPr>
+            <w:tcW w:w="1322" w:type="dxa"/>
+          </w:tcPr>
+          <w:p>
+            <w:pPr>
+              <w:tabs>
+                <w:tab w:val="left" w:pos="3160"/>
+              </w:tabs>
+            </w:pPr>
+            <w:r>
+              <w:t xml:space="preserve">Expected response </w:t>
+            </w:r>
+          </w:p>
+        </w:tc>
+      </w:tr>
+      <w:tr>
+        <w:tc>
+          <w:tcPr>
+            <w:tcW w:w="907" w:type="dxa"/>
+          </w:tcPr>
+          <w:p>
+            <w:pPr>
+              <w:tabs>
+                <w:tab w:val="left" w:pos="3160"/>
+              </w:tabs>
+            </w:pPr>
+            <w:r>
+              <w:t>POST</w:t>
+            </w:r>
+          </w:p>
+        </w:tc>
+        <w:tc>
+          <w:tcPr>
+            <w:tcW w:w="2705" w:type="dxa"/>
+          </w:tcPr>
+          <w:p>
+            <w:pPr>
+              <w:tabs>
+                <w:tab w:val="left" w:pos="3160"/>
+              </w:tabs>
+            </w:pPr>
+            <w:r>
+              <w:t>/</w:t>
+            </w:r>
+            <w:proofErr w:type="spellStart"/>
+            <w:proofErr w:type="gramStart"/>
+            <w:r>
+              <w:t>api</w:t>
+            </w:r>
+            <w:proofErr w:type="spellEnd"/>
+            <w:proofErr w:type="gramEnd"/>
+            <w:r>
+              <w:t>/events/{</w:t>
+            </w:r>
+            <w:proofErr w:type="spellStart"/>
+            <w:r>
+              <w:t>eventId</w:t>
+            </w:r>
+            <w:proofErr w:type="spellEnd"/>
+            <w:r>
+              <w:t>}/results</w:t>
+            </w:r>
+          </w:p>
+        </w:tc>
+        <w:tc>
+          <w:tcPr>
+            <w:tcW w:w="1324" w:type="dxa"/>
+          </w:tcPr>
+          <w:p>
+            <w:pPr>
+              <w:tabs>
+                <w:tab w:val="left" w:pos="3160"/>
+              </w:tabs>
+            </w:pPr>
+            <w:r>
+              <w:t>Records a participant’s finish time and finishing position</w:t>
+            </w:r>
+          </w:p>
+        </w:tc>
+        <w:tc>
+          <w:tcPr>
+            <w:tcW w:w="1039" w:type="dxa"/>
+          </w:tcPr>
+          <w:p>
+            <w:pPr>
+              <w:tabs>
+                <w:tab w:val="left" w:pos="3160"/>
+              </w:tabs>
+            </w:pPr>
+            <w:r>
+              <w:t>organiser</w:t>
+            </w:r>
+          </w:p>
+        </w:tc>
+        <w:tc>
+          <w:tcPr>
+            <w:tcW w:w="1719" w:type="dxa"/>
+          </w:tcPr>
+          <w:p>
+            <w:pPr>
+              <w:tabs>
+                <w:tab w:val="left" w:pos="3160"/>
+              </w:tabs>
+            </w:pPr>
+            <w:proofErr w:type="spellStart"/>
+            <w:r>
+              <w:t>ParticipantID</w:t>
+            </w:r>
+            <w:proofErr w:type="spellEnd"/>
+            <w:r>
+              <w:t xml:space="preserve">, </w:t>
+            </w:r>
+            <w:proofErr w:type="spellStart"/>
+            <w:r>
+              <w:t>FinishTime</w:t>
+            </w:r>
+            <w:proofErr w:type="spellEnd"/>
+            <w:r>
+              <w:t xml:space="preserve">, </w:t>
+            </w:r>
+            <w:proofErr w:type="spellStart"/>
+            <w:r>
+              <w:t>FinishingPosition</w:t>
+            </w:r>
+            <w:proofErr w:type="spellEnd"/>
+          </w:p>
+        </w:tc>
+        <w:tc>
+          <w:tcPr>
+            <w:tcW w:w="1322" w:type="dxa"/>
+          </w:tcPr>
+          <w:p>
+            <w:pPr>
+              <w:tabs>
+                <w:tab w:val="left" w:pos="3160"/>
+              </w:tabs>
+            </w:pPr>
+            <w:r>
+              <w:t xml:space="preserve">Result recorded successfully </w:t>
+            </w:r>
+          </w:p>
+        </w:tc>
+      </w:tr>
+      <w:tr>
+        <w:tc>
+          <w:tcPr>
+            <w:tcW w:w="907" w:type="dxa"/>
+          </w:tcPr>
+          <w:p>
+            <w:pPr>
+              <w:tabs>
+                <w:tab w:val="left" w:pos="3160"/>
+              </w:tabs>
+            </w:pPr>
+            <w:r>
+              <w:t>GET</w:t>
+            </w:r>
+          </w:p>
+        </w:tc>
+        <w:tc>
+          <w:tcPr>
+            <w:tcW w:w="2705" w:type="dxa"/>
+          </w:tcPr>
+          <w:p>
+            <w:pPr>
+              <w:tabs>
+                <w:tab w:val="left" w:pos="3160"/>
+              </w:tabs>
+            </w:pPr>
+            <w:r>
+              <w:t>/</w:t>
+            </w:r>
+            <w:proofErr w:type="spellStart"/>
+            <w:proofErr w:type="gramStart"/>
+            <w:r>
+              <w:t>api</w:t>
+            </w:r>
+            <w:proofErr w:type="spellEnd"/>
+            <w:proofErr w:type="gramEnd"/>
+            <w:r>
+              <w:t>/events/{</w:t>
+            </w:r>
+            <w:proofErr w:type="spellStart"/>
+            <w:r>
+              <w:t>eventId</w:t>
+            </w:r>
+            <w:proofErr w:type="spellEnd"/>
+            <w:r>
+              <w:t>}/results</w:t>
+            </w:r>
+          </w:p>
+        </w:tc>
+        <w:tc>
+          <w:tcPr>
+            <w:tcW w:w="1324" w:type="dxa"/>
+          </w:tcPr>
+          <w:p>
+            <w:pPr>
+              <w:tabs>
+                <w:tab w:val="left" w:pos="3160"/>
+              </w:tabs>
+            </w:pPr>
+            <w:r>
+              <w:t>Allows an organiser to view results for their event.</w:t>
+            </w:r>
+          </w:p>
+        </w:tc>
+        <w:tc>
+          <w:tcPr>
+            <w:tcW w:w="1039" w:type="dxa"/>
+          </w:tcPr>
+          <w:p>
+            <w:pPr>
+              <w:tabs>
+                <w:tab w:val="left" w:pos="3160"/>
+              </w:tabs>
+            </w:pPr>
+            <w:r>
+              <w:t>organiser</w:t>
+            </w:r>
+          </w:p>
+        </w:tc>
+        <w:tc>
+          <w:tcPr>
+            <w:tcW w:w="1719" w:type="dxa"/>
+          </w:tcPr>
+          <w:p>
+            <w:pPr>
+              <w:tabs>
+                <w:tab w:val="left" w:pos="3160"/>
+              </w:tabs>
+            </w:pPr>
+            <w:r>
+              <w:t>None</w:t>
+            </w:r>
+          </w:p>
+        </w:tc>
+        <w:tc>
+          <w:tcPr>
+            <w:tcW w:w="1322" w:type="dxa"/>
+          </w:tcPr>
+          <w:p>
+            <w:pPr>
+              <w:tabs>
+                <w:tab w:val="left" w:pos="3160"/>
+              </w:tabs>
+            </w:pPr>
+            <w:r>
+              <w:t xml:space="preserve">Event results returned </w:t>
+            </w:r>
+          </w:p>
+        </w:tc>
+      </w:tr>
+      <w:tr>
+        <w:tc>
+          <w:tcPr>
+            <w:tcW w:w="907" w:type="dxa"/>
+          </w:tcPr>
+          <w:p>
+            <w:pPr>
+              <w:tabs>
+                <w:tab w:val="left" w:pos="3160"/>
+              </w:tabs>
+            </w:pPr>
+            <w:r>
+              <w:t>GET</w:t>
+            </w:r>
+          </w:p>
+        </w:tc>
+        <w:tc>
+          <w:tcPr>
+            <w:tcW w:w="2705" w:type="dxa"/>
+          </w:tcPr>
+          <w:p>
+            <w:pPr>
+              <w:tabs>
+                <w:tab w:val="left" w:pos="3160"/>
+              </w:tabs>
+            </w:pPr>
+            <w:r>
+              <w:t>/</w:t>
+            </w:r>
+            <w:proofErr w:type="spellStart"/>
+            <w:r>
+              <w:t>api</w:t>
+            </w:r>
+            <w:proofErr w:type="spellEnd"/>
+            <w:r>
+              <w:t>/users/profile/results</w:t>
+            </w:r>
+          </w:p>
+        </w:tc>
+        <w:tc>
+          <w:tcPr>
+            <w:tcW w:w="1324" w:type="dxa"/>
+          </w:tcPr>
+          <w:p>
+            <w:pPr>
+              <w:tabs>
+                <w:tab w:val="left" w:pos="3160"/>
+              </w:tabs>
+            </w:pPr>
+            <w:r>
+              <w:t xml:space="preserve">Allows a participant to view their own results and </w:t>
+            </w:r>
+            <w:r>
+              <w:lastRenderedPageBreak/>
+              <w:t>performance history.</w:t>
+            </w:r>
+          </w:p>
+        </w:tc>
+        <w:tc>
+          <w:tcPr>
+            <w:tcW w:w="1039" w:type="dxa"/>
+          </w:tcPr>
+          <w:p>
+            <w:pPr>
+              <w:tabs>
+                <w:tab w:val="left" w:pos="3160"/>
+              </w:tabs>
+            </w:pPr>
+            <w:r>
+              <w:lastRenderedPageBreak/>
+              <w:t>Participant</w:t>
+            </w:r>
+          </w:p>
+        </w:tc>
+        <w:tc>
+          <w:tcPr>
+            <w:tcW w:w="1719" w:type="dxa"/>
+          </w:tcPr>
+          <w:p>
+            <w:pPr>
+              <w:tabs>
+                <w:tab w:val="left" w:pos="3160"/>
+              </w:tabs>
+            </w:pPr>
+            <w:r>
+              <w:t>none</w:t>
+            </w:r>
+          </w:p>
+        </w:tc>
+        <w:tc>
+          <w:tcPr>
+            <w:tcW w:w="1322" w:type="dxa"/>
+          </w:tcPr>
+          <w:p>
+            <w:pPr>
+              <w:tabs>
+                <w:tab w:val="left" w:pos="3160"/>
+              </w:tabs>
+            </w:pPr>
+            <w:r>
+              <w:t xml:space="preserve">Participant results retuned </w:t>
+            </w:r>
+          </w:p>
+        </w:tc>
+      </w:tr>
+    </w:tbl>
+    <w:p>
+      <w:pPr>
+        <w:tabs>
+          <w:tab w:val="left" w:pos="3160"/>
+        </w:tabs>
+      </w:pPr>
     </w:p>
     <w:sectPr>
       <w:pgSz w:w="11906" w:h="16838"/>
@@ -1939,6 +4283,10 @@
     </w:p>
   </w:footnote>
 </w:footnotes>
+</file>
+
+<file path=word/numbering.xml><?xml version="1.0" encoding="utf-8"?>
+<w:numbering xmlns:wpc="http://schemas.microsoft.com/office/word/2010/wordprocessingCanvas" xmlns:cx="http://schemas.microsoft.com/office/drawing/2014/chartex" xmlns:cx1="http://schemas.microsoft.com/office/drawing/2015/9/8/chartex" xmlns:cx2="http://schemas.microsoft.com/office/drawing/2015/10/21/chartex" xmlns:cx3="http://schemas.microsoft.com/office/drawing/2016/5/9/chartex" xmlns:cx4="http://schemas.microsoft.com/office/drawing/2016/5/10/chartex" xmlns:cx5="http://schemas.microsoft.com/office/drawing/2016/5/11/chartex" xmlns:cx6="http://schemas.microsoft.com/office/drawing/2016/5/12/chartex" xmlns:cx7="http://schemas.microsoft.com/office/drawing/2016/5/13/chartex" xmlns:cx8="http://schemas.microsoft.com/office/drawing/2016/5/14/chartex" xmlns:mc="http://schemas.openxmlformats.org/markup-compatibility/2006" xmlns:aink="http://schemas.microsoft.com/office/drawing/2016/ink" xmlns:am3d="http://schemas.microsoft.com/office/drawing/2017/model3d" xmlns:o="urn:schemas-microsoft-com:office:office" xmlns:oel="http://schemas.microsoft.com/office/2019/extlst" xmlns:r="http://schemas.openxmlformats.org/officeDocument/2006/relationships" xmlns:m="http://schemas.openxmlformats.org/officeDocument/2006/math" xmlns:v="urn:schemas-microsoft-com:vml" xmlns:wp14="http://schemas.microsoft.com/office/word/2010/wordprocessingDrawing" xmlns:wp="http://schemas.openxmlformats.org/drawingml/2006/wordprocessingDrawing" xmlns:w10="urn:schemas-microsoft-com:office:word" xmlns:w="http://schemas.openxmlformats.org/wordprocessingml/2006/main" xmlns:w14="http://schemas.microsoft.com/office/word/2010/wordml" xmlns:w15="http://schemas.microsoft.com/office/word/2012/wordml" xmlns:w16cex="http://schemas.microsoft.com/office/word/2018/wordml/cex" xmlns:w16cid="http://schemas.microsoft.com/office/word/2016/wordml/cid" xmlns:w16="http://schemas.microsoft.com/office/word/2018/wordml" xmlns:w16du="http://schemas.microsoft.com/office/word/2023/wordml/word16du" xmlns:w16sdtdh="http://schemas.microsoft.com/office/word/2020/wordml/sdtdatahash" xmlns:w16sdtfl="http://schemas.microsoft.com/office/word/2024/wordml/sdtformatlock" xmlns:w16se="http://schemas.microsoft.com/office/word/2015/wordml/symex" xmlns:wpg="http://schemas.microsoft.com/office/word/2010/wordprocessingGroup" xmlns:wpi="http://schemas.microsoft.com/office/word/2010/wordprocessingInk" xmlns:wne="http://schemas.microsoft.com/office/word/2006/wordml" xmlns:wps="http://schemas.microsoft.com/office/word/2010/wordprocessingShape" mc:Ignorable="w14 w15 w16se w16cid w16 w16cex w16sdtdh w16sdtfl w16du wp14"/>
 </file>
 
 <file path=word/styles.xml><?xml version="1.0" encoding="utf-8"?>
@@ -2902,6 +5250,25 @@
     <w:uiPriority w:val="99"/>
     <w:rsid w:val="009666F9"/>
   </w:style>
+  <w:style w:type="table" w:styleId="TableGrid">
+    <w:name w:val="Table Grid"/>
+    <w:basedOn w:val="TableNormal"/>
+    <w:uiPriority w:val="39"/>
+    <w:rsid w:val="00F36799"/>
+    <w:pPr>
+      <w:spacing w:after="0" w:line="240" w:lineRule="auto"/>
+    </w:pPr>
+    <w:tblPr>
+      <w:tblBorders>
+        <w:top w:val="single" w:sz="4" w:space="0" w:color="auto"/>
+        <w:left w:val="single" w:sz="4" w:space="0" w:color="auto"/>
+        <w:bottom w:val="single" w:sz="4" w:space="0" w:color="auto"/>
+        <w:right w:val="single" w:sz="4" w:space="0" w:color="auto"/>
+        <w:insideH w:val="single" w:sz="4" w:space="0" w:color="auto"/>
+        <w:insideV w:val="single" w:sz="4" w:space="0" w:color="auto"/>
+      </w:tblBorders>
+    </w:tblPr>
+  </w:style>
 </w:styles>
 </file>
 

</xml_diff>

<commit_message>
Update POE part 1 ST10568899 sesi mongatane.docx
</commit_message>
<xml_diff>
--- a/POE part 1 ST10568899 sesi mongatane.docx
+++ b/POE part 1 ST10568899 sesi mongatane.docx
@@ -45,1794 +45,22 @@
     <w:p/>
     <w:p/>
     <w:p/>
-    <w:p/>
-    <w:p>
-      <w:pPr>
-        <w:rPr>
-          <w:b/>
-          <w:bCs/>
-        </w:rPr>
-      </w:pPr>
-      <w:r>
-        <w:rPr>
-          <w:b/>
-          <w:bCs/>
-        </w:rPr>
-        <w:lastRenderedPageBreak/>
-        <w:t xml:space="preserve">SECTION A </w:t>
-      </w:r>
-    </w:p>
-    <w:p/>
-    <w:p/>
     <w:p>
       <w:pPr>
         <w:tabs>
-          <w:tab w:val="left" w:pos="2730"/>
-        </w:tabs>
-      </w:pPr>
-      <w:r>
-        <w:rPr>
-          <w:noProof/>
-        </w:rPr>
-        <mc:AlternateContent>
-          <mc:Choice Requires="wps">
-            <w:drawing>
-              <wp:anchor distT="0" distB="0" distL="114300" distR="114300" simplePos="0" relativeHeight="251658240" behindDoc="0" locked="0" layoutInCell="1" allowOverlap="1" wp14:anchorId="0E332C9C" wp14:editId="2111845D">
-                <wp:simplePos x="0" y="0"/>
-                <wp:positionH relativeFrom="column">
-                  <wp:posOffset>1270000</wp:posOffset>
-                </wp:positionH>
-                <wp:positionV relativeFrom="paragraph">
-                  <wp:posOffset>7620</wp:posOffset>
-                </wp:positionV>
-                <wp:extent cx="2025650" cy="1917700"/>
-                <wp:effectExtent l="0" t="0" r="12700" b="25400"/>
-                <wp:wrapNone/>
-                <wp:docPr id="1779846557" name="Rectangle 1"/>
-                <wp:cNvGraphicFramePr/>
-                <a:graphic xmlns:a="http://schemas.openxmlformats.org/drawingml/2006/main">
-                  <a:graphicData uri="http://schemas.microsoft.com/office/word/2010/wordprocessingShape">
-                    <wps:wsp>
-                      <wps:cNvSpPr/>
-                      <wps:spPr>
-                        <a:xfrm>
-                          <a:off x="0" y="0"/>
-                          <a:ext cx="2025650" cy="1917700"/>
-                        </a:xfrm>
-                        <a:prstGeom prst="rect">
-                          <a:avLst/>
-                        </a:prstGeom>
-                        <a:noFill/>
-                      </wps:spPr>
-                      <wps:style>
-                        <a:lnRef idx="2">
-                          <a:schemeClr val="accent1">
-                            <a:shade val="15000"/>
-                          </a:schemeClr>
-                        </a:lnRef>
-                        <a:fillRef idx="1">
-                          <a:schemeClr val="accent1"/>
-                        </a:fillRef>
-                        <a:effectRef idx="0">
-                          <a:schemeClr val="accent1"/>
-                        </a:effectRef>
-                        <a:fontRef idx="minor">
-                          <a:schemeClr val="lt1"/>
-                        </a:fontRef>
-                      </wps:style>
-                      <wps:bodyPr rot="0" spcFirstLastPara="0" vertOverflow="overflow" horzOverflow="overflow" vert="horz" wrap="square" lIns="91440" tIns="45720" rIns="91440" bIns="45720" numCol="1" spcCol="0" rtlCol="0" fromWordArt="0" anchor="ctr" anchorCtr="0" forceAA="0" compatLnSpc="1">
-                        <a:prstTxWarp prst="textNoShape">
-                          <a:avLst/>
-                        </a:prstTxWarp>
-                        <a:noAutofit/>
-                      </wps:bodyPr>
-                    </wps:wsp>
-                  </a:graphicData>
-                </a:graphic>
-                <wp14:sizeRelV relativeFrom="margin">
-                  <wp14:pctHeight>0</wp14:pctHeight>
-                </wp14:sizeRelV>
-              </wp:anchor>
-            </w:drawing>
-          </mc:Choice>
-          <mc:Fallback>
-            <w:pict>
-              <v:rect w14:anchorId="4604877E" id="Rectangle 1" o:spid="_x0000_s1026" style="position:absolute;margin-left:100pt;margin-top:.6pt;width:159.5pt;height:151pt;z-index:251659264;visibility:visible;mso-wrap-style:square;mso-height-percent:0;mso-wrap-distance-left:9pt;mso-wrap-distance-top:0;mso-wrap-distance-right:9pt;mso-wrap-distance-bottom:0;mso-position-horizontal:absolute;mso-position-horizontal-relative:text;mso-position-vertical:absolute;mso-position-vertical-relative:text;mso-height-percent:0;mso-height-relative:margin;v-text-anchor:middle" o:gfxdata="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" filled="f" strokecolor="#030e13 [484]" strokeweight="1.5pt"/>
-            </w:pict>
-          </mc:Fallback>
-        </mc:AlternateContent>
-      </w:r>
-      <w:r>
-        <w:rPr>
-          <w:noProof/>
-        </w:rPr>
-        <mc:AlternateContent>
-          <mc:Choice Requires="wps">
-            <w:drawing>
-              <wp:anchor distT="0" distB="0" distL="114300" distR="114300" simplePos="0" relativeHeight="251658241" behindDoc="0" locked="0" layoutInCell="1" allowOverlap="1" wp14:anchorId="63A31F9D" wp14:editId="3DBD3251">
-                <wp:simplePos x="0" y="0"/>
-                <wp:positionH relativeFrom="column">
-                  <wp:posOffset>1282700</wp:posOffset>
-                </wp:positionH>
-                <wp:positionV relativeFrom="paragraph">
-                  <wp:posOffset>185420</wp:posOffset>
-                </wp:positionV>
-                <wp:extent cx="2006600" cy="12700"/>
-                <wp:effectExtent l="0" t="0" r="31750" b="25400"/>
-                <wp:wrapNone/>
-                <wp:docPr id="162230695" name="Straight Connector 3"/>
-                <wp:cNvGraphicFramePr/>
-                <a:graphic xmlns:a="http://schemas.openxmlformats.org/drawingml/2006/main">
-                  <a:graphicData uri="http://schemas.microsoft.com/office/word/2010/wordprocessingShape">
-                    <wps:wsp>
-                      <wps:cNvCnPr/>
-                      <wps:spPr>
-                        <a:xfrm>
-                          <a:off x="0" y="0"/>
-                          <a:ext cx="2006600" cy="12700"/>
-                        </a:xfrm>
-                        <a:prstGeom prst="line">
-                          <a:avLst/>
-                        </a:prstGeom>
-                        <a:ln>
-                          <a:solidFill>
-                            <a:schemeClr val="tx1"/>
-                          </a:solidFill>
-                        </a:ln>
-                      </wps:spPr>
-                      <wps:style>
-                        <a:lnRef idx="2">
-                          <a:schemeClr val="accent1"/>
-                        </a:lnRef>
-                        <a:fillRef idx="0">
-                          <a:schemeClr val="accent1"/>
-                        </a:fillRef>
-                        <a:effectRef idx="1">
-                          <a:schemeClr val="accent1"/>
-                        </a:effectRef>
-                        <a:fontRef idx="minor">
-                          <a:schemeClr val="tx1"/>
-                        </a:fontRef>
-                      </wps:style>
-                      <wps:bodyPr/>
-                    </wps:wsp>
-                  </a:graphicData>
-                </a:graphic>
-              </wp:anchor>
-            </w:drawing>
-          </mc:Choice>
-          <mc:Fallback>
-            <w:pict>
-              <v:line w14:anchorId="6CCF4FFF" id="Straight Connector 3" o:spid="_x0000_s1026" style="position:absolute;z-index:251660288;visibility:visible;mso-wrap-style:square;mso-wrap-distance-left:9pt;mso-wrap-distance-top:0;mso-wrap-distance-right:9pt;mso-wrap-distance-bottom:0;mso-position-horizontal:absolute;mso-position-horizontal-relative:text;mso-position-vertical:absolute;mso-position-vertical-relative:text" from="101pt,14.6pt" to="259pt,15.6pt" o:gfxdata="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" strokecolor="black [3213]" strokeweight="1.5pt">
-                <v:stroke joinstyle="miter"/>
-              </v:line>
-            </w:pict>
-          </mc:Fallback>
-        </mc:AlternateContent>
-      </w:r>
-      <w:r>
-        <w:tab/>
-        <w:t>USER</w:t>
-      </w:r>
-    </w:p>
-    <w:p>
-      <w:pPr>
-        <w:tabs>
-          <w:tab w:val="left" w:pos="2730"/>
-        </w:tabs>
-      </w:pPr>
-      <w:r>
-        <w:t xml:space="preserve">                                             </w:t>
-      </w:r>
-      <w:proofErr w:type="spellStart"/>
-      <w:proofErr w:type="gramStart"/>
-      <w:r>
-        <w:t>UserID</w:t>
-      </w:r>
-      <w:proofErr w:type="spellEnd"/>
-      <w:r>
-        <w:t xml:space="preserve"> </w:t>
-      </w:r>
-      <w:r>
-        <w:t xml:space="preserve"> PK</w:t>
-      </w:r>
-      <w:proofErr w:type="gramEnd"/>
-    </w:p>
-    <w:p>
-      <w:pPr>
-        <w:tabs>
-          <w:tab w:val="left" w:pos="2730"/>
-        </w:tabs>
-      </w:pPr>
-      <w:r>
-        <w:t xml:space="preserve">                                            Name </w:t>
-      </w:r>
-    </w:p>
-    <w:p>
-      <w:pPr>
-        <w:tabs>
-          <w:tab w:val="left" w:pos="2730"/>
-        </w:tabs>
-      </w:pPr>
-      <w:r>
-        <w:t xml:space="preserve">                                            Email address </w:t>
-      </w:r>
-    </w:p>
-    <w:p>
-      <w:pPr>
-        <w:tabs>
-          <w:tab w:val="left" w:pos="2190"/>
-        </w:tabs>
-      </w:pPr>
-      <w:r>
-        <w:tab/>
-        <w:t xml:space="preserve">Password </w:t>
-      </w:r>
-    </w:p>
-    <w:p>
-      <w:pPr>
-        <w:tabs>
-          <w:tab w:val="left" w:pos="2190"/>
-        </w:tabs>
-      </w:pPr>
-      <w:r>
-        <w:t xml:space="preserve">                                            Role</w:t>
-      </w:r>
-    </w:p>
-    <w:p>
-      <w:pPr>
-        <w:tabs>
-          <w:tab w:val="left" w:pos="2730"/>
-        </w:tabs>
-      </w:pPr>
-      <w:r>
-        <w:rPr>
-          <w:noProof/>
-        </w:rPr>
-        <mc:AlternateContent>
-          <mc:Choice Requires="wps">
-            <w:drawing>
-              <wp:anchor distT="0" distB="0" distL="114300" distR="114300" simplePos="0" relativeHeight="251658242" behindDoc="0" locked="0" layoutInCell="1" allowOverlap="1" wp14:anchorId="481EB1B7" wp14:editId="740608D9">
-                <wp:simplePos x="0" y="0"/>
-                <wp:positionH relativeFrom="column">
-                  <wp:posOffset>2197100</wp:posOffset>
-                </wp:positionH>
-                <wp:positionV relativeFrom="paragraph">
-                  <wp:posOffset>73660</wp:posOffset>
-                </wp:positionV>
-                <wp:extent cx="6350" cy="730250"/>
-                <wp:effectExtent l="38100" t="0" r="69850" b="50800"/>
-                <wp:wrapNone/>
-                <wp:docPr id="1381543096" name="Straight Arrow Connector 5"/>
-                <wp:cNvGraphicFramePr/>
-                <a:graphic xmlns:a="http://schemas.openxmlformats.org/drawingml/2006/main">
-                  <a:graphicData uri="http://schemas.microsoft.com/office/word/2010/wordprocessingShape">
-                    <wps:wsp>
-                      <wps:cNvCnPr/>
-                      <wps:spPr>
-                        <a:xfrm>
-                          <a:off x="0" y="0"/>
-                          <a:ext cx="6350" cy="730250"/>
-                        </a:xfrm>
-                        <a:prstGeom prst="straightConnector1">
-                          <a:avLst/>
-                        </a:prstGeom>
-                        <a:ln>
-                          <a:solidFill>
-                            <a:schemeClr val="tx1"/>
-                          </a:solidFill>
-                          <a:tailEnd type="triangle"/>
-                        </a:ln>
-                      </wps:spPr>
-                      <wps:style>
-                        <a:lnRef idx="2">
-                          <a:schemeClr val="accent1"/>
-                        </a:lnRef>
-                        <a:fillRef idx="0">
-                          <a:schemeClr val="accent1"/>
-                        </a:fillRef>
-                        <a:effectRef idx="1">
-                          <a:schemeClr val="accent1"/>
-                        </a:effectRef>
-                        <a:fontRef idx="minor">
-                          <a:schemeClr val="tx1"/>
-                        </a:fontRef>
-                      </wps:style>
-                      <wps:bodyPr/>
-                    </wps:wsp>
-                  </a:graphicData>
-                </a:graphic>
-              </wp:anchor>
-            </w:drawing>
-          </mc:Choice>
-          <mc:Fallback>
-            <w:pict>
-              <v:shapetype w14:anchorId="165C6277" id="_x0000_t32" coordsize="21600,21600" o:spt="32" o:oned="t" path="m,l21600,21600e" filled="f">
-                <v:path arrowok="t" fillok="f" o:connecttype="none"/>
-                <o:lock v:ext="edit" shapetype="t"/>
-              </v:shapetype>
-              <v:shape id="Straight Arrow Connector 5" o:spid="_x0000_s1026" type="#_x0000_t32" style="position:absolute;margin-left:173pt;margin-top:5.8pt;width:.5pt;height:57.5pt;z-index:251661312;visibility:visible;mso-wrap-style:square;mso-wrap-distance-left:9pt;mso-wrap-distance-top:0;mso-wrap-distance-right:9pt;mso-wrap-distance-bottom:0;mso-position-horizontal:absolute;mso-position-horizontal-relative:text;mso-position-vertical:absolute;mso-position-vertical-relative:text" o:gfxdata="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" strokecolor="black [3213]" strokeweight="1.5pt">
-                <v:stroke endarrow="block" joinstyle="miter"/>
-              </v:shape>
-            </w:pict>
-          </mc:Fallback>
-        </mc:AlternateContent>
-      </w:r>
-      <w:r>
-        <w:t xml:space="preserve">                                           </w:t>
-      </w:r>
-    </w:p>
-    <w:p>
-      <w:pPr>
-        <w:tabs>
-          <w:tab w:val="left" w:pos="6490"/>
-        </w:tabs>
-      </w:pPr>
-      <w:r>
-        <w:t>1</w:t>
-      </w:r>
-      <w:r>
-        <w:tab/>
-        <w:t>M</w:t>
-      </w:r>
-    </w:p>
-    <w:p/>
-    <w:p>
-      <w:pPr>
-        <w:tabs>
-          <w:tab w:val="left" w:pos="2990"/>
-        </w:tabs>
-      </w:pPr>
-      <w:r>
-        <w:rPr>
-          <w:noProof/>
-        </w:rPr>
-        <mc:AlternateContent>
-          <mc:Choice Requires="wps">
-            <w:drawing>
-              <wp:anchor distT="0" distB="0" distL="114300" distR="114300" simplePos="0" relativeHeight="251658243" behindDoc="0" locked="0" layoutInCell="1" allowOverlap="1" wp14:anchorId="2A0CE284" wp14:editId="1B305DBE">
-                <wp:simplePos x="0" y="0"/>
-                <wp:positionH relativeFrom="column">
-                  <wp:posOffset>1308100</wp:posOffset>
-                </wp:positionH>
-                <wp:positionV relativeFrom="paragraph">
-                  <wp:posOffset>5080</wp:posOffset>
-                </wp:positionV>
-                <wp:extent cx="1873250" cy="2978150"/>
-                <wp:effectExtent l="0" t="0" r="12700" b="12700"/>
-                <wp:wrapNone/>
-                <wp:docPr id="946268873" name="Rectangle 6"/>
-                <wp:cNvGraphicFramePr/>
-                <a:graphic xmlns:a="http://schemas.openxmlformats.org/drawingml/2006/main">
-                  <a:graphicData uri="http://schemas.microsoft.com/office/word/2010/wordprocessingShape">
-                    <wps:wsp>
-                      <wps:cNvSpPr/>
-                      <wps:spPr>
-                        <a:xfrm>
-                          <a:off x="0" y="0"/>
-                          <a:ext cx="1873250" cy="2978150"/>
-                        </a:xfrm>
-                        <a:prstGeom prst="rect">
-                          <a:avLst/>
-                        </a:prstGeom>
-                        <a:noFill/>
-                      </wps:spPr>
-                      <wps:style>
-                        <a:lnRef idx="2">
-                          <a:schemeClr val="accent1">
-                            <a:shade val="15000"/>
-                          </a:schemeClr>
-                        </a:lnRef>
-                        <a:fillRef idx="1">
-                          <a:schemeClr val="accent1"/>
-                        </a:fillRef>
-                        <a:effectRef idx="0">
-                          <a:schemeClr val="accent1"/>
-                        </a:effectRef>
-                        <a:fontRef idx="minor">
-                          <a:schemeClr val="lt1"/>
-                        </a:fontRef>
-                      </wps:style>
-                      <wps:bodyPr rot="0" spcFirstLastPara="0" vertOverflow="overflow" horzOverflow="overflow" vert="horz" wrap="square" lIns="91440" tIns="45720" rIns="91440" bIns="45720" numCol="1" spcCol="0" rtlCol="0" fromWordArt="0" anchor="ctr" anchorCtr="0" forceAA="0" compatLnSpc="1">
-                        <a:prstTxWarp prst="textNoShape">
-                          <a:avLst/>
-                        </a:prstTxWarp>
-                        <a:noAutofit/>
-                      </wps:bodyPr>
-                    </wps:wsp>
-                  </a:graphicData>
-                </a:graphic>
-                <wp14:sizeRelV relativeFrom="margin">
-                  <wp14:pctHeight>0</wp14:pctHeight>
-                </wp14:sizeRelV>
-              </wp:anchor>
-            </w:drawing>
-          </mc:Choice>
-          <mc:Fallback>
-            <w:pict>
-              <v:rect w14:anchorId="292A34A0" id="Rectangle 6" o:spid="_x0000_s1026" style="position:absolute;margin-left:103pt;margin-top:.4pt;width:147.5pt;height:234.5pt;z-index:251662336;visibility:visible;mso-wrap-style:square;mso-height-percent:0;mso-wrap-distance-left:9pt;mso-wrap-distance-top:0;mso-wrap-distance-right:9pt;mso-wrap-distance-bottom:0;mso-position-horizontal:absolute;mso-position-horizontal-relative:text;mso-position-vertical:absolute;mso-position-vertical-relative:text;mso-height-percent:0;mso-height-relative:margin;v-text-anchor:middle" o:gfxdata="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" filled="f" strokecolor="#030e13 [484]" strokeweight="1.5pt"/>
-            </w:pict>
-          </mc:Fallback>
-        </mc:AlternateContent>
-      </w:r>
-      <w:r>
-        <w:rPr>
-          <w:noProof/>
-        </w:rPr>
-        <mc:AlternateContent>
-          <mc:Choice Requires="wps">
-            <w:drawing>
-              <wp:anchor distT="0" distB="0" distL="114300" distR="114300" simplePos="0" relativeHeight="251658244" behindDoc="0" locked="0" layoutInCell="1" allowOverlap="1" wp14:anchorId="20CAC657" wp14:editId="76FA41DD">
-                <wp:simplePos x="0" y="0"/>
-                <wp:positionH relativeFrom="column">
-                  <wp:posOffset>1320800</wp:posOffset>
-                </wp:positionH>
-                <wp:positionV relativeFrom="paragraph">
-                  <wp:posOffset>170180</wp:posOffset>
-                </wp:positionV>
-                <wp:extent cx="1841500" cy="12700"/>
-                <wp:effectExtent l="0" t="0" r="25400" b="25400"/>
-                <wp:wrapNone/>
-                <wp:docPr id="888951397" name="Straight Connector 7"/>
-                <wp:cNvGraphicFramePr/>
-                <a:graphic xmlns:a="http://schemas.openxmlformats.org/drawingml/2006/main">
-                  <a:graphicData uri="http://schemas.microsoft.com/office/word/2010/wordprocessingShape">
-                    <wps:wsp>
-                      <wps:cNvCnPr/>
-                      <wps:spPr>
-                        <a:xfrm>
-                          <a:off x="0" y="0"/>
-                          <a:ext cx="1841500" cy="12700"/>
-                        </a:xfrm>
-                        <a:prstGeom prst="line">
-                          <a:avLst/>
-                        </a:prstGeom>
-                        <a:ln>
-                          <a:solidFill>
-                            <a:schemeClr val="tx1"/>
-                          </a:solidFill>
-                        </a:ln>
-                      </wps:spPr>
-                      <wps:style>
-                        <a:lnRef idx="2">
-                          <a:schemeClr val="accent1"/>
-                        </a:lnRef>
-                        <a:fillRef idx="0">
-                          <a:schemeClr val="accent1"/>
-                        </a:fillRef>
-                        <a:effectRef idx="1">
-                          <a:schemeClr val="accent1"/>
-                        </a:effectRef>
-                        <a:fontRef idx="minor">
-                          <a:schemeClr val="tx1"/>
-                        </a:fontRef>
-                      </wps:style>
-                      <wps:bodyPr/>
-                    </wps:wsp>
-                  </a:graphicData>
-                </a:graphic>
-              </wp:anchor>
-            </w:drawing>
-          </mc:Choice>
-          <mc:Fallback>
-            <w:pict>
-              <v:line w14:anchorId="35618623" id="Straight Connector 7" o:spid="_x0000_s1026" style="position:absolute;z-index:251663360;visibility:visible;mso-wrap-style:square;mso-wrap-distance-left:9pt;mso-wrap-distance-top:0;mso-wrap-distance-right:9pt;mso-wrap-distance-bottom:0;mso-position-horizontal:absolute;mso-position-horizontal-relative:text;mso-position-vertical:absolute;mso-position-vertical-relative:text" from="104pt,13.4pt" to="249pt,14.4pt" o:gfxdata="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" strokecolor="black [3213]" strokeweight="1.5pt">
-                <v:stroke joinstyle="miter"/>
-              </v:line>
-            </w:pict>
-          </mc:Fallback>
-        </mc:AlternateContent>
-      </w:r>
-      <w:r>
-        <w:tab/>
-        <w:t xml:space="preserve">EVENT </w:t>
-      </w:r>
-    </w:p>
-    <w:p>
-      <w:pPr>
-        <w:tabs>
-          <w:tab w:val="left" w:pos="2540"/>
-          <w:tab w:val="left" w:pos="4010"/>
-        </w:tabs>
-      </w:pPr>
-      <w:r>
-        <w:tab/>
-      </w:r>
-      <w:proofErr w:type="spellStart"/>
-      <w:r>
-        <w:t>EventID</w:t>
-      </w:r>
-      <w:proofErr w:type="spellEnd"/>
-      <w:r>
-        <w:tab/>
-        <w:t>PK</w:t>
-      </w:r>
-    </w:p>
-    <w:p>
-      <w:pPr>
-        <w:tabs>
-          <w:tab w:val="left" w:pos="2540"/>
-          <w:tab w:val="center" w:pos="4513"/>
-        </w:tabs>
-      </w:pPr>
-      <w:r>
-        <w:tab/>
-      </w:r>
-      <w:proofErr w:type="spellStart"/>
-      <w:r>
-        <w:t>organisersID</w:t>
-      </w:r>
-      <w:proofErr w:type="spellEnd"/>
-      <w:r>
-        <w:tab/>
-        <w:t>FK</w:t>
-      </w:r>
-    </w:p>
-    <w:p>
-      <w:pPr>
-        <w:tabs>
-          <w:tab w:val="left" w:pos="2540"/>
-        </w:tabs>
-      </w:pPr>
-      <w:r>
-        <w:tab/>
-        <w:t xml:space="preserve">Name </w:t>
-      </w:r>
-    </w:p>
-    <w:p>
-      <w:pPr>
-        <w:tabs>
-          <w:tab w:val="left" w:pos="2540"/>
-        </w:tabs>
-      </w:pPr>
-      <w:r>
-        <w:tab/>
-        <w:t>description</w:t>
-      </w:r>
-    </w:p>
-    <w:p>
-      <w:pPr>
-        <w:tabs>
-          <w:tab w:val="left" w:pos="2540"/>
-        </w:tabs>
-      </w:pPr>
-      <w:r>
-        <w:tab/>
-      </w:r>
-      <w:proofErr w:type="spellStart"/>
-      <w:r>
-        <w:t>EventDate</w:t>
-      </w:r>
-      <w:proofErr w:type="spellEnd"/>
-    </w:p>
-    <w:p>
-      <w:pPr>
-        <w:tabs>
-          <w:tab w:val="left" w:pos="2540"/>
-        </w:tabs>
-      </w:pPr>
-      <w:r>
-        <w:tab/>
-        <w:t>Location</w:t>
-      </w:r>
-    </w:p>
-    <w:p>
-      <w:pPr>
-        <w:tabs>
-          <w:tab w:val="left" w:pos="2540"/>
-        </w:tabs>
-      </w:pPr>
-      <w:r>
-        <w:tab/>
-        <w:t xml:space="preserve">Distance </w:t>
-      </w:r>
-    </w:p>
-    <w:p>
-      <w:pPr>
-        <w:tabs>
-          <w:tab w:val="left" w:pos="2540"/>
-        </w:tabs>
-      </w:pPr>
-      <w:r>
-        <w:tab/>
-      </w:r>
-      <w:proofErr w:type="spellStart"/>
-      <w:r>
-        <w:t>EventType</w:t>
-      </w:r>
-      <w:proofErr w:type="spellEnd"/>
-    </w:p>
-    <w:p>
-      <w:r>
-        <w:rPr>
-          <w:noProof/>
-        </w:rPr>
-        <mc:AlternateContent>
-          <mc:Choice Requires="wps">
-            <w:drawing>
-              <wp:anchor distT="0" distB="0" distL="114300" distR="114300" simplePos="0" relativeHeight="251658250" behindDoc="0" locked="0" layoutInCell="1" allowOverlap="1" wp14:anchorId="25F2BD4D" wp14:editId="620BE410">
-                <wp:simplePos x="0" y="0"/>
-                <wp:positionH relativeFrom="column">
-                  <wp:posOffset>2768600</wp:posOffset>
-                </wp:positionH>
-                <wp:positionV relativeFrom="paragraph">
-                  <wp:posOffset>142240</wp:posOffset>
-                </wp:positionV>
-                <wp:extent cx="19050" cy="2190750"/>
-                <wp:effectExtent l="57150" t="0" r="76200" b="57150"/>
-                <wp:wrapNone/>
-                <wp:docPr id="513972164" name="Straight Arrow Connector 19"/>
-                <wp:cNvGraphicFramePr/>
-                <a:graphic xmlns:a="http://schemas.openxmlformats.org/drawingml/2006/main">
-                  <a:graphicData uri="http://schemas.microsoft.com/office/word/2010/wordprocessingShape">
-                    <wps:wsp>
-                      <wps:cNvCnPr/>
-                      <wps:spPr>
-                        <a:xfrm>
-                          <a:off x="0" y="0"/>
-                          <a:ext cx="19050" cy="2190750"/>
-                        </a:xfrm>
-                        <a:prstGeom prst="straightConnector1">
-                          <a:avLst/>
-                        </a:prstGeom>
-                        <a:ln>
-                          <a:solidFill>
-                            <a:schemeClr val="tx1"/>
-                          </a:solidFill>
-                          <a:tailEnd type="triangle"/>
-                        </a:ln>
-                      </wps:spPr>
-                      <wps:style>
-                        <a:lnRef idx="2">
-                          <a:schemeClr val="accent1"/>
-                        </a:lnRef>
-                        <a:fillRef idx="0">
-                          <a:schemeClr val="accent1"/>
-                        </a:fillRef>
-                        <a:effectRef idx="1">
-                          <a:schemeClr val="accent1"/>
-                        </a:effectRef>
-                        <a:fontRef idx="minor">
-                          <a:schemeClr val="tx1"/>
-                        </a:fontRef>
-                      </wps:style>
-                      <wps:bodyPr/>
-                    </wps:wsp>
-                  </a:graphicData>
-                </a:graphic>
-              </wp:anchor>
-            </w:drawing>
-          </mc:Choice>
-          <mc:Fallback>
-            <w:pict>
-              <v:shape w14:anchorId="49151E0B" id="Straight Arrow Connector 19" o:spid="_x0000_s1026" type="#_x0000_t32" style="position:absolute;margin-left:218pt;margin-top:11.2pt;width:1.5pt;height:172.5pt;z-index:251671552;visibility:visible;mso-wrap-style:square;mso-wrap-distance-left:9pt;mso-wrap-distance-top:0;mso-wrap-distance-right:9pt;mso-wrap-distance-bottom:0;mso-position-horizontal:absolute;mso-position-horizontal-relative:text;mso-position-vertical:absolute;mso-position-vertical-relative:text" o:gfxdata="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" strokecolor="black [3213]" strokeweight="1.5pt">
-                <v:stroke endarrow="block" joinstyle="miter"/>
-              </v:shape>
-            </w:pict>
-          </mc:Fallback>
-        </mc:AlternateContent>
-      </w:r>
-      <w:r>
-        <w:rPr>
-          <w:noProof/>
-        </w:rPr>
-        <mc:AlternateContent>
-          <mc:Choice Requires="wps">
-            <w:drawing>
-              <wp:anchor distT="0" distB="0" distL="114300" distR="114300" simplePos="0" relativeHeight="251658249" behindDoc="0" locked="0" layoutInCell="1" allowOverlap="1" wp14:anchorId="340FAF3C" wp14:editId="5AEDC6AE">
-                <wp:simplePos x="0" y="0"/>
-                <wp:positionH relativeFrom="column">
-                  <wp:posOffset>1416050</wp:posOffset>
-                </wp:positionH>
-                <wp:positionV relativeFrom="paragraph">
-                  <wp:posOffset>110490</wp:posOffset>
-                </wp:positionV>
-                <wp:extent cx="19050" cy="2292350"/>
-                <wp:effectExtent l="57150" t="0" r="57150" b="50800"/>
-                <wp:wrapNone/>
-                <wp:docPr id="254195280" name="Straight Arrow Connector 18"/>
-                <wp:cNvGraphicFramePr/>
-                <a:graphic xmlns:a="http://schemas.openxmlformats.org/drawingml/2006/main">
-                  <a:graphicData uri="http://schemas.microsoft.com/office/word/2010/wordprocessingShape">
-                    <wps:wsp>
-                      <wps:cNvCnPr/>
-                      <wps:spPr>
-                        <a:xfrm>
-                          <a:off x="0" y="0"/>
-                          <a:ext cx="19050" cy="2292350"/>
-                        </a:xfrm>
-                        <a:prstGeom prst="straightConnector1">
-                          <a:avLst/>
-                        </a:prstGeom>
-                        <a:ln>
-                          <a:solidFill>
-                            <a:schemeClr val="tx1"/>
-                          </a:solidFill>
-                          <a:tailEnd type="triangle"/>
-                        </a:ln>
-                      </wps:spPr>
-                      <wps:style>
-                        <a:lnRef idx="2">
-                          <a:schemeClr val="accent1"/>
-                        </a:lnRef>
-                        <a:fillRef idx="0">
-                          <a:schemeClr val="accent1"/>
-                        </a:fillRef>
-                        <a:effectRef idx="1">
-                          <a:schemeClr val="accent1"/>
-                        </a:effectRef>
-                        <a:fontRef idx="minor">
-                          <a:schemeClr val="tx1"/>
-                        </a:fontRef>
-                      </wps:style>
-                      <wps:bodyPr/>
-                    </wps:wsp>
-                  </a:graphicData>
-                </a:graphic>
-              </wp:anchor>
-            </w:drawing>
-          </mc:Choice>
-          <mc:Fallback>
-            <w:pict>
-              <v:shape w14:anchorId="4E2869A4" id="Straight Arrow Connector 18" o:spid="_x0000_s1026" type="#_x0000_t32" style="position:absolute;margin-left:111.5pt;margin-top:8.7pt;width:1.5pt;height:180.5pt;z-index:251670528;visibility:visible;mso-wrap-style:square;mso-wrap-distance-left:9pt;mso-wrap-distance-top:0;mso-wrap-distance-right:9pt;mso-wrap-distance-bottom:0;mso-position-horizontal:absolute;mso-position-horizontal-relative:text;mso-position-vertical:absolute;mso-position-vertical-relative:text" o:gfxdata="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" strokecolor="black [3213]" strokeweight="1.5pt">
-                <v:stroke endarrow="block" joinstyle="miter"/>
-              </v:shape>
-            </w:pict>
-          </mc:Fallback>
-        </mc:AlternateContent>
-      </w:r>
-    </w:p>
-    <w:p/>
-    <w:p/>
-    <w:p>
-      <w:pPr>
-        <w:tabs>
-          <w:tab w:val="left" w:pos="5070"/>
-        </w:tabs>
-      </w:pPr>
-      <w:r>
-        <w:tab/>
-        <w:t>1:1</w:t>
-      </w:r>
-    </w:p>
-    <w:p>
-      <w:pPr>
-        <w:tabs>
-          <w:tab w:val="left" w:pos="2510"/>
-        </w:tabs>
-      </w:pPr>
-      <w:r>
-        <w:t>1:M</w:t>
-      </w:r>
-    </w:p>
-    <w:p>
-      <w:pPr>
-        <w:tabs>
-          <w:tab w:val="left" w:pos="2510"/>
+          <w:tab w:val="left" w:pos="3160"/>
         </w:tabs>
       </w:pPr>
     </w:p>
     <w:p>
       <w:pPr>
         <w:tabs>
-          <w:tab w:val="left" w:pos="2510"/>
-        </w:tabs>
-      </w:pPr>
-    </w:p>
-    <w:p>
-      <w:pPr>
-        <w:tabs>
-          <w:tab w:val="center" w:pos="4513"/>
+          <w:tab w:val="left" w:pos="3160"/>
         </w:tabs>
       </w:pPr>
       <w:r>
-        <w:rPr>
-          <w:noProof/>
-        </w:rPr>
         <w:lastRenderedPageBreak/>
-        <mc:AlternateContent>
-          <mc:Choice Requires="wps">
-            <w:drawing>
-              <wp:anchor distT="0" distB="0" distL="114300" distR="114300" simplePos="0" relativeHeight="251658248" behindDoc="0" locked="0" layoutInCell="1" allowOverlap="1" wp14:anchorId="78B728FB" wp14:editId="03A59623">
-                <wp:simplePos x="0" y="0"/>
-                <wp:positionH relativeFrom="column">
-                  <wp:posOffset>2362200</wp:posOffset>
-                </wp:positionH>
-                <wp:positionV relativeFrom="paragraph">
-                  <wp:posOffset>171450</wp:posOffset>
-                </wp:positionV>
-                <wp:extent cx="2063750" cy="6350"/>
-                <wp:effectExtent l="0" t="0" r="31750" b="31750"/>
-                <wp:wrapNone/>
-                <wp:docPr id="834827761" name="Straight Connector 17"/>
-                <wp:cNvGraphicFramePr/>
-                <a:graphic xmlns:a="http://schemas.openxmlformats.org/drawingml/2006/main">
-                  <a:graphicData uri="http://schemas.microsoft.com/office/word/2010/wordprocessingShape">
-                    <wps:wsp>
-                      <wps:cNvCnPr/>
-                      <wps:spPr>
-                        <a:xfrm>
-                          <a:off x="0" y="0"/>
-                          <a:ext cx="2063750" cy="6350"/>
-                        </a:xfrm>
-                        <a:prstGeom prst="line">
-                          <a:avLst/>
-                        </a:prstGeom>
-                        <a:ln>
-                          <a:solidFill>
-                            <a:schemeClr val="tx1"/>
-                          </a:solidFill>
-                        </a:ln>
-                      </wps:spPr>
-                      <wps:style>
-                        <a:lnRef idx="2">
-                          <a:schemeClr val="accent1"/>
-                        </a:lnRef>
-                        <a:fillRef idx="0">
-                          <a:schemeClr val="accent1"/>
-                        </a:fillRef>
-                        <a:effectRef idx="1">
-                          <a:schemeClr val="accent1"/>
-                        </a:effectRef>
-                        <a:fontRef idx="minor">
-                          <a:schemeClr val="tx1"/>
-                        </a:fontRef>
-                      </wps:style>
-                      <wps:bodyPr/>
-                    </wps:wsp>
-                  </a:graphicData>
-                </a:graphic>
-              </wp:anchor>
-            </w:drawing>
-          </mc:Choice>
-          <mc:Fallback>
-            <w:pict>
-              <v:line w14:anchorId="03A73329" id="Straight Connector 17" o:spid="_x0000_s1026" style="position:absolute;z-index:251669504;visibility:visible;mso-wrap-style:square;mso-wrap-distance-left:9pt;mso-wrap-distance-top:0;mso-wrap-distance-right:9pt;mso-wrap-distance-bottom:0;mso-position-horizontal:absolute;mso-position-horizontal-relative:text;mso-position-vertical:absolute;mso-position-vertical-relative:text" from="186pt,13.5pt" to="348.5pt,14pt" o:gfxdata="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" strokecolor="black [3213]" strokeweight="1.5pt">
-                <v:stroke joinstyle="miter"/>
-              </v:line>
-            </w:pict>
-          </mc:Fallback>
-        </mc:AlternateContent>
-      </w:r>
-      <w:r>
-        <w:rPr>
-          <w:noProof/>
-        </w:rPr>
-        <mc:AlternateContent>
-          <mc:Choice Requires="wps">
-            <w:drawing>
-              <wp:anchor distT="0" distB="0" distL="114300" distR="114300" simplePos="0" relativeHeight="251658247" behindDoc="0" locked="0" layoutInCell="1" allowOverlap="1" wp14:anchorId="3D6F158D" wp14:editId="55E8BBB7">
-                <wp:simplePos x="0" y="0"/>
-                <wp:positionH relativeFrom="column">
-                  <wp:posOffset>2368550</wp:posOffset>
-                </wp:positionH>
-                <wp:positionV relativeFrom="paragraph">
-                  <wp:posOffset>-158750</wp:posOffset>
-                </wp:positionV>
-                <wp:extent cx="2051050" cy="2438400"/>
-                <wp:effectExtent l="0" t="0" r="25400" b="19050"/>
-                <wp:wrapNone/>
-                <wp:docPr id="989752081" name="Rectangle 16"/>
-                <wp:cNvGraphicFramePr/>
-                <a:graphic xmlns:a="http://schemas.openxmlformats.org/drawingml/2006/main">
-                  <a:graphicData uri="http://schemas.microsoft.com/office/word/2010/wordprocessingShape">
-                    <wps:wsp>
-                      <wps:cNvSpPr/>
-                      <wps:spPr>
-                        <a:xfrm>
-                          <a:off x="0" y="0"/>
-                          <a:ext cx="2051050" cy="2438400"/>
-                        </a:xfrm>
-                        <a:prstGeom prst="rect">
-                          <a:avLst/>
-                        </a:prstGeom>
-                        <a:noFill/>
-                      </wps:spPr>
-                      <wps:style>
-                        <a:lnRef idx="2">
-                          <a:schemeClr val="accent1">
-                            <a:shade val="15000"/>
-                          </a:schemeClr>
-                        </a:lnRef>
-                        <a:fillRef idx="1">
-                          <a:schemeClr val="accent1"/>
-                        </a:fillRef>
-                        <a:effectRef idx="0">
-                          <a:schemeClr val="accent1"/>
-                        </a:effectRef>
-                        <a:fontRef idx="minor">
-                          <a:schemeClr val="lt1"/>
-                        </a:fontRef>
-                      </wps:style>
-                      <wps:bodyPr rot="0" spcFirstLastPara="0" vertOverflow="overflow" horzOverflow="overflow" vert="horz" wrap="square" lIns="91440" tIns="45720" rIns="91440" bIns="45720" numCol="1" spcCol="0" rtlCol="0" fromWordArt="0" anchor="ctr" anchorCtr="0" forceAA="0" compatLnSpc="1">
-                        <a:prstTxWarp prst="textNoShape">
-                          <a:avLst/>
-                        </a:prstTxWarp>
-                        <a:noAutofit/>
-                      </wps:bodyPr>
-                    </wps:wsp>
-                  </a:graphicData>
-                </a:graphic>
-              </wp:anchor>
-            </w:drawing>
-          </mc:Choice>
-          <mc:Fallback>
-            <w:pict>
-              <v:rect w14:anchorId="1D82CE18" id="Rectangle 16" o:spid="_x0000_s1026" style="position:absolute;margin-left:186.5pt;margin-top:-12.5pt;width:161.5pt;height:192pt;z-index:251668480;visibility:visible;mso-wrap-style:square;mso-wrap-distance-left:9pt;mso-wrap-distance-top:0;mso-wrap-distance-right:9pt;mso-wrap-distance-bottom:0;mso-position-horizontal:absolute;mso-position-horizontal-relative:text;mso-position-vertical:absolute;mso-position-vertical-relative:text;v-text-anchor:middle" o:gfxdata="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" filled="f" strokecolor="#030e13 [484]" strokeweight="1.5pt"/>
-            </w:pict>
-          </mc:Fallback>
-        </mc:AlternateContent>
-      </w:r>
-      <w:r>
-        <w:rPr>
-          <w:noProof/>
-        </w:rPr>
-        <mc:AlternateContent>
-          <mc:Choice Requires="wps">
-            <w:drawing>
-              <wp:anchor distT="0" distB="0" distL="114300" distR="114300" simplePos="0" relativeHeight="251658246" behindDoc="0" locked="0" layoutInCell="1" allowOverlap="1" wp14:anchorId="02C282F3" wp14:editId="4FDE0082">
-                <wp:simplePos x="0" y="0"/>
-                <wp:positionH relativeFrom="column">
-                  <wp:posOffset>-387350</wp:posOffset>
-                </wp:positionH>
-                <wp:positionV relativeFrom="paragraph">
-                  <wp:posOffset>165100</wp:posOffset>
-                </wp:positionV>
-                <wp:extent cx="1733550" cy="0"/>
-                <wp:effectExtent l="0" t="0" r="0" b="0"/>
-                <wp:wrapNone/>
-                <wp:docPr id="1035284818" name="Straight Connector 13"/>
-                <wp:cNvGraphicFramePr/>
-                <a:graphic xmlns:a="http://schemas.openxmlformats.org/drawingml/2006/main">
-                  <a:graphicData uri="http://schemas.microsoft.com/office/word/2010/wordprocessingShape">
-                    <wps:wsp>
-                      <wps:cNvCnPr/>
-                      <wps:spPr>
-                        <a:xfrm>
-                          <a:off x="0" y="0"/>
-                          <a:ext cx="1733550" cy="0"/>
-                        </a:xfrm>
-                        <a:prstGeom prst="line">
-                          <a:avLst/>
-                        </a:prstGeom>
-                        <a:ln>
-                          <a:solidFill>
-                            <a:schemeClr val="tx1"/>
-                          </a:solidFill>
-                        </a:ln>
-                      </wps:spPr>
-                      <wps:style>
-                        <a:lnRef idx="2">
-                          <a:schemeClr val="accent1"/>
-                        </a:lnRef>
-                        <a:fillRef idx="0">
-                          <a:schemeClr val="accent1"/>
-                        </a:fillRef>
-                        <a:effectRef idx="1">
-                          <a:schemeClr val="accent1"/>
-                        </a:effectRef>
-                        <a:fontRef idx="minor">
-                          <a:schemeClr val="tx1"/>
-                        </a:fontRef>
-                      </wps:style>
-                      <wps:bodyPr/>
-                    </wps:wsp>
-                  </a:graphicData>
-                </a:graphic>
-                <wp14:sizeRelH relativeFrom="margin">
-                  <wp14:pctWidth>0</wp14:pctWidth>
-                </wp14:sizeRelH>
-                <wp14:sizeRelV relativeFrom="margin">
-                  <wp14:pctHeight>0</wp14:pctHeight>
-                </wp14:sizeRelV>
-              </wp:anchor>
-            </w:drawing>
-          </mc:Choice>
-          <mc:Fallback>
-            <w:pict>
-              <v:line w14:anchorId="6254D1E0" id="Straight Connector 13" o:spid="_x0000_s1026" style="position:absolute;z-index:251667456;visibility:visible;mso-wrap-style:square;mso-width-percent:0;mso-height-percent:0;mso-wrap-distance-left:9pt;mso-wrap-distance-top:0;mso-wrap-distance-right:9pt;mso-wrap-distance-bottom:0;mso-position-horizontal:absolute;mso-position-horizontal-relative:text;mso-position-vertical:absolute;mso-position-vertical-relative:text;mso-width-percent:0;mso-height-percent:0;mso-width-relative:margin;mso-height-relative:margin" from="-30.5pt,13pt" to="106pt,13pt" o:gfxdata="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" strokecolor="black [3213]" strokeweight="1.5pt">
-                <v:stroke joinstyle="miter"/>
-              </v:line>
-            </w:pict>
-          </mc:Fallback>
-        </mc:AlternateContent>
-      </w:r>
-      <w:r>
-        <w:rPr>
-          <w:noProof/>
-        </w:rPr>
-        <mc:AlternateContent>
-          <mc:Choice Requires="wps">
-            <w:drawing>
-              <wp:anchor distT="0" distB="0" distL="114300" distR="114300" simplePos="0" relativeHeight="251658245" behindDoc="0" locked="0" layoutInCell="1" allowOverlap="1" wp14:anchorId="09CAEE90" wp14:editId="73DF53D0">
-                <wp:simplePos x="0" y="0"/>
-                <wp:positionH relativeFrom="column">
-                  <wp:posOffset>-393700</wp:posOffset>
-                </wp:positionH>
-                <wp:positionV relativeFrom="paragraph">
-                  <wp:posOffset>-76200</wp:posOffset>
-                </wp:positionV>
-                <wp:extent cx="1720850" cy="1993900"/>
-                <wp:effectExtent l="0" t="0" r="12700" b="25400"/>
-                <wp:wrapNone/>
-                <wp:docPr id="1363422337" name="Rectangle 9"/>
-                <wp:cNvGraphicFramePr/>
-                <a:graphic xmlns:a="http://schemas.openxmlformats.org/drawingml/2006/main">
-                  <a:graphicData uri="http://schemas.microsoft.com/office/word/2010/wordprocessingShape">
-                    <wps:wsp>
-                      <wps:cNvSpPr/>
-                      <wps:spPr>
-                        <a:xfrm>
-                          <a:off x="0" y="0"/>
-                          <a:ext cx="1720850" cy="1993900"/>
-                        </a:xfrm>
-                        <a:prstGeom prst="rect">
-                          <a:avLst/>
-                        </a:prstGeom>
-                        <a:noFill/>
-                      </wps:spPr>
-                      <wps:style>
-                        <a:lnRef idx="2">
-                          <a:schemeClr val="accent1">
-                            <a:shade val="15000"/>
-                          </a:schemeClr>
-                        </a:lnRef>
-                        <a:fillRef idx="1">
-                          <a:schemeClr val="accent1"/>
-                        </a:fillRef>
-                        <a:effectRef idx="0">
-                          <a:schemeClr val="accent1"/>
-                        </a:effectRef>
-                        <a:fontRef idx="minor">
-                          <a:schemeClr val="lt1"/>
-                        </a:fontRef>
-                      </wps:style>
-                      <wps:bodyPr rot="0" spcFirstLastPara="0" vertOverflow="overflow" horzOverflow="overflow" vert="horz" wrap="square" lIns="91440" tIns="45720" rIns="91440" bIns="45720" numCol="1" spcCol="0" rtlCol="0" fromWordArt="0" anchor="ctr" anchorCtr="0" forceAA="0" compatLnSpc="1">
-                        <a:prstTxWarp prst="textNoShape">
-                          <a:avLst/>
-                        </a:prstTxWarp>
-                        <a:noAutofit/>
-                      </wps:bodyPr>
-                    </wps:wsp>
-                  </a:graphicData>
-                </a:graphic>
-              </wp:anchor>
-            </w:drawing>
-          </mc:Choice>
-          <mc:Fallback>
-            <w:pict>
-              <v:rect w14:anchorId="4A70BBC6" id="Rectangle 9" o:spid="_x0000_s1026" style="position:absolute;margin-left:-31pt;margin-top:-6pt;width:135.5pt;height:157pt;z-index:251665408;visibility:visible;mso-wrap-style:square;mso-wrap-distance-left:9pt;mso-wrap-distance-top:0;mso-wrap-distance-right:9pt;mso-wrap-distance-bottom:0;mso-position-horizontal:absolute;mso-position-horizontal-relative:text;mso-position-vertical:absolute;mso-position-vertical-relative:text;v-text-anchor:middle" o:gfxdata="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" filled="f" strokecolor="#030e13 [484]" strokeweight="1.5pt"/>
-            </w:pict>
-          </mc:Fallback>
-        </mc:AlternateContent>
-      </w:r>
-      <w:r>
-        <w:t>CATEGORY</w:t>
-      </w:r>
-      <w:r>
-        <w:tab/>
-        <w:t>ROUTE</w:t>
-      </w:r>
-    </w:p>
-    <w:p>
-      <w:pPr>
-        <w:tabs>
-          <w:tab w:val="center" w:pos="4513"/>
-        </w:tabs>
-      </w:pPr>
-      <w:proofErr w:type="spellStart"/>
-      <w:r>
-        <w:t>CategoryID</w:t>
-      </w:r>
-      <w:proofErr w:type="spellEnd"/>
-      <w:r>
-        <w:t xml:space="preserve">   PK</w:t>
-      </w:r>
-      <w:r>
-        <w:tab/>
-      </w:r>
-      <w:proofErr w:type="spellStart"/>
-      <w:proofErr w:type="gramStart"/>
-      <w:r>
-        <w:t>RouteID</w:t>
-      </w:r>
-      <w:proofErr w:type="spellEnd"/>
-      <w:r>
-        <w:t xml:space="preserve">  PK</w:t>
-      </w:r>
-      <w:proofErr w:type="gramEnd"/>
-    </w:p>
-    <w:p>
-      <w:pPr>
-        <w:tabs>
-          <w:tab w:val="left" w:pos="2930"/>
-          <w:tab w:val="center" w:pos="4513"/>
-        </w:tabs>
-      </w:pPr>
-      <w:proofErr w:type="spellStart"/>
-      <w:r>
-        <w:t>EventID</w:t>
-      </w:r>
-      <w:proofErr w:type="spellEnd"/>
-      <w:r>
-        <w:t xml:space="preserve">         FK</w:t>
-      </w:r>
-      <w:r>
-        <w:tab/>
-      </w:r>
-      <w:r>
-        <w:tab/>
-      </w:r>
-      <w:proofErr w:type="spellStart"/>
-      <w:proofErr w:type="gramStart"/>
-      <w:r>
-        <w:t>EventID</w:t>
-      </w:r>
-      <w:proofErr w:type="spellEnd"/>
-      <w:r>
-        <w:t xml:space="preserve">  FK</w:t>
-      </w:r>
-      <w:proofErr w:type="gramEnd"/>
-    </w:p>
-    <w:p>
-      <w:pPr>
-        <w:tabs>
-          <w:tab w:val="center" w:pos="4513"/>
-        </w:tabs>
-      </w:pPr>
-      <w:r>
-        <w:t>Category Name</w:t>
-      </w:r>
-      <w:r>
-        <w:tab/>
-        <w:t>Route Name</w:t>
-      </w:r>
-    </w:p>
-    <w:p>
-      <w:pPr>
-        <w:tabs>
-          <w:tab w:val="left" w:pos="3980"/>
-        </w:tabs>
-      </w:pPr>
-      <w:r>
-        <w:t xml:space="preserve">Category type </w:t>
-      </w:r>
-      <w:r>
-        <w:tab/>
-        <w:t>Distance</w:t>
-      </w:r>
-    </w:p>
-    <w:p>
-      <w:pPr>
-        <w:jc w:val="center"/>
-      </w:pPr>
-      <w:r>
-        <w:t>Description</w:t>
-      </w:r>
-    </w:p>
-    <w:p>
-      <w:pPr>
-        <w:jc w:val="center"/>
-      </w:pPr>
-      <w:r>
-        <w:rPr>
-          <w:noProof/>
-        </w:rPr>
-        <mc:AlternateContent>
-          <mc:Choice Requires="wps">
-            <w:drawing>
-              <wp:anchor distT="0" distB="0" distL="114300" distR="114300" simplePos="0" relativeHeight="251658253" behindDoc="0" locked="0" layoutInCell="1" allowOverlap="1" wp14:anchorId="26FBAC23" wp14:editId="318927E9">
-                <wp:simplePos x="0" y="0"/>
-                <wp:positionH relativeFrom="column">
-                  <wp:posOffset>1225550</wp:posOffset>
-                </wp:positionH>
-                <wp:positionV relativeFrom="paragraph">
-                  <wp:posOffset>66040</wp:posOffset>
-                </wp:positionV>
-                <wp:extent cx="19050" cy="1384300"/>
-                <wp:effectExtent l="38100" t="0" r="57150" b="63500"/>
-                <wp:wrapNone/>
-                <wp:docPr id="1266683633" name="Straight Arrow Connector 26"/>
-                <wp:cNvGraphicFramePr/>
-                <a:graphic xmlns:a="http://schemas.openxmlformats.org/drawingml/2006/main">
-                  <a:graphicData uri="http://schemas.microsoft.com/office/word/2010/wordprocessingShape">
-                    <wps:wsp>
-                      <wps:cNvCnPr/>
-                      <wps:spPr>
-                        <a:xfrm>
-                          <a:off x="0" y="0"/>
-                          <a:ext cx="19050" cy="1384300"/>
-                        </a:xfrm>
-                        <a:prstGeom prst="straightConnector1">
-                          <a:avLst/>
-                        </a:prstGeom>
-                        <a:ln>
-                          <a:solidFill>
-                            <a:schemeClr val="tx1"/>
-                          </a:solidFill>
-                          <a:tailEnd type="triangle"/>
-                        </a:ln>
-                      </wps:spPr>
-                      <wps:style>
-                        <a:lnRef idx="2">
-                          <a:schemeClr val="accent1"/>
-                        </a:lnRef>
-                        <a:fillRef idx="0">
-                          <a:schemeClr val="accent1"/>
-                        </a:fillRef>
-                        <a:effectRef idx="1">
-                          <a:schemeClr val="accent1"/>
-                        </a:effectRef>
-                        <a:fontRef idx="minor">
-                          <a:schemeClr val="tx1"/>
-                        </a:fontRef>
-                      </wps:style>
-                      <wps:bodyPr/>
-                    </wps:wsp>
-                  </a:graphicData>
-                </a:graphic>
-              </wp:anchor>
-            </w:drawing>
-          </mc:Choice>
-          <mc:Fallback>
-            <w:pict>
-              <v:shape w14:anchorId="1C0CF4D2" id="Straight Arrow Connector 26" o:spid="_x0000_s1026" type="#_x0000_t32" style="position:absolute;margin-left:96.5pt;margin-top:5.2pt;width:1.5pt;height:109pt;z-index:251674624;visibility:visible;mso-wrap-style:square;mso-wrap-distance-left:9pt;mso-wrap-distance-top:0;mso-wrap-distance-right:9pt;mso-wrap-distance-bottom:0;mso-position-horizontal:absolute;mso-position-horizontal-relative:text;mso-position-vertical:absolute;mso-position-vertical-relative:text" o:gfxdata="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" strokecolor="black [3213]" strokeweight="1.5pt">
-                <v:stroke endarrow="block" joinstyle="miter"/>
-              </v:shape>
-            </w:pict>
-          </mc:Fallback>
-        </mc:AlternateContent>
-      </w:r>
-    </w:p>
-    <w:p>
-      <w:pPr>
-        <w:jc w:val="center"/>
-      </w:pPr>
-    </w:p>
-    <w:p>
-      <w:pPr>
-        <w:tabs>
-          <w:tab w:val="left" w:pos="1100"/>
-        </w:tabs>
-      </w:pPr>
-      <w:r>
-        <w:tab/>
-        <w:t>1:M</w:t>
-      </w:r>
-    </w:p>
-    <w:p>
-      <w:pPr>
-        <w:jc w:val="center"/>
-      </w:pPr>
-    </w:p>
-    <w:p>
-      <w:pPr>
-        <w:jc w:val="center"/>
-      </w:pPr>
-    </w:p>
-    <w:p>
-      <w:pPr>
-        <w:tabs>
-          <w:tab w:val="left" w:pos="1670"/>
-          <w:tab w:val="center" w:pos="4513"/>
-        </w:tabs>
-      </w:pPr>
-      <w:r>
-        <w:rPr>
-          <w:noProof/>
-        </w:rPr>
-        <mc:AlternateContent>
-          <mc:Choice Requires="wps">
-            <w:drawing>
-              <wp:anchor distT="0" distB="0" distL="114300" distR="114300" simplePos="0" relativeHeight="251658255" behindDoc="0" locked="0" layoutInCell="1" allowOverlap="1" wp14:anchorId="16BF90D9" wp14:editId="74B37D38">
-                <wp:simplePos x="0" y="0"/>
-                <wp:positionH relativeFrom="column">
-                  <wp:posOffset>368300</wp:posOffset>
-                </wp:positionH>
-                <wp:positionV relativeFrom="paragraph">
-                  <wp:posOffset>194945</wp:posOffset>
-                </wp:positionV>
-                <wp:extent cx="2247900" cy="19050"/>
-                <wp:effectExtent l="0" t="0" r="19050" b="19050"/>
-                <wp:wrapNone/>
-                <wp:docPr id="1867644766" name="Straight Connector 28"/>
-                <wp:cNvGraphicFramePr/>
-                <a:graphic xmlns:a="http://schemas.openxmlformats.org/drawingml/2006/main">
-                  <a:graphicData uri="http://schemas.microsoft.com/office/word/2010/wordprocessingShape">
-                    <wps:wsp>
-                      <wps:cNvCnPr/>
-                      <wps:spPr>
-                        <a:xfrm>
-                          <a:off x="0" y="0"/>
-                          <a:ext cx="2247900" cy="19050"/>
-                        </a:xfrm>
-                        <a:prstGeom prst="line">
-                          <a:avLst/>
-                        </a:prstGeom>
-                        <a:ln>
-                          <a:solidFill>
-                            <a:schemeClr val="tx1"/>
-                          </a:solidFill>
-                        </a:ln>
-                      </wps:spPr>
-                      <wps:style>
-                        <a:lnRef idx="2">
-                          <a:schemeClr val="accent1"/>
-                        </a:lnRef>
-                        <a:fillRef idx="0">
-                          <a:schemeClr val="accent1"/>
-                        </a:fillRef>
-                        <a:effectRef idx="1">
-                          <a:schemeClr val="accent1"/>
-                        </a:effectRef>
-                        <a:fontRef idx="minor">
-                          <a:schemeClr val="tx1"/>
-                        </a:fontRef>
-                      </wps:style>
-                      <wps:bodyPr/>
-                    </wps:wsp>
-                  </a:graphicData>
-                </a:graphic>
-              </wp:anchor>
-            </w:drawing>
-          </mc:Choice>
-          <mc:Fallback>
-            <w:pict>
-              <v:line w14:anchorId="7402AB05" id="Straight Connector 28" o:spid="_x0000_s1026" style="position:absolute;z-index:251676672;visibility:visible;mso-wrap-style:square;mso-wrap-distance-left:9pt;mso-wrap-distance-top:0;mso-wrap-distance-right:9pt;mso-wrap-distance-bottom:0;mso-position-horizontal:absolute;mso-position-horizontal-relative:text;mso-position-vertical:absolute;mso-position-vertical-relative:text" from="29pt,15.35pt" to="206pt,16.85pt" o:gfxdata="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" strokecolor="black [3213]" strokeweight="1.5pt">
-                <v:stroke joinstyle="miter"/>
-              </v:line>
-            </w:pict>
-          </mc:Fallback>
-        </mc:AlternateContent>
-      </w:r>
-      <w:r>
-        <w:tab/>
-        <w:t>ENROLMENT</w:t>
-      </w:r>
-      <w:r>
-        <w:tab/>
-      </w:r>
-      <w:r>
-        <w:rPr>
-          <w:noProof/>
-        </w:rPr>
-        <mc:AlternateContent>
-          <mc:Choice Requires="wps">
-            <w:drawing>
-              <wp:anchor distT="0" distB="0" distL="114300" distR="114300" simplePos="0" relativeHeight="251658254" behindDoc="0" locked="0" layoutInCell="1" allowOverlap="1" wp14:anchorId="27A3870E" wp14:editId="0D26D9BE">
-                <wp:simplePos x="0" y="0"/>
-                <wp:positionH relativeFrom="column">
-                  <wp:posOffset>368300</wp:posOffset>
-                </wp:positionH>
-                <wp:positionV relativeFrom="paragraph">
-                  <wp:posOffset>4445</wp:posOffset>
-                </wp:positionV>
-                <wp:extent cx="2241550" cy="2209800"/>
-                <wp:effectExtent l="0" t="0" r="25400" b="19050"/>
-                <wp:wrapNone/>
-                <wp:docPr id="2073679378" name="Rectangle 27"/>
-                <wp:cNvGraphicFramePr/>
-                <a:graphic xmlns:a="http://schemas.openxmlformats.org/drawingml/2006/main">
-                  <a:graphicData uri="http://schemas.microsoft.com/office/word/2010/wordprocessingShape">
-                    <wps:wsp>
-                      <wps:cNvSpPr/>
-                      <wps:spPr>
-                        <a:xfrm>
-                          <a:off x="0" y="0"/>
-                          <a:ext cx="2241550" cy="2209800"/>
-                        </a:xfrm>
-                        <a:prstGeom prst="rect">
-                          <a:avLst/>
-                        </a:prstGeom>
-                        <a:noFill/>
-                      </wps:spPr>
-                      <wps:style>
-                        <a:lnRef idx="2">
-                          <a:schemeClr val="accent1">
-                            <a:shade val="15000"/>
-                          </a:schemeClr>
-                        </a:lnRef>
-                        <a:fillRef idx="1">
-                          <a:schemeClr val="accent1"/>
-                        </a:fillRef>
-                        <a:effectRef idx="0">
-                          <a:schemeClr val="accent1"/>
-                        </a:effectRef>
-                        <a:fontRef idx="minor">
-                          <a:schemeClr val="lt1"/>
-                        </a:fontRef>
-                      </wps:style>
-                      <wps:bodyPr rot="0" spcFirstLastPara="0" vertOverflow="overflow" horzOverflow="overflow" vert="horz" wrap="square" lIns="91440" tIns="45720" rIns="91440" bIns="45720" numCol="1" spcCol="0" rtlCol="0" fromWordArt="0" anchor="ctr" anchorCtr="0" forceAA="0" compatLnSpc="1">
-                        <a:prstTxWarp prst="textNoShape">
-                          <a:avLst/>
-                        </a:prstTxWarp>
-                        <a:noAutofit/>
-                      </wps:bodyPr>
-                    </wps:wsp>
-                  </a:graphicData>
-                </a:graphic>
-              </wp:anchor>
-            </w:drawing>
-          </mc:Choice>
-          <mc:Fallback>
-            <w:pict>
-              <v:rect w14:anchorId="41E8D9EA" id="Rectangle 27" o:spid="_x0000_s1026" style="position:absolute;margin-left:29pt;margin-top:.35pt;width:176.5pt;height:174pt;z-index:251675648;visibility:visible;mso-wrap-style:square;mso-wrap-distance-left:9pt;mso-wrap-distance-top:0;mso-wrap-distance-right:9pt;mso-wrap-distance-bottom:0;mso-position-horizontal:absolute;mso-position-horizontal-relative:text;mso-position-vertical:absolute;mso-position-vertical-relative:text;v-text-anchor:middle" o:gfxdata="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" filled="f" strokecolor="#030e13 [484]" strokeweight="1.5pt"/>
-            </w:pict>
-          </mc:Fallback>
-        </mc:AlternateContent>
-      </w:r>
-    </w:p>
-    <w:p>
-      <w:pPr>
-        <w:tabs>
-          <w:tab w:val="left" w:pos="1670"/>
-        </w:tabs>
-      </w:pPr>
-      <w:r>
-        <w:tab/>
-      </w:r>
-      <w:proofErr w:type="spellStart"/>
-      <w:r>
-        <w:t>enrolmentID</w:t>
-      </w:r>
-      <w:proofErr w:type="spellEnd"/>
-      <w:r>
-        <w:t xml:space="preserve"> PK</w:t>
-      </w:r>
-    </w:p>
-    <w:p>
-      <w:pPr>
-        <w:tabs>
-          <w:tab w:val="left" w:pos="1660"/>
-        </w:tabs>
-      </w:pPr>
-      <w:r>
-        <w:tab/>
-      </w:r>
-      <w:proofErr w:type="spellStart"/>
-      <w:r>
-        <w:t>participantID</w:t>
-      </w:r>
-      <w:proofErr w:type="spellEnd"/>
-      <w:r>
-        <w:t xml:space="preserve"> FK</w:t>
-      </w:r>
-    </w:p>
-    <w:p>
-      <w:pPr>
-        <w:tabs>
-          <w:tab w:val="left" w:pos="1680"/>
-        </w:tabs>
-      </w:pPr>
-      <w:r>
-        <w:tab/>
-      </w:r>
-      <w:proofErr w:type="spellStart"/>
-      <w:r>
-        <w:t>EventID</w:t>
-      </w:r>
-      <w:proofErr w:type="spellEnd"/>
-      <w:r>
-        <w:t xml:space="preserve"> FK</w:t>
-      </w:r>
-    </w:p>
-    <w:p>
-      <w:pPr>
-        <w:tabs>
-          <w:tab w:val="left" w:pos="1700"/>
-        </w:tabs>
-      </w:pPr>
-      <w:r>
-        <w:tab/>
-      </w:r>
-      <w:proofErr w:type="spellStart"/>
-      <w:r>
-        <w:t>categoryID</w:t>
-      </w:r>
-      <w:proofErr w:type="spellEnd"/>
-      <w:r>
-        <w:t xml:space="preserve"> FK</w:t>
-      </w:r>
-    </w:p>
-    <w:p>
-      <w:pPr>
-        <w:tabs>
-          <w:tab w:val="left" w:pos="1710"/>
-        </w:tabs>
-      </w:pPr>
-      <w:r>
-        <w:tab/>
-      </w:r>
-      <w:proofErr w:type="spellStart"/>
-      <w:r>
-        <w:t>enrolmentDate</w:t>
-      </w:r>
-      <w:proofErr w:type="spellEnd"/>
-    </w:p>
-    <w:p>
-      <w:pPr>
-        <w:jc w:val="center"/>
-      </w:pPr>
-      <w:r>
-        <w:rPr>
-          <w:noProof/>
-        </w:rPr>
-        <mc:AlternateContent>
-          <mc:Choice Requires="wps">
-            <w:drawing>
-              <wp:anchor distT="0" distB="0" distL="114300" distR="114300" simplePos="0" relativeHeight="251658256" behindDoc="0" locked="0" layoutInCell="1" allowOverlap="1" wp14:anchorId="7AC2CA82" wp14:editId="7D1DDBA0">
-                <wp:simplePos x="0" y="0"/>
-                <wp:positionH relativeFrom="column">
-                  <wp:posOffset>1873250</wp:posOffset>
-                </wp:positionH>
-                <wp:positionV relativeFrom="paragraph">
-                  <wp:posOffset>286385</wp:posOffset>
-                </wp:positionV>
-                <wp:extent cx="12700" cy="996950"/>
-                <wp:effectExtent l="38100" t="0" r="63500" b="50800"/>
-                <wp:wrapNone/>
-                <wp:docPr id="1390544306" name="Straight Arrow Connector 29"/>
-                <wp:cNvGraphicFramePr/>
-                <a:graphic xmlns:a="http://schemas.openxmlformats.org/drawingml/2006/main">
-                  <a:graphicData uri="http://schemas.microsoft.com/office/word/2010/wordprocessingShape">
-                    <wps:wsp>
-                      <wps:cNvCnPr/>
-                      <wps:spPr>
-                        <a:xfrm>
-                          <a:off x="0" y="0"/>
-                          <a:ext cx="12700" cy="996950"/>
-                        </a:xfrm>
-                        <a:prstGeom prst="straightConnector1">
-                          <a:avLst/>
-                        </a:prstGeom>
-                        <a:ln>
-                          <a:solidFill>
-                            <a:schemeClr val="tx1"/>
-                          </a:solidFill>
-                          <a:tailEnd type="triangle"/>
-                        </a:ln>
-                      </wps:spPr>
-                      <wps:style>
-                        <a:lnRef idx="2">
-                          <a:schemeClr val="accent1"/>
-                        </a:lnRef>
-                        <a:fillRef idx="0">
-                          <a:schemeClr val="accent1"/>
-                        </a:fillRef>
-                        <a:effectRef idx="1">
-                          <a:schemeClr val="accent1"/>
-                        </a:effectRef>
-                        <a:fontRef idx="minor">
-                          <a:schemeClr val="tx1"/>
-                        </a:fontRef>
-                      </wps:style>
-                      <wps:bodyPr/>
-                    </wps:wsp>
-                  </a:graphicData>
-                </a:graphic>
-              </wp:anchor>
-            </w:drawing>
-          </mc:Choice>
-          <mc:Fallback>
-            <w:pict>
-              <v:shape w14:anchorId="089BDAF6" id="Straight Arrow Connector 29" o:spid="_x0000_s1026" type="#_x0000_t32" style="position:absolute;margin-left:147.5pt;margin-top:22.55pt;width:1pt;height:78.5pt;z-index:251677696;visibility:visible;mso-wrap-style:square;mso-wrap-distance-left:9pt;mso-wrap-distance-top:0;mso-wrap-distance-right:9pt;mso-wrap-distance-bottom:0;mso-position-horizontal:absolute;mso-position-horizontal-relative:text;mso-position-vertical:absolute;mso-position-vertical-relative:text" o:gfxdata="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" strokecolor="black [3213]" strokeweight="1.5pt">
-                <v:stroke endarrow="block" joinstyle="miter"/>
-              </v:shape>
-            </w:pict>
-          </mc:Fallback>
-        </mc:AlternateContent>
-      </w:r>
-    </w:p>
-    <w:p>
-      <w:pPr>
-        <w:jc w:val="center"/>
-      </w:pPr>
-    </w:p>
-    <w:p>
-      <w:pPr>
-        <w:jc w:val="center"/>
-      </w:pPr>
-      <w:r>
-        <w:t>1:0….1</w:t>
-      </w:r>
-    </w:p>
-    <w:p>
-      <w:pPr>
-        <w:jc w:val="center"/>
-      </w:pPr>
-    </w:p>
-    <w:p>
-      <w:pPr>
-        <w:jc w:val="center"/>
-      </w:pPr>
-      <w:r>
-        <w:rPr>
-          <w:noProof/>
-        </w:rPr>
-        <mc:AlternateContent>
-          <mc:Choice Requires="wps">
-            <w:drawing>
-              <wp:anchor distT="0" distB="0" distL="114300" distR="114300" simplePos="0" relativeHeight="251658251" behindDoc="0" locked="0" layoutInCell="1" allowOverlap="1" wp14:anchorId="7B4E189D" wp14:editId="595BB997">
-                <wp:simplePos x="0" y="0"/>
-                <wp:positionH relativeFrom="column">
-                  <wp:posOffset>1670050</wp:posOffset>
-                </wp:positionH>
-                <wp:positionV relativeFrom="paragraph">
-                  <wp:posOffset>59690</wp:posOffset>
-                </wp:positionV>
-                <wp:extent cx="1860550" cy="2387600"/>
-                <wp:effectExtent l="0" t="0" r="25400" b="12700"/>
-                <wp:wrapNone/>
-                <wp:docPr id="493349602" name="Rectangle 24"/>
-                <wp:cNvGraphicFramePr/>
-                <a:graphic xmlns:a="http://schemas.openxmlformats.org/drawingml/2006/main">
-                  <a:graphicData uri="http://schemas.microsoft.com/office/word/2010/wordprocessingShape">
-                    <wps:wsp>
-                      <wps:cNvSpPr/>
-                      <wps:spPr>
-                        <a:xfrm>
-                          <a:off x="0" y="0"/>
-                          <a:ext cx="1860550" cy="2387600"/>
-                        </a:xfrm>
-                        <a:prstGeom prst="rect">
-                          <a:avLst/>
-                        </a:prstGeom>
-                        <a:noFill/>
-                        <a:ln>
-                          <a:solidFill>
-                            <a:schemeClr val="tx1"/>
-                          </a:solidFill>
-                        </a:ln>
-                      </wps:spPr>
-                      <wps:style>
-                        <a:lnRef idx="2">
-                          <a:schemeClr val="accent1">
-                            <a:shade val="15000"/>
-                          </a:schemeClr>
-                        </a:lnRef>
-                        <a:fillRef idx="1">
-                          <a:schemeClr val="accent1"/>
-                        </a:fillRef>
-                        <a:effectRef idx="0">
-                          <a:schemeClr val="accent1"/>
-                        </a:effectRef>
-                        <a:fontRef idx="minor">
-                          <a:schemeClr val="lt1"/>
-                        </a:fontRef>
-                      </wps:style>
-                      <wps:bodyPr rot="0" spcFirstLastPara="0" vertOverflow="overflow" horzOverflow="overflow" vert="horz" wrap="square" lIns="91440" tIns="45720" rIns="91440" bIns="45720" numCol="1" spcCol="0" rtlCol="0" fromWordArt="0" anchor="ctr" anchorCtr="0" forceAA="0" compatLnSpc="1">
-                        <a:prstTxWarp prst="textNoShape">
-                          <a:avLst/>
-                        </a:prstTxWarp>
-                        <a:noAutofit/>
-                      </wps:bodyPr>
-                    </wps:wsp>
-                  </a:graphicData>
-                </a:graphic>
-              </wp:anchor>
-            </w:drawing>
-          </mc:Choice>
-          <mc:Fallback>
-            <w:pict>
-              <v:rect w14:anchorId="2F0EC2DA" id="Rectangle 24" o:spid="_x0000_s1026" style="position:absolute;margin-left:131.5pt;margin-top:4.7pt;width:146.5pt;height:188pt;z-index:251672576;visibility:visible;mso-wrap-style:square;mso-wrap-distance-left:9pt;mso-wrap-distance-top:0;mso-wrap-distance-right:9pt;mso-wrap-distance-bottom:0;mso-position-horizontal:absolute;mso-position-horizontal-relative:text;mso-position-vertical:absolute;mso-position-vertical-relative:text;v-text-anchor:middle" o:gfxdata="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" filled="f" strokecolor="black [3213]" strokeweight="1.5pt"/>
-            </w:pict>
-          </mc:Fallback>
-        </mc:AlternateContent>
-      </w:r>
-    </w:p>
-    <w:p>
-      <w:pPr>
-        <w:tabs>
-          <w:tab w:val="left" w:pos="3020"/>
-        </w:tabs>
-      </w:pPr>
-      <w:r>
-        <w:rPr>
-          <w:noProof/>
-        </w:rPr>
-        <mc:AlternateContent>
-          <mc:Choice Requires="wps">
-            <w:drawing>
-              <wp:anchor distT="0" distB="0" distL="114300" distR="114300" simplePos="0" relativeHeight="251658252" behindDoc="0" locked="0" layoutInCell="1" allowOverlap="1" wp14:anchorId="78F440EC" wp14:editId="62FAFF37">
-                <wp:simplePos x="0" y="0"/>
-                <wp:positionH relativeFrom="column">
-                  <wp:posOffset>1657350</wp:posOffset>
-                </wp:positionH>
-                <wp:positionV relativeFrom="paragraph">
-                  <wp:posOffset>154940</wp:posOffset>
-                </wp:positionV>
-                <wp:extent cx="1873250" cy="0"/>
-                <wp:effectExtent l="0" t="0" r="0" b="0"/>
-                <wp:wrapNone/>
-                <wp:docPr id="1052521857" name="Straight Connector 25"/>
-                <wp:cNvGraphicFramePr/>
-                <a:graphic xmlns:a="http://schemas.openxmlformats.org/drawingml/2006/main">
-                  <a:graphicData uri="http://schemas.microsoft.com/office/word/2010/wordprocessingShape">
-                    <wps:wsp>
-                      <wps:cNvCnPr/>
-                      <wps:spPr>
-                        <a:xfrm>
-                          <a:off x="0" y="0"/>
-                          <a:ext cx="1873250" cy="0"/>
-                        </a:xfrm>
-                        <a:prstGeom prst="line">
-                          <a:avLst/>
-                        </a:prstGeom>
-                        <a:ln>
-                          <a:solidFill>
-                            <a:schemeClr val="tx1"/>
-                          </a:solidFill>
-                        </a:ln>
-                      </wps:spPr>
-                      <wps:style>
-                        <a:lnRef idx="2">
-                          <a:schemeClr val="accent1"/>
-                        </a:lnRef>
-                        <a:fillRef idx="0">
-                          <a:schemeClr val="accent1"/>
-                        </a:fillRef>
-                        <a:effectRef idx="1">
-                          <a:schemeClr val="accent1"/>
-                        </a:effectRef>
-                        <a:fontRef idx="minor">
-                          <a:schemeClr val="tx1"/>
-                        </a:fontRef>
-                      </wps:style>
-                      <wps:bodyPr/>
-                    </wps:wsp>
-                  </a:graphicData>
-                </a:graphic>
-              </wp:anchor>
-            </w:drawing>
-          </mc:Choice>
-          <mc:Fallback>
-            <w:pict>
-              <v:line w14:anchorId="23645077" id="Straight Connector 25" o:spid="_x0000_s1026" style="position:absolute;z-index:251673600;visibility:visible;mso-wrap-style:square;mso-wrap-distance-left:9pt;mso-wrap-distance-top:0;mso-wrap-distance-right:9pt;mso-wrap-distance-bottom:0;mso-position-horizontal:absolute;mso-position-horizontal-relative:text;mso-position-vertical:absolute;mso-position-vertical-relative:text" from="130.5pt,12.2pt" to="278pt,12.2pt" o:gfxdata="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" strokecolor="black [3213]" strokeweight="1.5pt">
-                <v:stroke joinstyle="miter"/>
-              </v:line>
-            </w:pict>
-          </mc:Fallback>
-        </mc:AlternateContent>
-      </w:r>
-      <w:r>
-        <w:tab/>
-        <w:t xml:space="preserve">RESULT </w:t>
-      </w:r>
-    </w:p>
-    <w:p>
-      <w:pPr>
-        <w:tabs>
-          <w:tab w:val="left" w:pos="3020"/>
-        </w:tabs>
-      </w:pPr>
-      <w:r>
-        <w:tab/>
-      </w:r>
-      <w:proofErr w:type="spellStart"/>
-      <w:r>
-        <w:t>ResultID</w:t>
-      </w:r>
-      <w:proofErr w:type="spellEnd"/>
-      <w:r>
-        <w:t xml:space="preserve"> PK</w:t>
-      </w:r>
-    </w:p>
-    <w:p>
-      <w:pPr>
-        <w:tabs>
-          <w:tab w:val="left" w:pos="3080"/>
-        </w:tabs>
-      </w:pPr>
-      <w:r>
-        <w:tab/>
-      </w:r>
-      <w:proofErr w:type="spellStart"/>
-      <w:r>
-        <w:t>EnrolmentID</w:t>
-      </w:r>
-      <w:proofErr w:type="spellEnd"/>
-      <w:r>
-        <w:t xml:space="preserve"> FK</w:t>
+        <w:t xml:space="preserve">SECTION A </w:t>
       </w:r>
     </w:p>
     <w:p>
@@ -1841,10 +69,6 @@
           <w:tab w:val="left" w:pos="3160"/>
         </w:tabs>
       </w:pPr>
-      <w:r>
-        <w:tab/>
-        <w:t xml:space="preserve"> Finish Time</w:t>
-      </w:r>
     </w:p>
     <w:p>
       <w:pPr>
@@ -1853,12 +77,55 @@
         </w:tabs>
       </w:pPr>
       <w:r>
-        <w:tab/>
-        <w:t>Finishing position</w:t>
+        <w:rPr>
+          <w:noProof/>
+        </w:rPr>
+        <w:drawing>
+          <wp:inline distT="0" distB="0" distL="0" distR="0" wp14:anchorId="67D55D0C" wp14:editId="21AF7609">
+            <wp:extent cx="3104394" cy="8096250"/>
+            <wp:effectExtent l="0" t="0" r="1270" b="0"/>
+            <wp:docPr id="1649565149" name="Picture 18"/>
+            <wp:cNvGraphicFramePr>
+              <a:graphicFrameLocks xmlns:a="http://schemas.openxmlformats.org/drawingml/2006/main" noChangeAspect="1"/>
+            </wp:cNvGraphicFramePr>
+            <a:graphic xmlns:a="http://schemas.openxmlformats.org/drawingml/2006/main">
+              <a:graphicData uri="http://schemas.openxmlformats.org/drawingml/2006/picture">
+                <pic:pic xmlns:pic="http://schemas.openxmlformats.org/drawingml/2006/picture">
+                  <pic:nvPicPr>
+                    <pic:cNvPr id="1649565149" name="Picture 1649565149"/>
+                    <pic:cNvPicPr/>
+                  </pic:nvPicPr>
+                  <pic:blipFill>
+                    <a:blip r:embed="rId6">
+                      <a:extLst>
+                        <a:ext uri="{28A0092B-C50C-407E-A947-70E740481C1C}">
+                          <a14:useLocalDpi xmlns:a14="http://schemas.microsoft.com/office/drawing/2010/main" val="0"/>
+                        </a:ext>
+                      </a:extLst>
+                    </a:blip>
+                    <a:stretch>
+                      <a:fillRect/>
+                    </a:stretch>
+                  </pic:blipFill>
+                  <pic:spPr>
+                    <a:xfrm>
+                      <a:off x="0" y="0"/>
+                      <a:ext cx="3106472" cy="8101670"/>
+                    </a:xfrm>
+                    <a:prstGeom prst="rect">
+                      <a:avLst/>
+                    </a:prstGeom>
+                  </pic:spPr>
+                </pic:pic>
+              </a:graphicData>
+            </a:graphic>
+          </wp:inline>
+        </w:drawing>
       </w:r>
     </w:p>
     <w:p>
       <w:r>
+        <w:lastRenderedPageBreak/>
         <w:br w:type="page"/>
       </w:r>
     </w:p>
@@ -4225,6 +2492,45 @@
         </w:tabs>
       </w:pPr>
     </w:p>
+    <w:p>
+      <w:pPr>
+        <w:tabs>
+          <w:tab w:val="left" w:pos="3160"/>
+        </w:tabs>
+      </w:pPr>
+    </w:p>
+    <w:p>
+      <w:pPr>
+        <w:tabs>
+          <w:tab w:val="left" w:pos="3160"/>
+        </w:tabs>
+      </w:pPr>
+    </w:p>
+    <w:p>
+      <w:pPr>
+        <w:tabs>
+          <w:tab w:val="left" w:pos="3160"/>
+        </w:tabs>
+      </w:pPr>
+    </w:p>
+    <w:p>
+      <w:pPr>
+        <w:tabs>
+          <w:tab w:val="left" w:pos="3160"/>
+        </w:tabs>
+        <w:rPr>
+          <w:b/>
+          <w:bCs/>
+        </w:rPr>
+      </w:pPr>
+      <w:r>
+        <w:rPr>
+          <w:b/>
+          <w:bCs/>
+        </w:rPr>
+        <w:t>SECTION C</w:t>
+      </w:r>
+    </w:p>
     <w:sectPr>
       <w:pgSz w:w="11906" w:h="16838"/>
       <w:pgMar w:top="1440" w:right="1440" w:bottom="1440" w:left="1440" w:header="708" w:footer="708" w:gutter="0"/>
@@ -4283,10 +2589,6 @@
     </w:p>
   </w:footnote>
 </w:footnotes>
-</file>
-
-<file path=word/numbering.xml><?xml version="1.0" encoding="utf-8"?>
-<w:numbering xmlns:wpc="http://schemas.microsoft.com/office/word/2010/wordprocessingCanvas" xmlns:cx="http://schemas.microsoft.com/office/drawing/2014/chartex" xmlns:cx1="http://schemas.microsoft.com/office/drawing/2015/9/8/chartex" xmlns:cx2="http://schemas.microsoft.com/office/drawing/2015/10/21/chartex" xmlns:cx3="http://schemas.microsoft.com/office/drawing/2016/5/9/chartex" xmlns:cx4="http://schemas.microsoft.com/office/drawing/2016/5/10/chartex" xmlns:cx5="http://schemas.microsoft.com/office/drawing/2016/5/11/chartex" xmlns:cx6="http://schemas.microsoft.com/office/drawing/2016/5/12/chartex" xmlns:cx7="http://schemas.microsoft.com/office/drawing/2016/5/13/chartex" xmlns:cx8="http://schemas.microsoft.com/office/drawing/2016/5/14/chartex" xmlns:mc="http://schemas.openxmlformats.org/markup-compatibility/2006" xmlns:aink="http://schemas.microsoft.com/office/drawing/2016/ink" xmlns:am3d="http://schemas.microsoft.com/office/drawing/2017/model3d" xmlns:o="urn:schemas-microsoft-com:office:office" xmlns:oel="http://schemas.microsoft.com/office/2019/extlst" xmlns:r="http://schemas.openxmlformats.org/officeDocument/2006/relationships" xmlns:m="http://schemas.openxmlformats.org/officeDocument/2006/math" xmlns:v="urn:schemas-microsoft-com:vml" xmlns:wp14="http://schemas.microsoft.com/office/word/2010/wordprocessingDrawing" xmlns:wp="http://schemas.openxmlformats.org/drawingml/2006/wordprocessingDrawing" xmlns:w10="urn:schemas-microsoft-com:office:word" xmlns:w="http://schemas.openxmlformats.org/wordprocessingml/2006/main" xmlns:w14="http://schemas.microsoft.com/office/word/2010/wordml" xmlns:w15="http://schemas.microsoft.com/office/word/2012/wordml" xmlns:w16cex="http://schemas.microsoft.com/office/word/2018/wordml/cex" xmlns:w16cid="http://schemas.microsoft.com/office/word/2016/wordml/cid" xmlns:w16="http://schemas.microsoft.com/office/word/2018/wordml" xmlns:w16du="http://schemas.microsoft.com/office/word/2023/wordml/word16du" xmlns:w16sdtdh="http://schemas.microsoft.com/office/word/2020/wordml/sdtdatahash" xmlns:w16sdtfl="http://schemas.microsoft.com/office/word/2024/wordml/sdtformatlock" xmlns:w16se="http://schemas.microsoft.com/office/word/2015/wordml/symex" xmlns:wpg="http://schemas.microsoft.com/office/word/2010/wordprocessingGroup" xmlns:wpi="http://schemas.microsoft.com/office/word/2010/wordprocessingInk" xmlns:wne="http://schemas.microsoft.com/office/word/2006/wordml" xmlns:wps="http://schemas.microsoft.com/office/word/2010/wordprocessingShape" mc:Ignorable="w14 w15 w16se w16cid w16 w16cex w16sdtdh w16sdtfl w16du wp14"/>
 </file>
 
 <file path=word/styles.xml><?xml version="1.0" encoding="utf-8"?>

</xml_diff>

<commit_message>
add authentication and user profile endpoints to Section B
</commit_message>
<xml_diff>
--- a/POE part 1 ST10568899 sesi mongatane.docx
+++ b/POE part 1 ST10568899 sesi mongatane.docx
@@ -125,21 +125,6 @@
     </w:p>
     <w:p>
       <w:r>
-        <w:lastRenderedPageBreak/>
-        <w:br w:type="page"/>
-      </w:r>
-    </w:p>
-    <w:p>
-      <w:pPr>
-        <w:tabs>
-          <w:tab w:val="left" w:pos="3160"/>
-        </w:tabs>
-        <w:rPr>
-          <w:b/>
-          <w:bCs/>
-        </w:rPr>
-      </w:pPr>
-      <w:r>
         <w:rPr>
           <w:b/>
           <w:bCs/>
@@ -177,15 +162,7 @@
         </w:tabs>
       </w:pPr>
       <w:r>
-        <w:t xml:space="preserve">The </w:t>
-      </w:r>
-      <w:proofErr w:type="spellStart"/>
-      <w:r>
-        <w:t>RaceDay</w:t>
-      </w:r>
-      <w:proofErr w:type="spellEnd"/>
-      <w:r>
-        <w:t xml:space="preserve"> API endpoint plan defines the HTTP methods, routes, access roles, request information and expected responses required to support the functional requirements of the system. The endpoints provide functionality for authentication, user profiles, event management, category management, event enrolments and participant results. Role-based access is used to ensure that Organisers and Participants can only perform actions appropriate to their roles.</w:t>
+        <w:t>The RaceDay API endpoint plan defines the HTTP methods, routes, access roles, request information and expected responses required to support the functional requirements of the system. The endpoints provide functionality for authentication, user profiles, event management, category management, event enrolments and participant results. Role-based access is used to ensure that Organisers and Participants can only perform actions appropriate to their roles.</w:t>
       </w:r>
     </w:p>
     <w:p>
@@ -355,15 +332,7 @@
               </w:tabs>
             </w:pPr>
             <w:r>
-              <w:t>/</w:t>
-            </w:r>
-            <w:proofErr w:type="spellStart"/>
-            <w:r>
-              <w:t>api</w:t>
-            </w:r>
-            <w:proofErr w:type="spellEnd"/>
-            <w:r>
-              <w:t>/auth/register</w:t>
+              <w:t>/api/auth/register</w:t>
             </w:r>
           </w:p>
         </w:tc>
@@ -378,15 +347,7 @@
               </w:tabs>
             </w:pPr>
             <w:r>
-              <w:t xml:space="preserve">Registers a new </w:t>
-            </w:r>
-            <w:proofErr w:type="spellStart"/>
-            <w:r>
-              <w:t>RaceDay</w:t>
-            </w:r>
-            <w:proofErr w:type="spellEnd"/>
-            <w:r>
-              <w:t xml:space="preserve"> user as a Participant or Organiser.</w:t>
+              <w:t>Registers a new RaceDay user as a Participant or Organiser.</w:t>
             </w:r>
           </w:p>
         </w:tc>
@@ -430,6 +391,9 @@
                 <w:tab w:val="left" w:pos="3160"/>
               </w:tabs>
             </w:pPr>
+            <w:r>
+              <w:t>201-</w:t>
+            </w:r>
             <w:r>
               <w:t xml:space="preserve">User created successfully </w:t>
             </w:r>
@@ -463,15 +427,7 @@
               </w:tabs>
             </w:pPr>
             <w:r>
-              <w:t>/</w:t>
-            </w:r>
-            <w:proofErr w:type="spellStart"/>
-            <w:r>
-              <w:t>api</w:t>
-            </w:r>
-            <w:proofErr w:type="spellEnd"/>
-            <w:r>
-              <w:t>/auth/login</w:t>
+              <w:t>/api/auth/login</w:t>
             </w:r>
           </w:p>
         </w:tc>
@@ -531,6 +487,9 @@
               </w:tabs>
             </w:pPr>
             <w:r>
+              <w:t>400-</w:t>
+            </w:r>
+            <w:r>
               <w:t xml:space="preserve">Login successful </w:t>
             </w:r>
           </w:p>
@@ -547,6 +506,9 @@
                 <w:tab w:val="left" w:pos="3160"/>
               </w:tabs>
             </w:pPr>
+            <w:r>
+              <w:t>401-</w:t>
+            </w:r>
             <w:r>
               <w:t>Unauthorized-</w:t>
             </w:r>
@@ -731,15 +693,7 @@
               </w:tabs>
             </w:pPr>
             <w:r>
-              <w:t>/</w:t>
-            </w:r>
-            <w:proofErr w:type="spellStart"/>
-            <w:r>
-              <w:t>api</w:t>
-            </w:r>
-            <w:proofErr w:type="spellEnd"/>
-            <w:r>
-              <w:t>/users/profile</w:t>
+              <w:t>/api/users/profile</w:t>
             </w:r>
           </w:p>
         </w:tc>
@@ -798,6 +752,12 @@
                 <w:tab w:val="left" w:pos="3160"/>
               </w:tabs>
             </w:pPr>
+            <w:r>
+              <w:t>200</w:t>
+            </w:r>
+            <w:r>
+              <w:t xml:space="preserve"> -</w:t>
+            </w:r>
             <w:r>
               <w:t xml:space="preserve">Profile details returned </w:t>
             </w:r>
@@ -832,15 +792,7 @@
               </w:tabs>
             </w:pPr>
             <w:r>
-              <w:t>/</w:t>
-            </w:r>
-            <w:proofErr w:type="spellStart"/>
-            <w:r>
-              <w:t>api</w:t>
-            </w:r>
-            <w:proofErr w:type="spellEnd"/>
-            <w:r>
-              <w:t>/users/profile</w:t>
+              <w:t>/api/users/profile</w:t>
             </w:r>
           </w:p>
         </w:tc>
@@ -899,6 +851,9 @@
                 <w:tab w:val="left" w:pos="3160"/>
               </w:tabs>
             </w:pPr>
+            <w:r>
+              <w:t>200-</w:t>
+            </w:r>
             <w:r>
               <w:t xml:space="preserve">Profile updated successfully </w:t>
             </w:r>
@@ -1063,15 +1018,7 @@
               </w:tabs>
             </w:pPr>
             <w:r>
-              <w:t>/</w:t>
-            </w:r>
-            <w:proofErr w:type="spellStart"/>
-            <w:r>
-              <w:t>api</w:t>
-            </w:r>
-            <w:proofErr w:type="spellEnd"/>
-            <w:r>
-              <w:t>/events</w:t>
+              <w:t>/api/events</w:t>
             </w:r>
           </w:p>
         </w:tc>
@@ -1130,6 +1077,9 @@
                 <w:tab w:val="left" w:pos="3160"/>
               </w:tabs>
             </w:pPr>
+            <w:r>
+              <w:t>200-</w:t>
+            </w:r>
             <w:r>
               <w:t xml:space="preserve">List of events returned </w:t>
             </w:r>
@@ -1163,17 +1113,7 @@
               </w:tabs>
             </w:pPr>
             <w:r>
-              <w:t>/</w:t>
-            </w:r>
-            <w:proofErr w:type="spellStart"/>
-            <w:proofErr w:type="gramStart"/>
-            <w:r>
-              <w:t>api</w:t>
-            </w:r>
-            <w:proofErr w:type="spellEnd"/>
-            <w:proofErr w:type="gramEnd"/>
-            <w:r>
-              <w:t>/events/{id}</w:t>
+              <w:t>/api/events/{id}</w:t>
             </w:r>
           </w:p>
         </w:tc>
@@ -1232,6 +1172,9 @@
                 <w:tab w:val="left" w:pos="3160"/>
               </w:tabs>
             </w:pPr>
+            <w:r>
+              <w:t>200-</w:t>
+            </w:r>
             <w:r>
               <w:t xml:space="preserve">Event details returned </w:t>
             </w:r>
@@ -1265,15 +1208,7 @@
               </w:tabs>
             </w:pPr>
             <w:r>
-              <w:t>/</w:t>
-            </w:r>
-            <w:proofErr w:type="spellStart"/>
-            <w:r>
-              <w:t>api</w:t>
-            </w:r>
-            <w:proofErr w:type="spellEnd"/>
-            <w:r>
-              <w:t>/events</w:t>
+              <w:t>/api/events</w:t>
             </w:r>
           </w:p>
         </w:tc>
@@ -1318,13 +1253,8 @@
               </w:tabs>
             </w:pPr>
             <w:r>
-              <w:t xml:space="preserve">Name, Description, Date, Location, Distance, </w:t>
-            </w:r>
-            <w:proofErr w:type="spellStart"/>
-            <w:r>
-              <w:t>EventType</w:t>
-            </w:r>
-            <w:proofErr w:type="spellEnd"/>
+              <w:t>Name, Description, Date, Location, Distance, EventType</w:t>
+            </w:r>
           </w:p>
         </w:tc>
         <w:tc>
@@ -1337,6 +1267,9 @@
                 <w:tab w:val="left" w:pos="3160"/>
               </w:tabs>
             </w:pPr>
+            <w:r>
+              <w:t>201-</w:t>
+            </w:r>
             <w:r>
               <w:t xml:space="preserve">Event created successfully </w:t>
             </w:r>
@@ -1370,17 +1303,7 @@
               </w:tabs>
             </w:pPr>
             <w:r>
-              <w:t>/</w:t>
-            </w:r>
-            <w:proofErr w:type="spellStart"/>
-            <w:proofErr w:type="gramStart"/>
-            <w:r>
-              <w:t>api</w:t>
-            </w:r>
-            <w:proofErr w:type="spellEnd"/>
-            <w:proofErr w:type="gramEnd"/>
-            <w:r>
-              <w:t>/events/{id}</w:t>
+              <w:t>/api/events/{id}</w:t>
             </w:r>
           </w:p>
         </w:tc>
@@ -1425,13 +1348,8 @@
               </w:tabs>
             </w:pPr>
             <w:r>
-              <w:t xml:space="preserve">Name, Description, Date, Location, Distance, </w:t>
-            </w:r>
-            <w:proofErr w:type="spellStart"/>
-            <w:r>
-              <w:t>EventType</w:t>
-            </w:r>
-            <w:proofErr w:type="spellEnd"/>
+              <w:t>Name, Description, Date, Location, Distance, EventType</w:t>
+            </w:r>
           </w:p>
         </w:tc>
         <w:tc>
@@ -1444,6 +1362,9 @@
                 <w:tab w:val="left" w:pos="3160"/>
               </w:tabs>
             </w:pPr>
+            <w:r>
+              <w:t>200-</w:t>
+            </w:r>
             <w:r>
               <w:t xml:space="preserve">Event updated successfully </w:t>
             </w:r>
@@ -1477,17 +1398,7 @@
               </w:tabs>
             </w:pPr>
             <w:r>
-              <w:t>/</w:t>
-            </w:r>
-            <w:proofErr w:type="spellStart"/>
-            <w:proofErr w:type="gramStart"/>
-            <w:r>
-              <w:t>api</w:t>
-            </w:r>
-            <w:proofErr w:type="spellEnd"/>
-            <w:proofErr w:type="gramEnd"/>
-            <w:r>
-              <w:t>/events/{id}</w:t>
+              <w:t>/api/events/{id}</w:t>
             </w:r>
           </w:p>
         </w:tc>
@@ -1546,6 +1457,9 @@
                 <w:tab w:val="left" w:pos="3160"/>
               </w:tabs>
             </w:pPr>
+            <w:r>
+              <w:t>200-</w:t>
+            </w:r>
             <w:r>
               <w:t xml:space="preserve">Event deleted successfully </w:t>
             </w:r>
@@ -1711,25 +1625,7 @@
               </w:tabs>
             </w:pPr>
             <w:r>
-              <w:t>/</w:t>
-            </w:r>
-            <w:proofErr w:type="spellStart"/>
-            <w:proofErr w:type="gramStart"/>
-            <w:r>
-              <w:t>api</w:t>
-            </w:r>
-            <w:proofErr w:type="spellEnd"/>
-            <w:proofErr w:type="gramEnd"/>
-            <w:r>
-              <w:t>/events/{</w:t>
-            </w:r>
-            <w:proofErr w:type="spellStart"/>
-            <w:r>
-              <w:t>eventId</w:t>
-            </w:r>
-            <w:proofErr w:type="spellEnd"/>
-            <w:r>
-              <w:t>}/enrolments</w:t>
+              <w:t>/api/events/{eventId}/enrolments</w:t>
             </w:r>
           </w:p>
         </w:tc>
@@ -1788,6 +1684,9 @@
                 <w:tab w:val="left" w:pos="3160"/>
               </w:tabs>
             </w:pPr>
+            <w:r>
+              <w:t>201-</w:t>
+            </w:r>
             <w:r>
               <w:t xml:space="preserve">Enrolment created successfully </w:t>
             </w:r>
@@ -1821,25 +1720,7 @@
               </w:tabs>
             </w:pPr>
             <w:r>
-              <w:t>/</w:t>
-            </w:r>
-            <w:proofErr w:type="spellStart"/>
-            <w:proofErr w:type="gramStart"/>
-            <w:r>
-              <w:t>api</w:t>
-            </w:r>
-            <w:proofErr w:type="spellEnd"/>
-            <w:proofErr w:type="gramEnd"/>
-            <w:r>
-              <w:t>/events/{</w:t>
-            </w:r>
-            <w:proofErr w:type="spellStart"/>
-            <w:r>
-              <w:t>eventId</w:t>
-            </w:r>
-            <w:proofErr w:type="spellEnd"/>
-            <w:r>
-              <w:t>}/enrolments</w:t>
+              <w:t>/api/events/{eventId}/enrolments</w:t>
             </w:r>
           </w:p>
         </w:tc>
@@ -1901,6 +1782,9 @@
                 <w:tab w:val="left" w:pos="3160"/>
               </w:tabs>
             </w:pPr>
+            <w:r>
+              <w:t>200-</w:t>
+            </w:r>
             <w:r>
               <w:t xml:space="preserve">List of enrolments returned </w:t>
             </w:r>
@@ -1934,15 +1818,7 @@
               </w:tabs>
             </w:pPr>
             <w:r>
-              <w:t>/</w:t>
-            </w:r>
-            <w:proofErr w:type="spellStart"/>
-            <w:r>
-              <w:t>api</w:t>
-            </w:r>
-            <w:proofErr w:type="spellEnd"/>
-            <w:r>
-              <w:t>/users/profile/enrolments</w:t>
+              <w:t>/api/users/profile/enrolments</w:t>
             </w:r>
           </w:p>
         </w:tc>
@@ -2004,6 +1880,9 @@
                 <w:tab w:val="left" w:pos="3160"/>
               </w:tabs>
             </w:pPr>
+            <w:r>
+              <w:t>200-</w:t>
+            </w:r>
             <w:r>
               <w:t xml:space="preserve">Participant’s enrolments returned </w:t>
             </w:r>
@@ -2168,25 +2047,7 @@
               </w:tabs>
             </w:pPr>
             <w:r>
-              <w:t>/</w:t>
-            </w:r>
-            <w:proofErr w:type="spellStart"/>
-            <w:proofErr w:type="gramStart"/>
-            <w:r>
-              <w:t>api</w:t>
-            </w:r>
-            <w:proofErr w:type="spellEnd"/>
-            <w:proofErr w:type="gramEnd"/>
-            <w:r>
-              <w:t>/events/{</w:t>
-            </w:r>
-            <w:proofErr w:type="spellStart"/>
-            <w:r>
-              <w:t>eventId</w:t>
-            </w:r>
-            <w:proofErr w:type="spellEnd"/>
-            <w:r>
-              <w:t>}/results</w:t>
+              <w:t>/api/events/{eventId}/results</w:t>
             </w:r>
           </w:p>
         </w:tc>
@@ -2230,27 +2091,9 @@
                 <w:tab w:val="left" w:pos="3160"/>
               </w:tabs>
             </w:pPr>
-            <w:proofErr w:type="spellStart"/>
-            <w:r>
-              <w:t>ParticipantID</w:t>
-            </w:r>
-            <w:proofErr w:type="spellEnd"/>
-            <w:r>
-              <w:t xml:space="preserve">, </w:t>
-            </w:r>
-            <w:proofErr w:type="spellStart"/>
-            <w:r>
-              <w:t>FinishTime</w:t>
-            </w:r>
-            <w:proofErr w:type="spellEnd"/>
-            <w:r>
-              <w:t xml:space="preserve">, </w:t>
-            </w:r>
-            <w:proofErr w:type="spellStart"/>
-            <w:r>
-              <w:t>FinishingPosition</w:t>
-            </w:r>
-            <w:proofErr w:type="spellEnd"/>
+            <w:r>
+              <w:t>ParticipantID, FinishTime, FinishingPosition</w:t>
+            </w:r>
           </w:p>
         </w:tc>
         <w:tc>
@@ -2263,6 +2106,9 @@
                 <w:tab w:val="left" w:pos="3160"/>
               </w:tabs>
             </w:pPr>
+            <w:r>
+              <w:t>201-</w:t>
+            </w:r>
             <w:r>
               <w:t xml:space="preserve">Result recorded successfully </w:t>
             </w:r>
@@ -2296,25 +2142,7 @@
               </w:tabs>
             </w:pPr>
             <w:r>
-              <w:t>/</w:t>
-            </w:r>
-            <w:proofErr w:type="spellStart"/>
-            <w:proofErr w:type="gramStart"/>
-            <w:r>
-              <w:t>api</w:t>
-            </w:r>
-            <w:proofErr w:type="spellEnd"/>
-            <w:proofErr w:type="gramEnd"/>
-            <w:r>
-              <w:t>/events/{</w:t>
-            </w:r>
-            <w:proofErr w:type="spellStart"/>
-            <w:r>
-              <w:t>eventId</w:t>
-            </w:r>
-            <w:proofErr w:type="spellEnd"/>
-            <w:r>
-              <w:t>}/results</w:t>
+              <w:t>/api/events/{eventId}/results</w:t>
             </w:r>
           </w:p>
         </w:tc>
@@ -2373,6 +2201,9 @@
                 <w:tab w:val="left" w:pos="3160"/>
               </w:tabs>
             </w:pPr>
+            <w:r>
+              <w:t>200-</w:t>
+            </w:r>
             <w:r>
               <w:t xml:space="preserve">Event results returned </w:t>
             </w:r>
@@ -2406,15 +2237,7 @@
               </w:tabs>
             </w:pPr>
             <w:r>
-              <w:t>/</w:t>
-            </w:r>
-            <w:proofErr w:type="spellStart"/>
-            <w:r>
-              <w:t>api</w:t>
-            </w:r>
-            <w:proofErr w:type="spellEnd"/>
-            <w:r>
-              <w:t>/users/profile/results</w:t>
+              <w:t>/api/users/profile/results</w:t>
             </w:r>
           </w:p>
         </w:tc>
@@ -2478,6 +2301,9 @@
                 <w:tab w:val="left" w:pos="3160"/>
               </w:tabs>
             </w:pPr>
+            <w:r>
+              <w:t>200-</w:t>
+            </w:r>
             <w:r>
               <w:t xml:space="preserve">Participant results retuned </w:t>
             </w:r>

</xml_diff>